<commit_message>
docs(exposiciones): actualizar informe y presentación académicos
</commit_message>
<xml_diff>
--- a/exposiciones/assets/descargas/informe-equilibrio-acido-base.docx
+++ b/exposiciones/assets/descargas/informe-equilibrio-acido-base.docx
@@ -4,7 +4,7 @@
   <w:body>
     <w:p>
       <w:pPr>
-        <w:spacing w:after="160"/>
+        <w:spacing w:after="180"/>
         <w:jc w:val="center"/>
       </w:pPr>
       <w:r>
@@ -19,7 +19,7 @@
     </w:p>
     <w:p>
       <w:pPr>
-        <w:spacing w:after="160"/>
+        <w:spacing w:after="180"/>
         <w:jc w:val="center"/>
       </w:pPr>
       <w:r>
@@ -34,7 +34,7 @@
     </w:p>
     <w:p>
       <w:pPr>
-        <w:spacing w:after="160"/>
+        <w:spacing w:after="180"/>
         <w:jc w:val="center"/>
       </w:pPr>
       <w:r>
@@ -50,7 +50,7 @@
     <w:p>
       <w:pPr>
         <w:pStyle w:val="Title"/>
-        <w:spacing w:before="1300" w:after="300"/>
+        <w:spacing w:before="1320" w:after="320"/>
         <w:jc w:val="center"/>
       </w:pPr>
       <w:r>
@@ -73,12 +73,12 @@
           <w:color w:val="000000"/>
           <w:sz w:val="26"/>
         </w:rPr>
-        <w:t>Revisión bibliográfica con aplicación veterinaria</w:t>
+        <w:t>Revisión documental con aplicación veterinaria</w:t>
       </w:r>
     </w:p>
     <w:p>
       <w:pPr>
-        <w:spacing w:before="560"/>
+        <w:spacing w:before="440"/>
         <w:jc w:val="center"/>
       </w:pPr>
       <w:r>
@@ -106,7 +106,7 @@
     </w:p>
     <w:p>
       <w:pPr>
-        <w:spacing w:before="240"/>
+        <w:spacing w:before="440"/>
         <w:jc w:val="center"/>
       </w:pPr>
       <w:r>
@@ -134,7 +134,7 @@
     </w:p>
     <w:p>
       <w:pPr>
-        <w:spacing w:before="240"/>
+        <w:spacing w:before="440"/>
         <w:jc w:val="center"/>
       </w:pPr>
       <w:r>
@@ -144,7 +144,7 @@
           <w:color w:val="000000"/>
           <w:sz w:val="24"/>
         </w:rPr>
-        <w:t>Docente</w:t>
+        <w:t>Curso</w:t>
       </w:r>
     </w:p>
     <w:p>
@@ -157,40 +157,12 @@
           <w:color w:val="000000"/>
           <w:sz w:val="24"/>
         </w:rPr>
-        <w:t>Md. Vet. José Luis Urdiales Arévalo, Ms.</w:t>
+        <w:t>Quinto A</w:t>
       </w:r>
     </w:p>
     <w:p>
       <w:pPr>
-        <w:spacing w:before="240"/>
-        <w:jc w:val="center"/>
-      </w:pPr>
-      <w:r>
-        <w:rPr>
-          <w:rFonts w:ascii="Times New Roman" w:hAnsi="Times New Roman" w:eastAsia="Times New Roman" w:cs="Times New Roman"/>
-          <w:b/>
-          <w:color w:val="000000"/>
-          <w:sz w:val="24"/>
-        </w:rPr>
-        <w:t>Curso y período académico</w:t>
-      </w:r>
-    </w:p>
-    <w:p>
-      <w:pPr>
-        <w:jc w:val="center"/>
-      </w:pPr>
-      <w:r>
-        <w:rPr>
-          <w:rFonts w:ascii="Times New Roman" w:hAnsi="Times New Roman" w:eastAsia="Times New Roman" w:cs="Times New Roman"/>
-          <w:color w:val="000000"/>
-          <w:sz w:val="24"/>
-        </w:rPr>
-        <w:t>Quinto semestre A · 2026-2</w:t>
-      </w:r>
-    </w:p>
-    <w:p>
-      <w:pPr>
-        <w:spacing w:before="520"/>
+        <w:spacing w:before="700"/>
         <w:jc w:val="center"/>
       </w:pPr>
       <w:r>
@@ -224,7 +196,7 @@
           <w:color w:val="000000"/>
           <w:sz w:val="24"/>
         </w:rPr>
-        <w:t>El equilibrio ácido base depende de la relación entre producción de ácidos, amortiguación química, ventilación alveolar y función renal. Su alteración aparece en enfermedades digestivas, renales, respiratorias y metabólicas de los animales domésticos. Esta revisión explica los cuatro trastornos primarios, diferencia los procesos de acidosis y alcalosis del pH medido e integra gasometría, electrolitos y contexto clínico. Se desarrolla un caso canino simulado y se analizan la diarrea del ternero y las alteraciones abomasales. La interpretación correcta exige identificar la alteración primaria, valorar la compensación y buscar procesos simultáneos. El tratamiento se orienta a la causa y a la recuperación de la función orgánica, con seguimiento del estado ácido base.</w:t>
+        <w:t>El equilibrio ácido base expresa la relación entre producción de ácidos, amortiguación química, ventilación alveolar y función renal. El pH describe un resultado y no identifica por sí solo el proceso que lo origina. Esta revisión explica los mecanismos reguladores, los cuatro trastornos primarios y la interpretación integrada de gasometría y electrolitos en Medicina Veterinaria. La ecuación de Henderson–Hasselbalch y la relación inversa entre ventilación alveolar y PCO₂ se emplean como modelos didácticos con supuestos explícitos. Se desarrollan dos escenarios construidos: un ternero con diarrea y un perro con hipoventilación durante anestesia. Ambos muestran que la dirección de una respuesta compensadora no demuestra su adecuación cuantitativa ni define una causa específica. El análisis debe considerar especie, edad, tipo de muestra, evolución y métodos del laboratorio. La integración de estos elementos permite formular una interpretación fisiopatológica fundada y reconocer la información que todavía falta.</w:t>
       </w:r>
     </w:p>
     <w:p>
@@ -234,7 +206,7 @@
           <w:color w:val="000000"/>
           <w:sz w:val="24"/>
         </w:rPr>
-        <w:t>Palabras clave: equilibrio ácido base; acidosis; alcalosis; gasometría; bicarbonato; medicina veterinaria.</w:t>
+        <w:t>Palabras clave: equilibrio ácido base; bicarbonato; dióxido de carbono; compensación; gasometría; medicina veterinaria.</w:t>
       </w:r>
     </w:p>
     <w:p>
@@ -252,7 +224,7 @@
           <w:color w:val="000000"/>
           <w:sz w:val="24"/>
         </w:rPr>
-        <w:t>La concentración de hidrogeniones condiciona la actividad enzimática y el funcionamiento celular. El metabolismo produce CO₂ y ácidos no volátiles que deben amortiguarse y eliminarse. Los pulmones regulan la eliminación de CO₂, mientras los riñones recuperan bicarbonato y excretan ácido. La integración de ambos órganos sostiene el pH extracelular dentro de límites estrechos. (1)</w:t>
+        <w:t>La concentración de hidrogeniones influye en la estructura y actividad de proteínas, en las reacciones enzimáticas y en la función celular. El organismo recibe cargas ácidas derivadas del metabolismo, entre ellas CO₂ y ácidos no volátiles. Los mecanismos de regulación amortiguan sus efectos y permiten su eliminación. La alteración de cualquiera de estos mecanismos puede expresarse en sangre, pero la cifra de pH no resume por sí sola todos los procesos presentes. (1)</w:t>
       </w:r>
     </w:p>
     <w:p>
@@ -262,7 +234,17 @@
           <w:color w:val="000000"/>
           <w:sz w:val="24"/>
         </w:rPr>
-        <w:t>En la clínica veterinaria, una diarrea, una obstrucción digestiva, una insuficiencia renal o una hipoventilación pueden alterar este equilibrio por mecanismos distintos. La gasometría permite reconocer el componente respiratorio y el resultado sobre el pH; los electrolitos y la bioquímica ayudan a explicar el componente metabólico. Por ello, ningún valor aislado identifica toda la enfermedad. (2)</w:t>
+        <w:t>La interpretación veterinaria requiere conectar las variables con el paciente. La diarrea de un ternero, el secuestro de contenido abomasal y la hipoventilación de un perro son contextos distintos: no justifican aplicar una misma regla causal ni un intervalo universal. En bovinos, además, la fisiopatología integra pérdidas digestivas, fermentación, perfusión y composición de los líquidos corporales. El enfoque tradicional basado en bicarbonato y PCO₂ es útil para ordenar el razonamiento, siempre que se reconozca su carácter complementario respecto de la evaluación clínica y bioquímica. (2)</w:t>
+      </w:r>
+    </w:p>
+    <w:p>
+      <w:r>
+        <w:rPr>
+          <w:rFonts w:ascii="Times New Roman" w:hAnsi="Times New Roman" w:eastAsia="Times New Roman" w:cs="Times New Roman"/>
+          <w:color w:val="000000"/>
+          <w:sz w:val="24"/>
+        </w:rPr>
+        <w:t>El objetivo del informe es explicar esas relaciones y utilizarlas de forma crítica. Se distingue el resultado medido del proceso, la amortiguación de la eliminación de ácido y la compensación de la coexistencia de trastornos primarios. Los ejemplos numéricos son ejercicios educativos; no representan pacientes atendidos ni constituyen indicaciones terapéuticas.</w:t>
       </w:r>
     </w:p>
     <w:p>
@@ -288,7 +270,7 @@
           <w:color w:val="000000"/>
           <w:sz w:val="24"/>
         </w:rPr>
-        <w:t>Explicar la fisiopatología de los trastornos del equilibrio ácido base y su interpretación en situaciones clínicas veterinarias.</w:t>
+        <w:t>Explicar la fisiopatología del equilibrio ácido base e integrar sus mecanismos con la interpretación de gasometría, electrolitos y contexto veterinario.</w:t>
       </w:r>
     </w:p>
     <w:p>
@@ -309,7 +291,7 @@
           <w:color w:val="000000"/>
           <w:sz w:val="24"/>
         </w:rPr>
-        <w:t>Describir los sistemas amortiguadores y la regulación respiratoria y renal.</w:t>
+        <w:t>Diferenciar acidemia y alcalemia de los procesos de acidosis y alcalosis.</w:t>
       </w:r>
     </w:p>
     <w:p>
@@ -322,7 +304,7 @@
           <w:color w:val="000000"/>
           <w:sz w:val="24"/>
         </w:rPr>
-        <w:t>Relacionar las causas de acidosis y alcalosis con sus consecuencias funcionales.</w:t>
+        <w:t>Relacionar los sistemas amortiguadores con la ventilación alveolar y la conservación o reposición renal de bicarbonato.</w:t>
       </w:r>
     </w:p>
     <w:p>
@@ -335,7 +317,7 @@
           <w:color w:val="000000"/>
           <w:sz w:val="24"/>
         </w:rPr>
-        <w:t>Interpretar pH, PCO₂, bicarbonato y brecha aniónica mediante un caso didáctico.</w:t>
+        <w:t>Reconocer los patrones de los trastornos primarios y los límites de la valoración de compensación entre especies.</w:t>
       </w:r>
     </w:p>
     <w:p>
@@ -348,7 +330,7 @@
           <w:color w:val="000000"/>
           <w:sz w:val="24"/>
         </w:rPr>
-        <w:t>Comparar mecanismos relevantes en pequeños animales y bovinos.</w:t>
+        <w:t>Interpretar dos casos didácticos y analizar los supuestos de los modelos de Henderson–Hasselbalch y ventilación alveolar relativa.</w:t>
       </w:r>
     </w:p>
     <w:p>
@@ -360,32 +342,13 @@
       </w:r>
     </w:p>
     <w:p>
-      <w:pPr>
-        <w:keepLines/>
-      </w:pPr>
       <w:r>
         <w:rPr>
           <w:rFonts w:ascii="Times New Roman" w:hAnsi="Times New Roman" w:eastAsia="Times New Roman" w:cs="Times New Roman"/>
           <w:color w:val="000000"/>
           <w:sz w:val="24"/>
         </w:rPr>
-        <w:t>Se realizó una revisión narrativa con búsqueda hasta el 17 de octubre de 2026. Se priorizaron fuentes académicas veterinarias en español y se amplió la consulta a publicaciones en inglés cuando aportaron evidencia específica. Se contrastaron fundamentos de fisiología, recursos de patología clínica de Cornell University, el Manual de veterinaria de MSD y artículos sobre bovinos. Se utilizaron términos como equilibrio ácido base, metabolic acidosis, compensation, calf diarrhea y abomasal volvulus. La selección atendió a pertinencia, identificación de autores y disponibilidad de información verificable. El trabajo no constituye una revisión sistemática. Los datos del caso son simulados y no corresponden a un paciente atendido.</w:t>
-      </w:r>
-    </w:p>
-    <w:p>
-      <w:pPr>
-        <w:pStyle w:val="Heading1"/>
-      </w:pPr>
-      <w:r>
-        <w:t>4 Fundamentos del equilibrio ácido base</w:t>
-      </w:r>
-    </w:p>
-    <w:p>
-      <w:pPr>
-        <w:pStyle w:val="Heading2"/>
-      </w:pPr>
-      <w:r>
-        <w:t>4.1 Acidemia y acidosis</w:t>
+        <w:t>Se realizó una revisión narrativa de doce fuentes académicas e institucionales relacionadas con el equilibrio ácido base y sus aplicaciones veterinarias. Se incluyeron una revisión en español sobre bovinos, recursos de patología clínica de Cornell University, una fuente docente universitaria para la ecuación alveolar y artículos sobre alteraciones abomasales y lactato en terneros. La consulta documental comprende el 17 y el 18 de octubre de 2026. Los fundamentos clásicos se diferenciaron de los resultados de investigaciones clínicas y revisiones recientes.</w:t>
       </w:r>
     </w:p>
     <w:p>
@@ -395,15 +358,7 @@
           <w:color w:val="000000"/>
           <w:sz w:val="24"/>
         </w:rPr>
-        <w:t>Acidemia y alcalemia describen un pH sanguíneo inferior o superior al intervalo de referencia. Acidosis y alcalosis designan procesos que tienden a disminuirlo o aumentarlo. Un animal puede presentar dos procesos opuestos y conservar un pH dentro del intervalo. Como orientación fisiológica se suele utilizar 7,35–7,45, pero la interpretación debe ajustarse a especie, edad, muestra y laboratorio. (1)</w:t>
-      </w:r>
-    </w:p>
-    <w:p>
-      <w:pPr>
-        <w:pStyle w:val="Heading2"/>
-      </w:pPr>
-      <w:r>
-        <w:t>4.2 Sistema bicarbonato y dióxido de carbono</w:t>
+        <w:t>La selección atendió a pertinencia temática, identificación bibliográfica, acceso a una fuente verificable y correspondencia entre las afirmaciones y el alcance del documento consultado. Se priorizó la información veterinaria. La fuente de fisiología respiratoria utilizada para la relación matemática entre CO₂ y ventilación no se empleó para establecer intervalos, diagnósticos o reglas de compensación por especie. La revisión es narrativa: no se presenta como una búsqueda exhaustiva ni como un metaanálisis.</w:t>
       </w:r>
     </w:p>
     <w:p>
@@ -413,12 +368,56 @@
           <w:color w:val="000000"/>
           <w:sz w:val="24"/>
         </w:rPr>
-        <w:t>El sistema bicarbonato vincula la química de los líquidos corporales con la función pulmonar y renal. Su reacción reversible permite amortiguar cambios de H⁺. La relación entre bicarbonato y CO₂ disuelto se describe mediante la ecuación de Henderson–Hasselbalch. (3)</w:t>
+        <w:t>Los resultados numéricos se obtuvieron mediante las ecuaciones indicadas y se redondearon después del cálculo. Los escenarios bovino y canino son sintéticos y conservan coherencia matemática entre pH, PCO₂ y HCO₃⁻. Las figuras representan relaciones funcionales originales; no pretenden reproducir anatomía diagnóstica de una especie. En cada aplicación se separan los datos disponibles, la inferencia sustentada y las conclusiones que no pueden establecerse.</w:t>
       </w:r>
     </w:p>
     <w:p>
       <w:pPr>
-        <w:spacing w:before="100" w:after="140"/>
+        <w:pStyle w:val="Heading1"/>
+      </w:pPr>
+      <w:r>
+        <w:t>4 Marco teórico</w:t>
+      </w:r>
+    </w:p>
+    <w:p>
+      <w:pPr>
+        <w:pStyle w:val="Heading2"/>
+      </w:pPr>
+      <w:r>
+        <w:t>4.1 El pH y los procesos ácido base</w:t>
+      </w:r>
+    </w:p>
+    <w:p>
+      <w:r>
+        <w:rPr>
+          <w:rFonts w:ascii="Times New Roman" w:hAnsi="Times New Roman" w:eastAsia="Times New Roman" w:cs="Times New Roman"/>
+          <w:color w:val="000000"/>
+          <w:sz w:val="24"/>
+        </w:rPr>
+        <w:t>El pH es el logaritmo decimal negativo de la actividad de H⁺. Por su escala logarítmica, variaciones pequeñas representan cambios proporcionales importantes. Acidemia y alcalemia nombran un pH inferior o superior al criterio aplicable; acidosis y alcalosis son procesos que tienden a disminuirlo o aumentarlo. Dos procesos opuestos pueden coexistir con un pH dentro del intervalo de referencia. Este intervalo debe corresponder a especie, edad, muestra y laboratorio. (1)</w:t>
+      </w:r>
+    </w:p>
+    <w:p>
+      <w:pPr>
+        <w:pStyle w:val="Heading2"/>
+      </w:pPr>
+      <w:r>
+        <w:t>4.2 Amortiguación y sistema bicarbonato</w:t>
+      </w:r>
+    </w:p>
+    <w:p>
+      <w:r>
+        <w:rPr>
+          <w:rFonts w:ascii="Times New Roman" w:hAnsi="Times New Roman" w:eastAsia="Times New Roman" w:cs="Times New Roman"/>
+          <w:color w:val="000000"/>
+          <w:sz w:val="24"/>
+        </w:rPr>
+        <w:t>La reacción reversible del sistema bicarbonato conecta la química de los líquidos corporales con la eliminación pulmonar de CO₂ y el balance renal de base. El bicarbonato acepta H⁺; proteínas, hemoglobina y fosfatos también participan en la amortiguación. Estos mecanismos atenúan el cambio inicial de pH, pero no equivalen a eliminar toda la carga ácida del organismo. (2,3)</w:t>
+      </w:r>
+    </w:p>
+    <w:p>
+      <w:pPr>
+        <w:spacing w:before="100" w:after="180"/>
         <w:jc w:val="center"/>
       </w:pPr>
       <m:oMath>
@@ -515,7 +514,1106 @@
     </w:p>
     <w:p>
       <w:pPr>
-        <w:spacing w:before="100" w:after="140"/>
+        <w:keepNext/>
+        <w:spacing w:after="0"/>
+        <w:jc w:val="center"/>
+      </w:pPr>
+      <w:r>
+        <w:drawing>
+          <wp:inline xmlns:a="http://schemas.openxmlformats.org/drawingml/2006/main" xmlns:pic="http://schemas.openxmlformats.org/drawingml/2006/picture">
+            <wp:extent cx="5166360" cy="3444240"/>
+            <wp:docPr id="1" name="Picture 1" descr="Figura 1. Relación funcional entre bicarbonato, CO₂ disuelto y pH. Esquema original de la exposición; las flechas representan interconversión reversible, no velocidades ni cantidades. Fundamento: (2,3)."/>
+            <wp:cNvGraphicFramePr>
+              <a:graphicFrameLocks noChangeAspect="1"/>
+            </wp:cNvGraphicFramePr>
+            <a:graphic>
+              <a:graphicData uri="http://schemas.openxmlformats.org/drawingml/2006/picture">
+                <pic:pic>
+                  <pic:nvPicPr>
+                    <pic:cNvPr id="0" name="bicarbonato.png"/>
+                    <pic:cNvPicPr/>
+                  </pic:nvPicPr>
+                  <pic:blipFill>
+                    <a:blip r:embed="rId11"/>
+                    <a:stretch>
+                      <a:fillRect/>
+                    </a:stretch>
+                  </pic:blipFill>
+                  <pic:spPr>
+                    <a:xfrm>
+                      <a:off x="0" y="0"/>
+                      <a:ext cx="5166360" cy="3444240"/>
+                    </a:xfrm>
+                    <a:prstGeom prst="rect"/>
+                  </pic:spPr>
+                </pic:pic>
+              </a:graphicData>
+            </a:graphic>
+          </wp:inline>
+        </w:drawing>
+      </w:r>
+    </w:p>
+    <w:p>
+      <w:pPr>
+        <w:keepLines/>
+        <w:spacing w:before="100" w:after="140" w:line="264" w:lineRule="auto"/>
+        <w:jc w:val="left"/>
+      </w:pPr>
+      <w:r>
+        <w:rPr>
+          <w:rFonts w:ascii="Times New Roman" w:hAnsi="Times New Roman" w:eastAsia="Times New Roman" w:cs="Times New Roman"/>
+          <w:color w:val="000000"/>
+          <w:sz w:val="21"/>
+        </w:rPr>
+        <w:t>Figura 1. Relación funcional entre bicarbonato, CO₂ disuelto y pH. Esquema original de la exposición; las flechas representan interconversión reversible, no velocidades ni cantidades. Fundamento: (2,3).</w:t>
+      </w:r>
+    </w:p>
+    <w:p>
+      <w:r>
+        <w:rPr>
+          <w:rFonts w:ascii="Times New Roman" w:hAnsi="Times New Roman" w:eastAsia="Times New Roman" w:cs="Times New Roman"/>
+          <w:color w:val="000000"/>
+          <w:sz w:val="24"/>
+        </w:rPr>
+        <w:t>La ventilación y la función renal sostienen el balance más allá de la reacción química inmediata. La respuesta depende de la magnitud y persistencia de la carga, de los amortiguadores disponibles y de la capacidad funcional de los órganos. (3)</w:t>
+      </w:r>
+    </w:p>
+    <w:p>
+      <w:pPr>
+        <w:pStyle w:val="Heading2"/>
+      </w:pPr>
+      <w:r>
+        <w:t>4.3 Regulación pulmonar</w:t>
+      </w:r>
+    </w:p>
+    <w:p>
+      <w:r>
+        <w:rPr>
+          <w:rFonts w:ascii="Times New Roman" w:hAnsi="Times New Roman" w:eastAsia="Times New Roman" w:cs="Times New Roman"/>
+          <w:color w:val="000000"/>
+          <w:sz w:val="24"/>
+        </w:rPr>
+        <w:t>La PCO₂ aumenta cuando la ventilación alveolar resulta insuficiente respecto de la producción de CO₂. Disminuye cuando la eliminación alveolar excede esa producción. Por ello, una frecuencia respiratoria elevada no demuestra hiperventilación efectiva: importa el volumen de aire que alcanza alvéolos con intercambio útil. Un cambio de PCO₂ puede ser primario o secundario a un trastorno metabólico; su interpretación requiere pH, bicarbonato e historia. (4)</w:t>
+      </w:r>
+    </w:p>
+    <w:p>
+      <w:pPr>
+        <w:keepNext/>
+        <w:spacing w:after="0"/>
+        <w:jc w:val="center"/>
+      </w:pPr>
+      <w:r>
+        <w:drawing>
+          <wp:inline xmlns:a="http://schemas.openxmlformats.org/drawingml/2006/main" xmlns:pic="http://schemas.openxmlformats.org/drawingml/2006/picture">
+            <wp:extent cx="4937760" cy="3291840"/>
+            <wp:docPr id="2" name="Picture 2" descr="Figura 2. Transporte y eliminación pulmonar de CO₂. Esquema funcional original, sin anatomía específica. La comparación supone producción de CO₂ constante. Fundamento: (4,5)."/>
+            <wp:cNvGraphicFramePr>
+              <a:graphicFrameLocks noChangeAspect="1"/>
+            </wp:cNvGraphicFramePr>
+            <a:graphic>
+              <a:graphicData uri="http://schemas.openxmlformats.org/drawingml/2006/picture">
+                <pic:pic>
+                  <pic:nvPicPr>
+                    <pic:cNvPr id="0" name="pulmon.png"/>
+                    <pic:cNvPicPr/>
+                  </pic:nvPicPr>
+                  <pic:blipFill>
+                    <a:blip r:embed="rId12"/>
+                    <a:stretch>
+                      <a:fillRect/>
+                    </a:stretch>
+                  </pic:blipFill>
+                  <pic:spPr>
+                    <a:xfrm>
+                      <a:off x="0" y="0"/>
+                      <a:ext cx="4937760" cy="3291840"/>
+                    </a:xfrm>
+                    <a:prstGeom prst="rect"/>
+                  </pic:spPr>
+                </pic:pic>
+              </a:graphicData>
+            </a:graphic>
+          </wp:inline>
+        </w:drawing>
+      </w:r>
+    </w:p>
+    <w:p>
+      <w:pPr>
+        <w:keepLines/>
+        <w:spacing w:before="100" w:after="140" w:line="264" w:lineRule="auto"/>
+        <w:jc w:val="left"/>
+      </w:pPr>
+      <w:r>
+        <w:rPr>
+          <w:rFonts w:ascii="Times New Roman" w:hAnsi="Times New Roman" w:eastAsia="Times New Roman" w:cs="Times New Roman"/>
+          <w:color w:val="000000"/>
+          <w:sz w:val="21"/>
+        </w:rPr>
+        <w:t>Figura 2. Transporte y eliminación pulmonar de CO₂. Esquema funcional original, sin anatomía específica. La comparación supone producción de CO₂ constante. Fundamento: (4,5).</w:t>
+      </w:r>
+    </w:p>
+    <w:p>
+      <w:r>
+        <w:rPr>
+          <w:rFonts w:ascii="Times New Roman" w:hAnsi="Times New Roman" w:eastAsia="Times New Roman" w:cs="Times New Roman"/>
+          <w:color w:val="000000"/>
+          <w:sz w:val="24"/>
+        </w:rPr>
+        <w:t>En estado estacionario, la PCO₂ alveolar es proporcional a la producción de CO₂ e inversamente proporcional a la ventilación alveolar. El modelo relativo adopta un punto didáctico de 100 % y 40 mmHg. La fuente fisiológica sustenta la relación inversa; el valor de referencia es una elección del ejercicio. (5)</w:t>
+      </w:r>
+    </w:p>
+    <w:p>
+      <w:pPr>
+        <w:spacing w:before="100" w:after="180"/>
+        <w:jc w:val="center"/>
+      </w:pPr>
+      <m:oMath>
+        <m:sSub>
+          <m:e>
+            <m:r>
+              <m:t>PCO</m:t>
+            </m:r>
+          </m:e>
+          <m:sub>
+            <m:r>
+              <m:t>2</m:t>
+            </m:r>
+          </m:sub>
+        </m:sSub>
+        <m:r>
+          <m:t> = </m:t>
+        </m:r>
+        <m:f>
+          <m:num>
+            <m:r>
+              <m:t>40</m:t>
+            </m:r>
+          </m:num>
+          <m:den>
+            <m:r>
+              <m:t>ventilación relativa (%) / 100</m:t>
+            </m:r>
+          </m:den>
+        </m:f>
+      </m:oMath>
+    </w:p>
+    <w:p>
+      <w:r>
+        <w:rPr>
+          <w:rFonts w:ascii="Times New Roman" w:hAnsi="Times New Roman" w:eastAsia="Times New Roman" w:cs="Times New Roman"/>
+          <w:color w:val="000000"/>
+          <w:sz w:val="24"/>
+        </w:rPr>
+        <w:t>Con ventilación relativa de 50 %, el modelo calcula 80 mmHg; con 150 %, aproximadamente 26,7 mmHg. Se supone CO₂ inspirado despreciable y se aproxima PCO₂ alveolar a arterial. No se modelan espacio muerto, desigualdad ventilación/perfusión ni cambios temporales. El porcentaje no expresa frecuencia respiratoria ni un intervalo fisiológico; la animación respiratoria representa una relación, no la velocidad real de cambio de PCO₂. (5)</w:t>
+      </w:r>
+    </w:p>
+    <w:p>
+      <w:pPr>
+        <w:pStyle w:val="Heading2"/>
+      </w:pPr>
+      <w:r>
+        <w:t>4.4 Regulación renal</w:t>
+      </w:r>
+    </w:p>
+    <w:p>
+      <w:r>
+        <w:rPr>
+          <w:rFonts w:ascii="Times New Roman" w:hAnsi="Times New Roman" w:eastAsia="Times New Roman" w:cs="Times New Roman"/>
+          <w:color w:val="000000"/>
+          <w:sz w:val="24"/>
+        </w:rPr>
+        <w:t>El riñón conserva el bicarbonato filtrado y participa en la reposición de bicarbonato consumido al amortiguar ácidos. La recuperación tubular devuelve a la sangre una base que ya existía; evita su pérdida urinaria. La secreción de H⁺ acoplada a esa recuperación no significa, por sí sola, incorporación neta de bicarbonato nuevo al organismo. (6)</w:t>
+      </w:r>
+    </w:p>
+    <w:p>
+      <w:pPr>
+        <w:keepNext/>
+        <w:spacing w:after="0"/>
+        <w:jc w:val="center"/>
+      </w:pPr>
+      <w:r>
+        <w:drawing>
+          <wp:inline xmlns:a="http://schemas.openxmlformats.org/drawingml/2006/main" xmlns:pic="http://schemas.openxmlformats.org/drawingml/2006/picture">
+            <wp:extent cx="5029200" cy="3352800"/>
+            <wp:docPr id="3" name="Picture 3" descr="Figura 3. Conservación de bicarbonato y excreción neta de ácido. Esquema funcional original; no representa una nefrona anatómica ni etapas cronológicas sucesivas. Fundamento: (6)."/>
+            <wp:cNvGraphicFramePr>
+              <a:graphicFrameLocks noChangeAspect="1"/>
+            </wp:cNvGraphicFramePr>
+            <a:graphic>
+              <a:graphicData uri="http://schemas.openxmlformats.org/drawingml/2006/picture">
+                <pic:pic>
+                  <pic:nvPicPr>
+                    <pic:cNvPr id="0" name="renal.png"/>
+                    <pic:cNvPicPr/>
+                  </pic:nvPicPr>
+                  <pic:blipFill>
+                    <a:blip r:embed="rId13"/>
+                    <a:stretch>
+                      <a:fillRect/>
+                    </a:stretch>
+                  </pic:blipFill>
+                  <pic:spPr>
+                    <a:xfrm>
+                      <a:off x="0" y="0"/>
+                      <a:ext cx="5029200" cy="3352800"/>
+                    </a:xfrm>
+                    <a:prstGeom prst="rect"/>
+                  </pic:spPr>
+                </pic:pic>
+              </a:graphicData>
+            </a:graphic>
+          </wp:inline>
+        </w:drawing>
+      </w:r>
+    </w:p>
+    <w:p>
+      <w:pPr>
+        <w:keepLines/>
+        <w:spacing w:before="100" w:after="140" w:line="264" w:lineRule="auto"/>
+        <w:jc w:val="left"/>
+      </w:pPr>
+      <w:r>
+        <w:rPr>
+          <w:rFonts w:ascii="Times New Roman" w:hAnsi="Times New Roman" w:eastAsia="Times New Roman" w:cs="Times New Roman"/>
+          <w:color w:val="000000"/>
+          <w:sz w:val="21"/>
+        </w:rPr>
+        <w:t>Figura 3. Conservación de bicarbonato y excreción neta de ácido. Esquema funcional original; no representa una nefrona anatómica ni etapas cronológicas sucesivas. Fundamento: (6).</w:t>
+      </w:r>
+    </w:p>
+    <w:p>
+      <w:r>
+        <w:rPr>
+          <w:rFonts w:ascii="Times New Roman" w:hAnsi="Times New Roman" w:eastAsia="Times New Roman" w:cs="Times New Roman"/>
+          <w:color w:val="000000"/>
+          <w:sz w:val="24"/>
+        </w:rPr>
+        <w:t>La excreción neta de ácido como NH₄⁺ y ácido titulable se relaciona con la reposición de bicarbonato en sangre. La amoniogénesis renal utiliza glutamina; los amortiguadores urinarios permiten transportar la carga ácida sin que toda ella permanezca como H⁺ libre. La excreción de bicarbonato, cuando ocurre, reduce ese balance neto de ácido eliminado. Esta distinción explica por qué conservar base filtrada y generar base nueva no son expresiones intercambiables. (6)</w:t>
+      </w:r>
+    </w:p>
+    <w:p>
+      <w:r>
+        <w:rPr>
+          <w:rFonts w:ascii="Times New Roman" w:hAnsi="Times New Roman" w:eastAsia="Times New Roman" w:cs="Times New Roman"/>
+          <w:color w:val="000000"/>
+          <w:sz w:val="24"/>
+        </w:rPr>
+        <w:t>La respuesta depende del tiempo y de la integridad renal. Frente a alcalosis, puede aumentar la eliminación de bicarbonato si el estado de volumen y los electrolitos lo permiten. En cambio, alteraciones de función renal, volumen o disponibilidad de cloruro pueden limitar la respuesta apropiada. Estas funciones organizan el razonamiento, sin implicar periodos rígidos. (6)</w:t>
+      </w:r>
+    </w:p>
+    <w:p>
+      <w:pPr>
+        <w:pStyle w:val="Heading1"/>
+      </w:pPr>
+      <w:r>
+        <w:t>5 Trastornos primarios</w:t>
+      </w:r>
+    </w:p>
+    <w:p>
+      <w:r>
+        <w:rPr>
+          <w:rFonts w:ascii="Times New Roman" w:hAnsi="Times New Roman" w:eastAsia="Times New Roman" w:cs="Times New Roman"/>
+          <w:color w:val="000000"/>
+          <w:sz w:val="24"/>
+        </w:rPr>
+        <w:t>La clasificación tradicional identifica la variable cuyo cambio inicia el proceso. Las flechas de la tabla describen tendencias de un trastorno simple, no valores diagnósticos independientes. Las respuestas secundarias se interpretan después de reconocer la alteración principal. (3,4)</w:t>
+      </w:r>
+    </w:p>
+    <w:p>
+      <w:pPr>
+        <w:keepNext/>
+        <w:keepLines/>
+        <w:spacing w:before="100" w:after="140" w:line="264" w:lineRule="auto"/>
+        <w:jc w:val="left"/>
+      </w:pPr>
+      <w:r>
+        <w:rPr>
+          <w:rFonts w:ascii="Times New Roman" w:hAnsi="Times New Roman" w:eastAsia="Times New Roman" w:cs="Times New Roman"/>
+          <w:color w:val="000000"/>
+          <w:sz w:val="21"/>
+        </w:rPr>
+        <w:t>Tabla 1. Patrones conceptuales de los cuatro trastornos primarios. Síntesis de (3,4,7).</w:t>
+      </w:r>
+    </w:p>
+    <w:tbl>
+      <w:tblPr>
+        <w:tblW w:type="auto" w:w="0"/>
+        <w:jc w:val="center"/>
+        <w:tblLayout w:type="fixed"/>
+        <w:tblLook w:firstColumn="1" w:firstRow="1" w:lastColumn="0" w:lastRow="0" w:noHBand="0" w:noVBand="1" w:val="04A0"/>
+      </w:tblPr>
+      <w:tblGrid>
+        <w:gridCol w:w="3384"/>
+        <w:gridCol w:w="2160"/>
+        <w:gridCol w:w="3816"/>
+      </w:tblGrid>
+      <w:tr>
+        <w:trPr>
+          <w:cantSplit/>
+          <w:tblHeader/>
+        </w:trPr>
+        <w:tc>
+          <w:tcPr>
+            <w:tcW w:type="dxa" w:w="3384"/>
+            <w:vAlign w:val="center"/>
+            <w:tcBorders>
+              <w:top w:val="single" w:sz="4" w:color="D9D9D9"/>
+              <w:left w:val="single" w:sz="4" w:color="D9D9D9"/>
+              <w:bottom w:val="single" w:sz="4" w:color="D9D9D9"/>
+              <w:right w:val="single" w:sz="4" w:color="D9D9D9"/>
+            </w:tcBorders>
+            <w:tcMar>
+              <w:top w:w="75" w:type="dxa"/>
+              <w:bottom w:w="75" w:type="dxa"/>
+              <w:left w:w="100" w:type="dxa"/>
+              <w:right w:w="100" w:type="dxa"/>
+            </w:tcMar>
+            <w:shd w:fill="E7ECF0"/>
+          </w:tcPr>
+          <w:p>
+            <w:pPr>
+              <w:keepNext/>
+              <w:spacing w:line="252" w:lineRule="auto" w:after="0"/>
+              <w:jc w:val="left"/>
+            </w:pPr>
+            <w:r>
+              <w:rPr>
+                <w:rFonts w:ascii="Times New Roman" w:hAnsi="Times New Roman" w:eastAsia="Times New Roman" w:cs="Times New Roman"/>
+                <w:b/>
+                <w:color w:val="000000"/>
+                <w:sz w:val="24"/>
+              </w:rPr>
+              <w:t>Proceso primario</w:t>
+            </w:r>
+          </w:p>
+        </w:tc>
+        <w:tc>
+          <w:tcPr>
+            <w:tcW w:type="dxa" w:w="2160"/>
+            <w:vAlign w:val="center"/>
+            <w:tcBorders>
+              <w:top w:val="single" w:sz="4" w:color="D9D9D9"/>
+              <w:left w:val="single" w:sz="4" w:color="D9D9D9"/>
+              <w:bottom w:val="single" w:sz="4" w:color="D9D9D9"/>
+              <w:right w:val="single" w:sz="4" w:color="D9D9D9"/>
+            </w:tcBorders>
+            <w:tcMar>
+              <w:top w:w="75" w:type="dxa"/>
+              <w:bottom w:w="75" w:type="dxa"/>
+              <w:left w:w="100" w:type="dxa"/>
+              <w:right w:w="100" w:type="dxa"/>
+            </w:tcMar>
+            <w:shd w:fill="E7ECF0"/>
+          </w:tcPr>
+          <w:p>
+            <w:pPr>
+              <w:keepNext/>
+              <w:spacing w:line="252" w:lineRule="auto" w:after="0"/>
+              <w:jc w:val="center"/>
+            </w:pPr>
+            <w:r>
+              <w:rPr>
+                <w:rFonts w:ascii="Times New Roman" w:hAnsi="Times New Roman" w:eastAsia="Times New Roman" w:cs="Times New Roman"/>
+                <w:b/>
+                <w:color w:val="000000"/>
+                <w:sz w:val="24"/>
+              </w:rPr>
+              <w:t>Cambio principal</w:t>
+            </w:r>
+          </w:p>
+        </w:tc>
+        <w:tc>
+          <w:tcPr>
+            <w:tcW w:type="dxa" w:w="3816"/>
+            <w:vAlign w:val="center"/>
+            <w:tcBorders>
+              <w:top w:val="single" w:sz="4" w:color="D9D9D9"/>
+              <w:left w:val="single" w:sz="4" w:color="D9D9D9"/>
+              <w:bottom w:val="single" w:sz="4" w:color="D9D9D9"/>
+              <w:right w:val="single" w:sz="4" w:color="D9D9D9"/>
+            </w:tcBorders>
+            <w:tcMar>
+              <w:top w:w="75" w:type="dxa"/>
+              <w:bottom w:w="75" w:type="dxa"/>
+              <w:left w:w="100" w:type="dxa"/>
+              <w:right w:w="100" w:type="dxa"/>
+            </w:tcMar>
+            <w:shd w:fill="E7ECF0"/>
+          </w:tcPr>
+          <w:p>
+            <w:pPr>
+              <w:keepNext/>
+              <w:spacing w:line="252" w:lineRule="auto" w:after="0"/>
+              <w:jc w:val="center"/>
+            </w:pPr>
+            <w:r>
+              <w:rPr>
+                <w:rFonts w:ascii="Times New Roman" w:hAnsi="Times New Roman" w:eastAsia="Times New Roman" w:cs="Times New Roman"/>
+                <w:b/>
+                <w:color w:val="000000"/>
+                <w:sz w:val="24"/>
+              </w:rPr>
+              <w:t>Efecto acidificante o alcalinizante</w:t>
+            </w:r>
+          </w:p>
+        </w:tc>
+      </w:tr>
+      <w:tr>
+        <w:trPr>
+          <w:cantSplit/>
+        </w:trPr>
+        <w:tc>
+          <w:tcPr>
+            <w:tcW w:type="dxa" w:w="3384"/>
+            <w:vAlign w:val="center"/>
+            <w:tcBorders>
+              <w:top w:val="single" w:sz="4" w:color="D9D9D9"/>
+              <w:left w:val="single" w:sz="4" w:color="D9D9D9"/>
+              <w:bottom w:val="single" w:sz="4" w:color="D9D9D9"/>
+              <w:right w:val="single" w:sz="4" w:color="D9D9D9"/>
+            </w:tcBorders>
+            <w:tcMar>
+              <w:top w:w="75" w:type="dxa"/>
+              <w:bottom w:w="75" w:type="dxa"/>
+              <w:left w:w="100" w:type="dxa"/>
+              <w:right w:w="100" w:type="dxa"/>
+            </w:tcMar>
+          </w:tcPr>
+          <w:p>
+            <w:pPr>
+              <w:keepNext/>
+              <w:spacing w:line="252" w:lineRule="auto" w:after="0"/>
+              <w:jc w:val="left"/>
+            </w:pPr>
+            <w:r>
+              <w:rPr>
+                <w:rFonts w:ascii="Times New Roman" w:hAnsi="Times New Roman" w:eastAsia="Times New Roman" w:cs="Times New Roman"/>
+                <w:b w:val="0"/>
+                <w:color w:val="000000"/>
+                <w:sz w:val="24"/>
+              </w:rPr>
+              <w:t>Acidosis metabólica</w:t>
+            </w:r>
+          </w:p>
+        </w:tc>
+        <w:tc>
+          <w:tcPr>
+            <w:tcW w:type="dxa" w:w="2160"/>
+            <w:vAlign w:val="center"/>
+            <w:tcBorders>
+              <w:top w:val="single" w:sz="4" w:color="D9D9D9"/>
+              <w:left w:val="single" w:sz="4" w:color="D9D9D9"/>
+              <w:bottom w:val="single" w:sz="4" w:color="D9D9D9"/>
+              <w:right w:val="single" w:sz="4" w:color="D9D9D9"/>
+            </w:tcBorders>
+            <w:tcMar>
+              <w:top w:w="75" w:type="dxa"/>
+              <w:bottom w:w="75" w:type="dxa"/>
+              <w:left w:w="100" w:type="dxa"/>
+              <w:right w:w="100" w:type="dxa"/>
+            </w:tcMar>
+          </w:tcPr>
+          <w:p>
+            <w:pPr>
+              <w:keepNext/>
+              <w:spacing w:line="252" w:lineRule="auto" w:after="0"/>
+              <w:jc w:val="center"/>
+            </w:pPr>
+            <w:r>
+              <w:rPr>
+                <w:rFonts w:ascii="Times New Roman" w:hAnsi="Times New Roman" w:eastAsia="Times New Roman" w:cs="Times New Roman"/>
+                <w:b w:val="0"/>
+                <w:color w:val="000000"/>
+                <w:sz w:val="24"/>
+              </w:rPr>
+              <w:t>HCO₃⁻ ↓</w:t>
+            </w:r>
+          </w:p>
+        </w:tc>
+        <w:tc>
+          <w:tcPr>
+            <w:tcW w:type="dxa" w:w="3816"/>
+            <w:vAlign w:val="center"/>
+            <w:tcBorders>
+              <w:top w:val="single" w:sz="4" w:color="D9D9D9"/>
+              <w:left w:val="single" w:sz="4" w:color="D9D9D9"/>
+              <w:bottom w:val="single" w:sz="4" w:color="D9D9D9"/>
+              <w:right w:val="single" w:sz="4" w:color="D9D9D9"/>
+            </w:tcBorders>
+            <w:tcMar>
+              <w:top w:w="75" w:type="dxa"/>
+              <w:bottom w:w="75" w:type="dxa"/>
+              <w:left w:w="100" w:type="dxa"/>
+              <w:right w:w="100" w:type="dxa"/>
+            </w:tcMar>
+          </w:tcPr>
+          <w:p>
+            <w:pPr>
+              <w:keepNext/>
+              <w:spacing w:line="252" w:lineRule="auto" w:after="0"/>
+              <w:jc w:val="center"/>
+            </w:pPr>
+            <w:r>
+              <w:rPr>
+                <w:rFonts w:ascii="Times New Roman" w:hAnsi="Times New Roman" w:eastAsia="Times New Roman" w:cs="Times New Roman"/>
+                <w:b w:val="0"/>
+                <w:color w:val="000000"/>
+                <w:sz w:val="24"/>
+              </w:rPr>
+              <w:t>Tendencia a pH ↓</w:t>
+            </w:r>
+          </w:p>
+        </w:tc>
+      </w:tr>
+      <w:tr>
+        <w:trPr>
+          <w:cantSplit/>
+        </w:trPr>
+        <w:tc>
+          <w:tcPr>
+            <w:tcW w:type="dxa" w:w="3384"/>
+            <w:vAlign w:val="center"/>
+            <w:tcBorders>
+              <w:top w:val="single" w:sz="4" w:color="D9D9D9"/>
+              <w:left w:val="single" w:sz="4" w:color="D9D9D9"/>
+              <w:bottom w:val="single" w:sz="4" w:color="D9D9D9"/>
+              <w:right w:val="single" w:sz="4" w:color="D9D9D9"/>
+            </w:tcBorders>
+            <w:tcMar>
+              <w:top w:w="75" w:type="dxa"/>
+              <w:bottom w:w="75" w:type="dxa"/>
+              <w:left w:w="100" w:type="dxa"/>
+              <w:right w:w="100" w:type="dxa"/>
+            </w:tcMar>
+          </w:tcPr>
+          <w:p>
+            <w:pPr>
+              <w:keepNext/>
+              <w:spacing w:line="252" w:lineRule="auto" w:after="0"/>
+              <w:jc w:val="left"/>
+            </w:pPr>
+            <w:r>
+              <w:rPr>
+                <w:rFonts w:ascii="Times New Roman" w:hAnsi="Times New Roman" w:eastAsia="Times New Roman" w:cs="Times New Roman"/>
+                <w:b w:val="0"/>
+                <w:color w:val="000000"/>
+                <w:sz w:val="24"/>
+              </w:rPr>
+              <w:t>Alcalosis metabólica</w:t>
+            </w:r>
+          </w:p>
+        </w:tc>
+        <w:tc>
+          <w:tcPr>
+            <w:tcW w:type="dxa" w:w="2160"/>
+            <w:vAlign w:val="center"/>
+            <w:tcBorders>
+              <w:top w:val="single" w:sz="4" w:color="D9D9D9"/>
+              <w:left w:val="single" w:sz="4" w:color="D9D9D9"/>
+              <w:bottom w:val="single" w:sz="4" w:color="D9D9D9"/>
+              <w:right w:val="single" w:sz="4" w:color="D9D9D9"/>
+            </w:tcBorders>
+            <w:tcMar>
+              <w:top w:w="75" w:type="dxa"/>
+              <w:bottom w:w="75" w:type="dxa"/>
+              <w:left w:w="100" w:type="dxa"/>
+              <w:right w:w="100" w:type="dxa"/>
+            </w:tcMar>
+          </w:tcPr>
+          <w:p>
+            <w:pPr>
+              <w:keepNext/>
+              <w:spacing w:line="252" w:lineRule="auto" w:after="0"/>
+              <w:jc w:val="center"/>
+            </w:pPr>
+            <w:r>
+              <w:rPr>
+                <w:rFonts w:ascii="Times New Roman" w:hAnsi="Times New Roman" w:eastAsia="Times New Roman" w:cs="Times New Roman"/>
+                <w:b w:val="0"/>
+                <w:color w:val="000000"/>
+                <w:sz w:val="24"/>
+              </w:rPr>
+              <w:t>HCO₃⁻ ↑</w:t>
+            </w:r>
+          </w:p>
+        </w:tc>
+        <w:tc>
+          <w:tcPr>
+            <w:tcW w:type="dxa" w:w="3816"/>
+            <w:vAlign w:val="center"/>
+            <w:tcBorders>
+              <w:top w:val="single" w:sz="4" w:color="D9D9D9"/>
+              <w:left w:val="single" w:sz="4" w:color="D9D9D9"/>
+              <w:bottom w:val="single" w:sz="4" w:color="D9D9D9"/>
+              <w:right w:val="single" w:sz="4" w:color="D9D9D9"/>
+            </w:tcBorders>
+            <w:tcMar>
+              <w:top w:w="75" w:type="dxa"/>
+              <w:bottom w:w="75" w:type="dxa"/>
+              <w:left w:w="100" w:type="dxa"/>
+              <w:right w:w="100" w:type="dxa"/>
+            </w:tcMar>
+          </w:tcPr>
+          <w:p>
+            <w:pPr>
+              <w:keepNext/>
+              <w:spacing w:line="252" w:lineRule="auto" w:after="0"/>
+              <w:jc w:val="center"/>
+            </w:pPr>
+            <w:r>
+              <w:rPr>
+                <w:rFonts w:ascii="Times New Roman" w:hAnsi="Times New Roman" w:eastAsia="Times New Roman" w:cs="Times New Roman"/>
+                <w:b w:val="0"/>
+                <w:color w:val="000000"/>
+                <w:sz w:val="24"/>
+              </w:rPr>
+              <w:t>Tendencia a pH ↑</w:t>
+            </w:r>
+          </w:p>
+        </w:tc>
+      </w:tr>
+      <w:tr>
+        <w:trPr>
+          <w:cantSplit/>
+        </w:trPr>
+        <w:tc>
+          <w:tcPr>
+            <w:tcW w:type="dxa" w:w="3384"/>
+            <w:vAlign w:val="center"/>
+            <w:tcBorders>
+              <w:top w:val="single" w:sz="4" w:color="D9D9D9"/>
+              <w:left w:val="single" w:sz="4" w:color="D9D9D9"/>
+              <w:bottom w:val="single" w:sz="4" w:color="D9D9D9"/>
+              <w:right w:val="single" w:sz="4" w:color="D9D9D9"/>
+            </w:tcBorders>
+            <w:tcMar>
+              <w:top w:w="75" w:type="dxa"/>
+              <w:bottom w:w="75" w:type="dxa"/>
+              <w:left w:w="100" w:type="dxa"/>
+              <w:right w:w="100" w:type="dxa"/>
+            </w:tcMar>
+          </w:tcPr>
+          <w:p>
+            <w:pPr>
+              <w:keepNext/>
+              <w:spacing w:line="252" w:lineRule="auto" w:after="0"/>
+              <w:jc w:val="left"/>
+            </w:pPr>
+            <w:r>
+              <w:rPr>
+                <w:rFonts w:ascii="Times New Roman" w:hAnsi="Times New Roman" w:eastAsia="Times New Roman" w:cs="Times New Roman"/>
+                <w:b w:val="0"/>
+                <w:color w:val="000000"/>
+                <w:sz w:val="24"/>
+              </w:rPr>
+              <w:t>Acidosis respiratoria</w:t>
+            </w:r>
+          </w:p>
+        </w:tc>
+        <w:tc>
+          <w:tcPr>
+            <w:tcW w:type="dxa" w:w="2160"/>
+            <w:vAlign w:val="center"/>
+            <w:tcBorders>
+              <w:top w:val="single" w:sz="4" w:color="D9D9D9"/>
+              <w:left w:val="single" w:sz="4" w:color="D9D9D9"/>
+              <w:bottom w:val="single" w:sz="4" w:color="D9D9D9"/>
+              <w:right w:val="single" w:sz="4" w:color="D9D9D9"/>
+            </w:tcBorders>
+            <w:tcMar>
+              <w:top w:w="75" w:type="dxa"/>
+              <w:bottom w:w="75" w:type="dxa"/>
+              <w:left w:w="100" w:type="dxa"/>
+              <w:right w:w="100" w:type="dxa"/>
+            </w:tcMar>
+          </w:tcPr>
+          <w:p>
+            <w:pPr>
+              <w:keepNext/>
+              <w:spacing w:line="252" w:lineRule="auto" w:after="0"/>
+              <w:jc w:val="center"/>
+            </w:pPr>
+            <w:r>
+              <w:rPr>
+                <w:rFonts w:ascii="Times New Roman" w:hAnsi="Times New Roman" w:eastAsia="Times New Roman" w:cs="Times New Roman"/>
+                <w:b w:val="0"/>
+                <w:color w:val="000000"/>
+                <w:sz w:val="24"/>
+              </w:rPr>
+              <w:t>PCO₂ ↑</w:t>
+            </w:r>
+          </w:p>
+        </w:tc>
+        <w:tc>
+          <w:tcPr>
+            <w:tcW w:type="dxa" w:w="3816"/>
+            <w:vAlign w:val="center"/>
+            <w:tcBorders>
+              <w:top w:val="single" w:sz="4" w:color="D9D9D9"/>
+              <w:left w:val="single" w:sz="4" w:color="D9D9D9"/>
+              <w:bottom w:val="single" w:sz="4" w:color="D9D9D9"/>
+              <w:right w:val="single" w:sz="4" w:color="D9D9D9"/>
+            </w:tcBorders>
+            <w:tcMar>
+              <w:top w:w="75" w:type="dxa"/>
+              <w:bottom w:w="75" w:type="dxa"/>
+              <w:left w:w="100" w:type="dxa"/>
+              <w:right w:w="100" w:type="dxa"/>
+            </w:tcMar>
+          </w:tcPr>
+          <w:p>
+            <w:pPr>
+              <w:keepNext/>
+              <w:spacing w:line="252" w:lineRule="auto" w:after="0"/>
+              <w:jc w:val="center"/>
+            </w:pPr>
+            <w:r>
+              <w:rPr>
+                <w:rFonts w:ascii="Times New Roman" w:hAnsi="Times New Roman" w:eastAsia="Times New Roman" w:cs="Times New Roman"/>
+                <w:b w:val="0"/>
+                <w:color w:val="000000"/>
+                <w:sz w:val="24"/>
+              </w:rPr>
+              <w:t>Tendencia a pH ↓</w:t>
+            </w:r>
+          </w:p>
+        </w:tc>
+      </w:tr>
+      <w:tr>
+        <w:trPr>
+          <w:cantSplit/>
+        </w:trPr>
+        <w:tc>
+          <w:tcPr>
+            <w:tcW w:type="dxa" w:w="3384"/>
+            <w:vAlign w:val="center"/>
+            <w:tcBorders>
+              <w:top w:val="single" w:sz="4" w:color="D9D9D9"/>
+              <w:left w:val="single" w:sz="4" w:color="D9D9D9"/>
+              <w:bottom w:val="single" w:sz="4" w:color="D9D9D9"/>
+              <w:right w:val="single" w:sz="4" w:color="D9D9D9"/>
+            </w:tcBorders>
+            <w:tcMar>
+              <w:top w:w="75" w:type="dxa"/>
+              <w:bottom w:w="75" w:type="dxa"/>
+              <w:left w:w="100" w:type="dxa"/>
+              <w:right w:w="100" w:type="dxa"/>
+            </w:tcMar>
+          </w:tcPr>
+          <w:p>
+            <w:pPr>
+              <w:keepNext w:val="0"/>
+              <w:spacing w:line="252" w:lineRule="auto" w:after="0"/>
+              <w:jc w:val="left"/>
+            </w:pPr>
+            <w:r>
+              <w:rPr>
+                <w:rFonts w:ascii="Times New Roman" w:hAnsi="Times New Roman" w:eastAsia="Times New Roman" w:cs="Times New Roman"/>
+                <w:b w:val="0"/>
+                <w:color w:val="000000"/>
+                <w:sz w:val="24"/>
+              </w:rPr>
+              <w:t>Alcalosis respiratoria</w:t>
+            </w:r>
+          </w:p>
+        </w:tc>
+        <w:tc>
+          <w:tcPr>
+            <w:tcW w:type="dxa" w:w="2160"/>
+            <w:vAlign w:val="center"/>
+            <w:tcBorders>
+              <w:top w:val="single" w:sz="4" w:color="D9D9D9"/>
+              <w:left w:val="single" w:sz="4" w:color="D9D9D9"/>
+              <w:bottom w:val="single" w:sz="4" w:color="D9D9D9"/>
+              <w:right w:val="single" w:sz="4" w:color="D9D9D9"/>
+            </w:tcBorders>
+            <w:tcMar>
+              <w:top w:w="75" w:type="dxa"/>
+              <w:bottom w:w="75" w:type="dxa"/>
+              <w:left w:w="100" w:type="dxa"/>
+              <w:right w:w="100" w:type="dxa"/>
+            </w:tcMar>
+          </w:tcPr>
+          <w:p>
+            <w:pPr>
+              <w:keepNext w:val="0"/>
+              <w:spacing w:line="252" w:lineRule="auto" w:after="0"/>
+              <w:jc w:val="center"/>
+            </w:pPr>
+            <w:r>
+              <w:rPr>
+                <w:rFonts w:ascii="Times New Roman" w:hAnsi="Times New Roman" w:eastAsia="Times New Roman" w:cs="Times New Roman"/>
+                <w:b w:val="0"/>
+                <w:color w:val="000000"/>
+                <w:sz w:val="24"/>
+              </w:rPr>
+              <w:t>PCO₂ ↓</w:t>
+            </w:r>
+          </w:p>
+        </w:tc>
+        <w:tc>
+          <w:tcPr>
+            <w:tcW w:type="dxa" w:w="3816"/>
+            <w:vAlign w:val="center"/>
+            <w:tcBorders>
+              <w:top w:val="single" w:sz="4" w:color="D9D9D9"/>
+              <w:left w:val="single" w:sz="4" w:color="D9D9D9"/>
+              <w:bottom w:val="single" w:sz="4" w:color="D9D9D9"/>
+              <w:right w:val="single" w:sz="4" w:color="D9D9D9"/>
+            </w:tcBorders>
+            <w:tcMar>
+              <w:top w:w="75" w:type="dxa"/>
+              <w:bottom w:w="75" w:type="dxa"/>
+              <w:left w:w="100" w:type="dxa"/>
+              <w:right w:w="100" w:type="dxa"/>
+            </w:tcMar>
+          </w:tcPr>
+          <w:p>
+            <w:pPr>
+              <w:keepNext w:val="0"/>
+              <w:spacing w:line="252" w:lineRule="auto" w:after="0"/>
+              <w:jc w:val="center"/>
+            </w:pPr>
+            <w:r>
+              <w:rPr>
+                <w:rFonts w:ascii="Times New Roman" w:hAnsi="Times New Roman" w:eastAsia="Times New Roman" w:cs="Times New Roman"/>
+                <w:b w:val="0"/>
+                <w:color w:val="000000"/>
+                <w:sz w:val="24"/>
+              </w:rPr>
+              <w:t>Tendencia a pH ↑</w:t>
+            </w:r>
+          </w:p>
+        </w:tc>
+      </w:tr>
+    </w:tbl>
+    <w:p>
+      <w:pPr>
+        <w:spacing w:after="0" w:line="72" w:lineRule="auto"/>
+      </w:pPr>
+      <w:r>
+        <w:rPr>
+          <w:rFonts w:ascii="Times New Roman" w:hAnsi="Times New Roman" w:eastAsia="Times New Roman" w:cs="Times New Roman"/>
+          <w:color w:val="000000"/>
+          <w:sz w:val="4"/>
+        </w:rPr>
+      </w:r>
+    </w:p>
+    <w:p>
+      <w:pPr>
+        <w:pStyle w:val="Heading2"/>
+      </w:pPr>
+      <w:r>
+        <w:t>5.1 Trastornos metabólicos</w:t>
+      </w:r>
+    </w:p>
+    <w:p>
+      <w:r>
+        <w:rPr>
+          <w:rFonts w:ascii="Times New Roman" w:hAnsi="Times New Roman" w:eastAsia="Times New Roman" w:cs="Times New Roman"/>
+          <w:color w:val="000000"/>
+          <w:sz w:val="24"/>
+        </w:rPr>
+        <w:t>La acidosis metabólica puede originarse en acumulación de ácidos, pérdida de bicarbonato o menor excreción renal de ácido. En la diarrea pueden intervenir pérdida digestiva de base, reducción de la perfusión y absorción de productos de fermentación. La disminución de HCO₃⁻ también puede acompañar una respuesta a alcalosis respiratoria; por tanto, no establece de manera aislada un origen metabólico primario. (7)</w:t>
+      </w:r>
+    </w:p>
+    <w:p>
+      <w:r>
+        <w:rPr>
+          <w:rFonts w:ascii="Times New Roman" w:hAnsi="Times New Roman" w:eastAsia="Times New Roman" w:cs="Times New Roman"/>
+          <w:color w:val="000000"/>
+          <w:sz w:val="24"/>
+        </w:rPr>
+        <w:t>La alcalosis metabólica se relaciona con pérdida o secuestro de HCl y, en ciertos contextos, con aportes de base. En bovinos con desplazamiento o vólvulo abomasal son relevantes los cambios de cloruro y el secuestro de contenido digestivo. El estudio de 1982 vacas lecheras muestra la importancia de integrar hallazgos clínicos y de laboratorio; sus registros abarcan 1988–2016, aunque la publicación es de 2022. Si disminuye la perfusión puede añadirse un proceso acidificante. El nombre de la enfermedad no garantiza un patrón único. (8)</w:t>
+      </w:r>
+    </w:p>
+    <w:p>
+      <w:pPr>
+        <w:pStyle w:val="Heading2"/>
+      </w:pPr>
+      <w:r>
+        <w:t>5.2 Trastornos respiratorios</w:t>
+      </w:r>
+    </w:p>
+    <w:p>
+      <w:r>
+        <w:rPr>
+          <w:rFonts w:ascii="Times New Roman" w:hAnsi="Times New Roman" w:eastAsia="Times New Roman" w:cs="Times New Roman"/>
+          <w:color w:val="000000"/>
+          <w:sz w:val="24"/>
+        </w:rPr>
+        <w:t>La acidosis respiratoria resulta de retención de CO₂ por ventilación alveolar insuficiente, por ejemplo durante depresión respiratoria, obstrucción o debilidad ventilatoria. La alcalosis respiratoria refleja eliminación aumentada de CO₂ respecto de su producción y puede acompañar dolor, excitación o hipoxemia. Estos son contextos posibles, no diagnósticos derivados automáticamente de un síntoma. La PCO₂ debe interpretarse junto con las otras variables y la evolución. (4)</w:t>
+      </w:r>
+    </w:p>
+    <w:p>
+      <w:pPr>
+        <w:pStyle w:val="Heading1"/>
+      </w:pPr>
+      <w:r>
+        <w:t>6 Compensación e interpretación gasométrica</w:t>
+      </w:r>
+    </w:p>
+    <w:p>
+      <w:pPr>
+        <w:pStyle w:val="Heading2"/>
+      </w:pPr>
+      <w:r>
+        <w:t>6.1 Respuesta compensadora y procesos mixtos</w:t>
+      </w:r>
+    </w:p>
+    <w:p>
+      <w:r>
+        <w:rPr>
+          <w:rFonts w:ascii="Times New Roman" w:hAnsi="Times New Roman" w:eastAsia="Times New Roman" w:cs="Times New Roman"/>
+          <w:color w:val="000000"/>
+          <w:sz w:val="24"/>
+        </w:rPr>
+        <w:t>La compensación atenúa la desviación del pH causada por una alteración primaria. Ante un trastorno metabólico interviene la ventilación; ante un trastorno respiratorio actúan amortiguadores y, después, la adaptación renal. Un pequeño aumento de HCO₃⁻ en una acidosis respiratoria reciente puede proceder de amortiguación y no demuestra adaptación renal crónica. La magnitud esperada depende de especie, duración y capacidad orgánica. (3)</w:t>
+      </w:r>
+    </w:p>
+    <w:p>
+      <w:r>
+        <w:rPr>
+          <w:rFonts w:ascii="Times New Roman" w:hAnsi="Times New Roman" w:eastAsia="Times New Roman" w:cs="Times New Roman"/>
+          <w:color w:val="000000"/>
+          <w:sz w:val="24"/>
+        </w:rPr>
+        <w:t>Dos o más procesos primarios constituyen un trastorno mixto. Sus efectos pueden sumarse o contrarrestarse. Un pH próximo al valor basal no prueba ausencia de alteración ni recuperación. Del mismo modo, reconocer que la PCO₂ cambia en una dirección compensadora no basta para afirmar que su magnitud es apropiada. Las ecuaciones derivadas en perros no se trasladan automáticamente a terneros. (3)</w:t>
+      </w:r>
+    </w:p>
+    <w:p>
+      <w:pPr>
+        <w:pStyle w:val="Heading2"/>
+      </w:pPr>
+      <w:r>
+        <w:t>6.2 Lectura integrada de la muestra</w:t>
+      </w:r>
+    </w:p>
+    <w:p>
+      <w:r>
+        <w:rPr>
+          <w:rFonts w:ascii="Times New Roman" w:hAnsi="Times New Roman" w:eastAsia="Times New Roman" w:cs="Times New Roman"/>
+          <w:color w:val="000000"/>
+          <w:sz w:val="24"/>
+        </w:rPr>
+        <w:t>Primero se identifican especie, edad, condición clínica, origen arterial o venoso y condiciones de obtención. El aire y la demora pueden modificar los resultados. La PO₂ venosa no sustituye a la arterial para valorar oxigenación pulmonar. Segundo, se compara el pH con el criterio aplicable. Tercero, se relacionan PCO₂ y HCO₃⁻ con el sentido del cambio. Cuarto, se integran respuesta esperada, electrolitos e historia, considerando explicaciones alternativas. (9)</w:t>
+      </w:r>
+    </w:p>
+    <w:p>
+      <w:r>
+        <w:rPr>
+          <w:rFonts w:ascii="Times New Roman" w:hAnsi="Times New Roman" w:eastAsia="Times New Roman" w:cs="Times New Roman"/>
+          <w:color w:val="000000"/>
+          <w:sz w:val="24"/>
+        </w:rPr>
+        <w:t>Debe distinguirse una medida de un cálculo. El gasómetro mide pH y PCO₂ y habitualmente calcula HCO₃⁻. Un simulador que recibe bicarbonato y PCO₂ para calcular pH invierte ese orden instrumental: es una representación algebraica, no una reproducción del funcionamiento analítico del equipo. La consistencia de los tres números no elimina errores preanalíticos ni sustituye la valoración de la muestra. (9)</w:t>
+      </w:r>
+    </w:p>
+    <w:p>
+      <w:pPr>
+        <w:pStyle w:val="Heading2"/>
+      </w:pPr>
+      <w:r>
+        <w:t>6.3 Brecha aniónica</w:t>
+      </w:r>
+    </w:p>
+    <w:p>
+      <w:pPr>
+        <w:spacing w:before="100" w:after="180"/>
+        <w:jc w:val="center"/>
+      </w:pPr>
+      <m:oMath>
+        <m:r>
+          <m:t>AG = (</m:t>
+        </m:r>
+        <m:sSup>
+          <m:e>
+            <m:r>
+              <m:t>Na</m:t>
+            </m:r>
+          </m:e>
+          <m:sup>
+            <m:r>
+              <m:t>+</m:t>
+            </m:r>
+          </m:sup>
+        </m:sSup>
+        <m:r>
+          <m:t> + </m:t>
+        </m:r>
+        <m:sSup>
+          <m:e>
+            <m:r>
+              <m:t>K</m:t>
+            </m:r>
+          </m:e>
+          <m:sup>
+            <m:r>
+              <m:t>+</m:t>
+            </m:r>
+          </m:sup>
+        </m:sSup>
+        <m:r>
+          <m:t>) − (</m:t>
+        </m:r>
+        <m:sSup>
+          <m:e>
+            <m:r>
+              <m:t>Cl</m:t>
+            </m:r>
+          </m:e>
+          <m:sup>
+            <m:r>
+              <m:t>−</m:t>
+            </m:r>
+          </m:sup>
+        </m:sSup>
+        <m:r>
+          <m:t> + </m:t>
+        </m:r>
+        <m:sSubSup>
+          <m:e>
+            <m:r>
+              <m:t>HCO</m:t>
+            </m:r>
+          </m:e>
+          <m:sub>
+            <m:r>
+              <m:t>3</m:t>
+            </m:r>
+          </m:sub>
+          <m:sup>
+            <m:r>
+              <m:t>−</m:t>
+            </m:r>
+          </m:sup>
+        </m:sSubSup>
+        <m:r>
+          <m:t>)</m:t>
+        </m:r>
+      </m:oMath>
+    </w:p>
+    <w:p>
+      <w:r>
+        <w:rPr>
+          <w:rFonts w:ascii="Times New Roman" w:hAnsi="Times New Roman" w:eastAsia="Times New Roman" w:cs="Times New Roman"/>
+          <w:color w:val="000000"/>
+          <w:sz w:val="24"/>
+        </w:rPr>
+        <w:t>La brecha aniónica representa una diferencia entre cationes y aniones medidos y orienta sobre el balance de iones no medidos. La electroneutralidad se conserva. En este informe se incluye K⁺; la comparación debe utilizar el intervalo del laboratorio para esa misma fórmula. La albúmina baja puede enmascarar una elevación. La brecha no identifica lactato, D-lactato ni otro anión específico, y tampoco cuantifica por sí sola la causa del trastorno. (10)</w:t>
+      </w:r>
+    </w:p>
+    <w:p>
+      <w:pPr>
+        <w:pStyle w:val="Heading1"/>
+      </w:pPr>
+      <w:r>
+        <w:t>7 Análisis del modelo de Henderson Hasselbalch</w:t>
+      </w:r>
+    </w:p>
+    <w:p>
+      <w:pPr>
+        <w:spacing w:before="100" w:after="180"/>
         <w:jc w:val="center"/>
       </w:pPr>
       <m:oMath>
@@ -539,9 +1637,6 @@
         </m:r>
         <m:f>
           <m:num>
-            <m:r>
-              <m:t>[</m:t>
-            </m:r>
             <m:sSubSup>
               <m:e>
                 <m:r>
@@ -559,9 +1654,6 @@
                 </m:r>
               </m:sup>
             </m:sSubSup>
-            <m:r>
-              <m:t>]</m:t>
-            </m:r>
           </m:num>
           <m:den>
             <m:r>
@@ -593,19 +1685,20 @@
           <w:color w:val="000000"/>
           <w:sz w:val="24"/>
         </w:rPr>
-        <w:t>En esta aproximación a 37 °C, el bicarbonato se expresa en mmol/L y la PCO₂ en mmHg. El factor 0,03 convierte la presión de CO₂ en concentración disuelta. Con HCO₃⁻ de 24 mmol/L y PCO₂ de 40 mmHg, la relación es 24/1,2 = 20 y el pH calculado es 7,40. La relación 20:1 corresponde a bicarbonato/CO₂ disuelto, no a bicarbonato/PCO₂. Las constantes pueden variar con temperatura y condiciones analíticas. (3)</w:t>
+        <w:t>A 37 °C se emplean pK aparente de 6,1 y solubilidad de CO₂ de 0,03 mmol·L⁻¹·mmHg⁻¹. HCO₃⁻ se expresa en mmol/L y PCO₂ en mmHg. Con 24 y 40, respectivamente, el CO₂ disuelto es 1,2 mmol/L, la relación es 20 y el pH calculado es 7,401. La proporción 20:1 corresponde a bicarbonato frente a CO₂ disuelto, no a bicarbonato frente a PCO₂. (2,9)</w:t>
       </w:r>
     </w:p>
     <w:p>
       <w:pPr>
         <w:keepNext/>
+        <w:spacing w:after="0"/>
         <w:jc w:val="center"/>
       </w:pPr>
       <w:r>
         <w:drawing>
           <wp:inline xmlns:a="http://schemas.openxmlformats.org/drawingml/2006/main" xmlns:pic="http://schemas.openxmlformats.org/drawingml/2006/picture">
-            <wp:extent cx="5806440" cy="2940255"/>
-            <wp:docPr id="1" name="Picture 1" descr="Figura 1. Relación calculada entre PCO₂ y pH para tres concentraciones de bicarbonato. Curvas didácticas a 37 °C basadas en Henderson–Hasselbalch; no representan mediciones ni intervalos universales. Elaboración propia a partir de (3)."/>
+            <wp:extent cx="5806440" cy="3080245"/>
+            <wp:docPr id="4" name="Picture 4" descr="Figura 4. Líneas calculadas de igual pH en el dominio del modelo. Los puntos representan ejemplos sintéticos; las líneas no son intervalos veterinarios, regiones diagnósticas ni trayectorias de compensación. Elaboración propia mediante Henderson–Hasselbalch. Fundamento: (2,9)."/>
             <wp:cNvGraphicFramePr>
               <a:graphicFrameLocks noChangeAspect="1"/>
             </wp:cNvGraphicFramePr>
@@ -613,11 +1706,11 @@
               <a:graphicData uri="http://schemas.openxmlformats.org/drawingml/2006/picture">
                 <pic:pic>
                   <pic:nvPicPr>
-                    <pic:cNvPr id="0" name="curve.png"/>
+                    <pic:cNvPr id="0" name="hh_phase.png"/>
                     <pic:cNvPicPr/>
                   </pic:nvPicPr>
                   <pic:blipFill>
-                    <a:blip r:embed="rId13"/>
+                    <a:blip r:embed="rId14"/>
                     <a:stretch>
                       <a:fillRect/>
                     </a:stretch>
@@ -625,7 +1718,7 @@
                   <pic:spPr>
                     <a:xfrm>
                       <a:off x="0" y="0"/>
-                      <a:ext cx="5806440" cy="2940255"/>
+                      <a:ext cx="5806440" cy="3080245"/>
                     </a:xfrm>
                     <a:prstGeom prst="rect"/>
                   </pic:spPr>
@@ -638,24 +1731,17 @@
     </w:p>
     <w:p>
       <w:pPr>
-        <w:spacing w:before="100" w:after="180"/>
+        <w:keepLines/>
+        <w:spacing w:before="100" w:after="140" w:line="264" w:lineRule="auto"/>
         <w:jc w:val="left"/>
       </w:pPr>
       <w:r>
         <w:rPr>
           <w:rFonts w:ascii="Times New Roman" w:hAnsi="Times New Roman" w:eastAsia="Times New Roman" w:cs="Times New Roman"/>
           <w:color w:val="000000"/>
-          <w:sz w:val="20"/>
+          <w:sz w:val="21"/>
         </w:rPr>
-        <w:t>Figura 1. Relación calculada entre PCO₂ y pH para tres concentraciones de bicarbonato. Curvas didácticas a 37 °C basadas en Henderson–Hasselbalch; no representan mediciones ni intervalos universales. Elaboración propia a partir de (3).</w:t>
-      </w:r>
-    </w:p>
-    <w:p>
-      <w:pPr>
-        <w:pStyle w:val="Heading2"/>
-      </w:pPr>
-      <w:r>
-        <w:t>4.3 Amortiguación y respuesta orgánica</w:t>
+        <w:t>Figura 4. Líneas calculadas de igual pH en el dominio del modelo. Los puntos representan ejemplos sintéticos; las líneas no son intervalos veterinarios, regiones diagnósticas ni trayectorias de compensación. Elaboración propia mediante Henderson–Hasselbalch. Fundamento: (2,9).</w:t>
       </w:r>
     </w:p>
     <w:p>
@@ -665,7 +1751,7 @@
           <w:color w:val="000000"/>
           <w:sz w:val="24"/>
         </w:rPr>
-        <w:t>El bicarbonato participa principalmente en el espacio extracelular. Las proteínas, la hemoglobina y los fosfatos también aceptan o liberan H⁺. Esta amortiguación limita cambios iniciales, pero no equivale a eliminar la carga ácida del organismo. La ventilación y la excreción renal completan la regulación. (1)</w:t>
+        <w:t>Con PCO₂ fija, elevar HCO₃⁻ aumenta el pH; con HCO₃⁻ fijo, elevar PCO₂ lo reduce. Si ambos cambian en la misma proporción, el pH calculado permanece igual: 12/20 y 24/40 producen aproximadamente 7,401. La igualdad del resultado no demuestra igualdad de los procesos fisiopatológicos.</w:t>
       </w:r>
     </w:p>
     <w:p>
@@ -675,477 +1761,24 @@
           <w:color w:val="000000"/>
           <w:sz w:val="24"/>
         </w:rPr>
-        <w:t>En el riñón conviene distinguir dos funciones. La recuperación del bicarbonato filtrado evita perder una base ya existente. La excreción neta de ácido, como amonio y ácido titulable, incorpora bicarbonato nuevo a la sangre. La amoniogénesis utiliza glutamina y permite aumentar la eliminación de ácido cuando la carga supera la basal. La disfunción tubular puede comprometer estos mecanismos. (4)</w:t>
+        <w:t>El dominio de exploración comprende HCO₃⁻ de 4–48 mmol/L y PCO₂ de 10–100 mmHg; son límites del ejercicio, no intervalos clínicos. El modelo no corrige temperatura, especie, proteínas u otros iones, ni simula adaptación renal o ventilatoria. Si se calcula pH durante el ejercicio respiratorio manteniendo HCO₃⁻ en 24 mmol/L, se excluyen también la amortiguación inicial y la adaptación renal. (2,3,9)</w:t>
       </w:r>
     </w:p>
     <w:p>
       <w:pPr>
-        <w:keepNext/>
-        <w:spacing w:before="100" w:after="180"/>
-        <w:jc w:val="left"/>
+        <w:pStyle w:val="Heading1"/>
+        <w:pageBreakBefore/>
       </w:pPr>
       <w:r>
-        <w:rPr>
-          <w:rFonts w:ascii="Times New Roman" w:hAnsi="Times New Roman" w:eastAsia="Times New Roman" w:cs="Times New Roman"/>
-          <w:color w:val="000000"/>
-          <w:sz w:val="20"/>
-        </w:rPr>
-        <w:t>Tabla 1. Respuesta de los principales sistemas reguladores. Síntesis de (4,5).</w:t>
+        <w:t>8 Aplicación a casos didácticos</w:t>
       </w:r>
-    </w:p>
-    <w:tbl>
-      <w:tblPr>
-        <w:tblW w:type="auto" w:w="0"/>
-        <w:jc w:val="center"/>
-        <w:tblLayout w:type="fixed"/>
-        <w:tblLook w:firstColumn="1" w:firstRow="1" w:lastColumn="0" w:lastRow="0" w:noHBand="0" w:noVBand="1" w:val="04A0"/>
-      </w:tblPr>
-      <w:tblGrid>
-        <w:gridCol w:w="1872"/>
-        <w:gridCol w:w="4248"/>
-        <w:gridCol w:w="3240"/>
-      </w:tblGrid>
-      <w:tr>
-        <w:trPr>
-          <w:cantSplit/>
-          <w:tblHeader/>
-        </w:trPr>
-        <w:tc>
-          <w:tcPr>
-            <w:tcW w:type="dxa" w:w="1872"/>
-            <w:vAlign w:val="center"/>
-            <w:tcBorders>
-              <w:top w:val="single" w:sz="4" w:color="D9D9D9"/>
-              <w:left w:val="single" w:sz="4" w:color="D9D9D9"/>
-              <w:bottom w:val="single" w:sz="4" w:color="D9D9D9"/>
-              <w:right w:val="single" w:sz="4" w:color="D9D9D9"/>
-            </w:tcBorders>
-            <w:tcMar>
-              <w:top w:w="80" w:type="dxa"/>
-              <w:bottom w:w="80" w:type="dxa"/>
-              <w:left w:w="100" w:type="dxa"/>
-              <w:right w:w="100" w:type="dxa"/>
-            </w:tcMar>
-            <w:shd w:fill="E6E6E6"/>
-          </w:tcPr>
-          <w:p>
-            <w:pPr>
-              <w:keepNext/>
-              <w:spacing w:line="252" w:lineRule="auto" w:after="20"/>
-              <w:jc w:val="left"/>
-            </w:pPr>
-            <w:r>
-              <w:rPr>
-                <w:rFonts w:ascii="Times New Roman" w:hAnsi="Times New Roman" w:eastAsia="Times New Roman" w:cs="Times New Roman"/>
-                <w:b/>
-                <w:color w:val="000000"/>
-                <w:sz w:val="24"/>
-              </w:rPr>
-              <w:t>Sistema</w:t>
-            </w:r>
-          </w:p>
-        </w:tc>
-        <w:tc>
-          <w:tcPr>
-            <w:tcW w:type="dxa" w:w="4248"/>
-            <w:vAlign w:val="center"/>
-            <w:tcBorders>
-              <w:top w:val="single" w:sz="4" w:color="D9D9D9"/>
-              <w:left w:val="single" w:sz="4" w:color="D9D9D9"/>
-              <w:bottom w:val="single" w:sz="4" w:color="D9D9D9"/>
-              <w:right w:val="single" w:sz="4" w:color="D9D9D9"/>
-            </w:tcBorders>
-            <w:tcMar>
-              <w:top w:w="80" w:type="dxa"/>
-              <w:bottom w:w="80" w:type="dxa"/>
-              <w:left w:w="100" w:type="dxa"/>
-              <w:right w:w="100" w:type="dxa"/>
-            </w:tcMar>
-            <w:shd w:fill="E6E6E6"/>
-          </w:tcPr>
-          <w:p>
-            <w:pPr>
-              <w:keepNext/>
-              <w:spacing w:line="252" w:lineRule="auto" w:after="20"/>
-              <w:jc w:val="left"/>
-            </w:pPr>
-            <w:r>
-              <w:rPr>
-                <w:rFonts w:ascii="Times New Roman" w:hAnsi="Times New Roman" w:eastAsia="Times New Roman" w:cs="Times New Roman"/>
-                <w:b/>
-                <w:color w:val="000000"/>
-                <w:sz w:val="24"/>
-              </w:rPr>
-              <w:t>Acción principal</w:t>
-            </w:r>
-          </w:p>
-        </w:tc>
-        <w:tc>
-          <w:tcPr>
-            <w:tcW w:type="dxa" w:w="3240"/>
-            <w:vAlign w:val="center"/>
-            <w:tcBorders>
-              <w:top w:val="single" w:sz="4" w:color="D9D9D9"/>
-              <w:left w:val="single" w:sz="4" w:color="D9D9D9"/>
-              <w:bottom w:val="single" w:sz="4" w:color="D9D9D9"/>
-              <w:right w:val="single" w:sz="4" w:color="D9D9D9"/>
-            </w:tcBorders>
-            <w:tcMar>
-              <w:top w:w="80" w:type="dxa"/>
-              <w:bottom w:w="80" w:type="dxa"/>
-              <w:left w:w="100" w:type="dxa"/>
-              <w:right w:w="100" w:type="dxa"/>
-            </w:tcMar>
-            <w:shd w:fill="E6E6E6"/>
-          </w:tcPr>
-          <w:p>
-            <w:pPr>
-              <w:keepNext/>
-              <w:spacing w:line="252" w:lineRule="auto" w:after="20"/>
-              <w:jc w:val="left"/>
-            </w:pPr>
-            <w:r>
-              <w:rPr>
-                <w:rFonts w:ascii="Times New Roman" w:hAnsi="Times New Roman" w:eastAsia="Times New Roman" w:cs="Times New Roman"/>
-                <w:b/>
-                <w:color w:val="000000"/>
-                <w:sz w:val="24"/>
-              </w:rPr>
-              <w:t>Tiempo orientativo</w:t>
-            </w:r>
-          </w:p>
-        </w:tc>
-      </w:tr>
-      <w:tr>
-        <w:trPr>
-          <w:cantSplit/>
-        </w:trPr>
-        <w:tc>
-          <w:tcPr>
-            <w:tcW w:type="dxa" w:w="1872"/>
-            <w:vAlign w:val="center"/>
-            <w:tcBorders>
-              <w:top w:val="single" w:sz="4" w:color="D9D9D9"/>
-              <w:left w:val="single" w:sz="4" w:color="D9D9D9"/>
-              <w:bottom w:val="single" w:sz="4" w:color="D9D9D9"/>
-              <w:right w:val="single" w:sz="4" w:color="D9D9D9"/>
-            </w:tcBorders>
-            <w:tcMar>
-              <w:top w:w="80" w:type="dxa"/>
-              <w:bottom w:w="80" w:type="dxa"/>
-              <w:left w:w="100" w:type="dxa"/>
-              <w:right w:w="100" w:type="dxa"/>
-            </w:tcMar>
-          </w:tcPr>
-          <w:p>
-            <w:pPr>
-              <w:keepNext/>
-              <w:spacing w:line="252" w:lineRule="auto" w:after="20"/>
-              <w:jc w:val="left"/>
-            </w:pPr>
-            <w:r>
-              <w:rPr>
-                <w:rFonts w:ascii="Times New Roman" w:hAnsi="Times New Roman" w:eastAsia="Times New Roman" w:cs="Times New Roman"/>
-                <w:b w:val="0"/>
-                <w:color w:val="000000"/>
-                <w:sz w:val="24"/>
-              </w:rPr>
-              <w:t>Amortiguadores</w:t>
-            </w:r>
-          </w:p>
-        </w:tc>
-        <w:tc>
-          <w:tcPr>
-            <w:tcW w:type="dxa" w:w="4248"/>
-            <w:vAlign w:val="center"/>
-            <w:tcBorders>
-              <w:top w:val="single" w:sz="4" w:color="D9D9D9"/>
-              <w:left w:val="single" w:sz="4" w:color="D9D9D9"/>
-              <w:bottom w:val="single" w:sz="4" w:color="D9D9D9"/>
-              <w:right w:val="single" w:sz="4" w:color="D9D9D9"/>
-            </w:tcBorders>
-            <w:tcMar>
-              <w:top w:w="80" w:type="dxa"/>
-              <w:bottom w:w="80" w:type="dxa"/>
-              <w:left w:w="100" w:type="dxa"/>
-              <w:right w:w="100" w:type="dxa"/>
-            </w:tcMar>
-          </w:tcPr>
-          <w:p>
-            <w:pPr>
-              <w:keepNext/>
-              <w:spacing w:line="252" w:lineRule="auto" w:after="20"/>
-              <w:jc w:val="left"/>
-            </w:pPr>
-            <w:r>
-              <w:rPr>
-                <w:rFonts w:ascii="Times New Roman" w:hAnsi="Times New Roman" w:eastAsia="Times New Roman" w:cs="Times New Roman"/>
-                <w:b w:val="0"/>
-                <w:color w:val="000000"/>
-                <w:sz w:val="24"/>
-              </w:rPr>
-              <w:t>Captan o liberan H⁺ y limitan el cambio inicial del pH.</w:t>
-            </w:r>
-          </w:p>
-        </w:tc>
-        <w:tc>
-          <w:tcPr>
-            <w:tcW w:type="dxa" w:w="3240"/>
-            <w:vAlign w:val="center"/>
-            <w:tcBorders>
-              <w:top w:val="single" w:sz="4" w:color="D9D9D9"/>
-              <w:left w:val="single" w:sz="4" w:color="D9D9D9"/>
-              <w:bottom w:val="single" w:sz="4" w:color="D9D9D9"/>
-              <w:right w:val="single" w:sz="4" w:color="D9D9D9"/>
-            </w:tcBorders>
-            <w:tcMar>
-              <w:top w:w="80" w:type="dxa"/>
-              <w:bottom w:w="80" w:type="dxa"/>
-              <w:left w:w="100" w:type="dxa"/>
-              <w:right w:w="100" w:type="dxa"/>
-            </w:tcMar>
-          </w:tcPr>
-          <w:p>
-            <w:pPr>
-              <w:keepNext/>
-              <w:spacing w:line="252" w:lineRule="auto" w:after="20"/>
-              <w:jc w:val="left"/>
-            </w:pPr>
-            <w:r>
-              <w:rPr>
-                <w:rFonts w:ascii="Times New Roman" w:hAnsi="Times New Roman" w:eastAsia="Times New Roman" w:cs="Times New Roman"/>
-                <w:b w:val="0"/>
-                <w:color w:val="000000"/>
-                <w:sz w:val="24"/>
-              </w:rPr>
-              <w:t>Inmediato; parte de la respuesta celular tarda horas.</w:t>
-            </w:r>
-          </w:p>
-        </w:tc>
-      </w:tr>
-      <w:tr>
-        <w:trPr>
-          <w:cantSplit/>
-        </w:trPr>
-        <w:tc>
-          <w:tcPr>
-            <w:tcW w:type="dxa" w:w="1872"/>
-            <w:vAlign w:val="center"/>
-            <w:tcBorders>
-              <w:top w:val="single" w:sz="4" w:color="D9D9D9"/>
-              <w:left w:val="single" w:sz="4" w:color="D9D9D9"/>
-              <w:bottom w:val="single" w:sz="4" w:color="D9D9D9"/>
-              <w:right w:val="single" w:sz="4" w:color="D9D9D9"/>
-            </w:tcBorders>
-            <w:tcMar>
-              <w:top w:w="80" w:type="dxa"/>
-              <w:bottom w:w="80" w:type="dxa"/>
-              <w:left w:w="100" w:type="dxa"/>
-              <w:right w:w="100" w:type="dxa"/>
-            </w:tcMar>
-          </w:tcPr>
-          <w:p>
-            <w:pPr>
-              <w:keepNext/>
-              <w:spacing w:line="252" w:lineRule="auto" w:after="20"/>
-              <w:jc w:val="left"/>
-            </w:pPr>
-            <w:r>
-              <w:rPr>
-                <w:rFonts w:ascii="Times New Roman" w:hAnsi="Times New Roman" w:eastAsia="Times New Roman" w:cs="Times New Roman"/>
-                <w:b w:val="0"/>
-                <w:color w:val="000000"/>
-                <w:sz w:val="24"/>
-              </w:rPr>
-              <w:t>Pulmones</w:t>
-            </w:r>
-          </w:p>
-        </w:tc>
-        <w:tc>
-          <w:tcPr>
-            <w:tcW w:type="dxa" w:w="4248"/>
-            <w:vAlign w:val="center"/>
-            <w:tcBorders>
-              <w:top w:val="single" w:sz="4" w:color="D9D9D9"/>
-              <w:left w:val="single" w:sz="4" w:color="D9D9D9"/>
-              <w:bottom w:val="single" w:sz="4" w:color="D9D9D9"/>
-              <w:right w:val="single" w:sz="4" w:color="D9D9D9"/>
-            </w:tcBorders>
-            <w:tcMar>
-              <w:top w:w="80" w:type="dxa"/>
-              <w:bottom w:w="80" w:type="dxa"/>
-              <w:left w:w="100" w:type="dxa"/>
-              <w:right w:w="100" w:type="dxa"/>
-            </w:tcMar>
-          </w:tcPr>
-          <w:p>
-            <w:pPr>
-              <w:keepNext/>
-              <w:spacing w:line="252" w:lineRule="auto" w:after="20"/>
-              <w:jc w:val="left"/>
-            </w:pPr>
-            <w:r>
-              <w:rPr>
-                <w:rFonts w:ascii="Times New Roman" w:hAnsi="Times New Roman" w:eastAsia="Times New Roman" w:cs="Times New Roman"/>
-                <w:b w:val="0"/>
-                <w:color w:val="000000"/>
-                <w:sz w:val="24"/>
-              </w:rPr>
-              <w:t>Modifican la ventilación alveolar y la eliminación de CO₂.</w:t>
-            </w:r>
-          </w:p>
-        </w:tc>
-        <w:tc>
-          <w:tcPr>
-            <w:tcW w:type="dxa" w:w="3240"/>
-            <w:vAlign w:val="center"/>
-            <w:tcBorders>
-              <w:top w:val="single" w:sz="4" w:color="D9D9D9"/>
-              <w:left w:val="single" w:sz="4" w:color="D9D9D9"/>
-              <w:bottom w:val="single" w:sz="4" w:color="D9D9D9"/>
-              <w:right w:val="single" w:sz="4" w:color="D9D9D9"/>
-            </w:tcBorders>
-            <w:tcMar>
-              <w:top w:w="80" w:type="dxa"/>
-              <w:bottom w:w="80" w:type="dxa"/>
-              <w:left w:w="100" w:type="dxa"/>
-              <w:right w:w="100" w:type="dxa"/>
-            </w:tcMar>
-          </w:tcPr>
-          <w:p>
-            <w:pPr>
-              <w:keepNext/>
-              <w:spacing w:line="252" w:lineRule="auto" w:after="20"/>
-              <w:jc w:val="left"/>
-            </w:pPr>
-            <w:r>
-              <w:rPr>
-                <w:rFonts w:ascii="Times New Roman" w:hAnsi="Times New Roman" w:eastAsia="Times New Roman" w:cs="Times New Roman"/>
-                <w:b w:val="0"/>
-                <w:color w:val="000000"/>
-                <w:sz w:val="24"/>
-              </w:rPr>
-              <w:t>Minutos a horas.</w:t>
-            </w:r>
-          </w:p>
-        </w:tc>
-      </w:tr>
-      <w:tr>
-        <w:trPr>
-          <w:cantSplit/>
-        </w:trPr>
-        <w:tc>
-          <w:tcPr>
-            <w:tcW w:type="dxa" w:w="1872"/>
-            <w:vAlign w:val="center"/>
-            <w:tcBorders>
-              <w:top w:val="single" w:sz="4" w:color="D9D9D9"/>
-              <w:left w:val="single" w:sz="4" w:color="D9D9D9"/>
-              <w:bottom w:val="single" w:sz="4" w:color="D9D9D9"/>
-              <w:right w:val="single" w:sz="4" w:color="D9D9D9"/>
-            </w:tcBorders>
-            <w:tcMar>
-              <w:top w:w="80" w:type="dxa"/>
-              <w:bottom w:w="80" w:type="dxa"/>
-              <w:left w:w="100" w:type="dxa"/>
-              <w:right w:w="100" w:type="dxa"/>
-            </w:tcMar>
-          </w:tcPr>
-          <w:p>
-            <w:pPr>
-              <w:spacing w:line="252" w:lineRule="auto" w:after="20"/>
-              <w:jc w:val="left"/>
-            </w:pPr>
-            <w:r>
-              <w:rPr>
-                <w:rFonts w:ascii="Times New Roman" w:hAnsi="Times New Roman" w:eastAsia="Times New Roman" w:cs="Times New Roman"/>
-                <w:b w:val="0"/>
-                <w:color w:val="000000"/>
-                <w:sz w:val="24"/>
-              </w:rPr>
-              <w:t>Riñones</w:t>
-            </w:r>
-          </w:p>
-        </w:tc>
-        <w:tc>
-          <w:tcPr>
-            <w:tcW w:type="dxa" w:w="4248"/>
-            <w:vAlign w:val="center"/>
-            <w:tcBorders>
-              <w:top w:val="single" w:sz="4" w:color="D9D9D9"/>
-              <w:left w:val="single" w:sz="4" w:color="D9D9D9"/>
-              <w:bottom w:val="single" w:sz="4" w:color="D9D9D9"/>
-              <w:right w:val="single" w:sz="4" w:color="D9D9D9"/>
-            </w:tcBorders>
-            <w:tcMar>
-              <w:top w:w="80" w:type="dxa"/>
-              <w:bottom w:w="80" w:type="dxa"/>
-              <w:left w:w="100" w:type="dxa"/>
-              <w:right w:w="100" w:type="dxa"/>
-            </w:tcMar>
-          </w:tcPr>
-          <w:p>
-            <w:pPr>
-              <w:spacing w:line="252" w:lineRule="auto" w:after="20"/>
-              <w:jc w:val="left"/>
-            </w:pPr>
-            <w:r>
-              <w:rPr>
-                <w:rFonts w:ascii="Times New Roman" w:hAnsi="Times New Roman" w:eastAsia="Times New Roman" w:cs="Times New Roman"/>
-                <w:b w:val="0"/>
-                <w:color w:val="000000"/>
-                <w:sz w:val="24"/>
-              </w:rPr>
-              <w:t>Recuperan HCO₃⁻ y ajustan la excreción de ácido o base.</w:t>
-            </w:r>
-          </w:p>
-        </w:tc>
-        <w:tc>
-          <w:tcPr>
-            <w:tcW w:type="dxa" w:w="3240"/>
-            <w:vAlign w:val="center"/>
-            <w:tcBorders>
-              <w:top w:val="single" w:sz="4" w:color="D9D9D9"/>
-              <w:left w:val="single" w:sz="4" w:color="D9D9D9"/>
-              <w:bottom w:val="single" w:sz="4" w:color="D9D9D9"/>
-              <w:right w:val="single" w:sz="4" w:color="D9D9D9"/>
-            </w:tcBorders>
-            <w:tcMar>
-              <w:top w:w="80" w:type="dxa"/>
-              <w:bottom w:w="80" w:type="dxa"/>
-              <w:left w:w="100" w:type="dxa"/>
-              <w:right w:w="100" w:type="dxa"/>
-            </w:tcMar>
-          </w:tcPr>
-          <w:p>
-            <w:pPr>
-              <w:spacing w:line="252" w:lineRule="auto" w:after="20"/>
-              <w:jc w:val="left"/>
-            </w:pPr>
-            <w:r>
-              <w:rPr>
-                <w:rFonts w:ascii="Times New Roman" w:hAnsi="Times New Roman" w:eastAsia="Times New Roman" w:cs="Times New Roman"/>
-                <w:b w:val="0"/>
-                <w:color w:val="000000"/>
-                <w:sz w:val="24"/>
-              </w:rPr>
-              <w:t>Inicio en horas; adaptación completa en varios días.</w:t>
-            </w:r>
-          </w:p>
-        </w:tc>
-      </w:tr>
-    </w:tbl>
-    <w:p>
-      <w:pPr>
-        <w:spacing w:after="20"/>
-      </w:pPr>
     </w:p>
     <w:p>
       <w:pPr>
-        <w:pStyle w:val="Heading1"/>
+        <w:pStyle w:val="Heading2"/>
       </w:pPr>
       <w:r>
-        <w:t>5 Trastornos primarios y consecuencias</w:t>
+        <w:t>8.1 Ternero con diarrea</w:t>
       </w:r>
     </w:p>
     <w:p>
@@ -1155,1119 +1788,23 @@
           <w:color w:val="000000"/>
           <w:sz w:val="24"/>
         </w:rPr>
-        <w:t>La clasificación tradicional combina el sentido del cambio del pH con la variable que inicia el trastorno. Las respuestas compensadoras se valoran después de identificar esa alteración primaria. (6)</w:t>
+        <w:t>Un bovino de 12 días presenta diarrea acuosa de 24 horas, menor ingestión de leche y debilidad. Se obtiene sangre venosa yugular al iniciar la evaluación. No se ha identificado el agente causal. Los valores son sintéticos, expresados a 37 °C y seleccionados para el razonamiento; no proceden de una historia clínica ni de resultados publicados.</w:t>
       </w:r>
     </w:p>
     <w:p>
       <w:pPr>
         <w:keepNext/>
-        <w:spacing w:before="100" w:after="180"/>
+        <w:keepLines/>
+        <w:spacing w:before="100" w:after="140" w:line="264" w:lineRule="auto"/>
         <w:jc w:val="left"/>
       </w:pPr>
       <w:r>
         <w:rPr>
           <w:rFonts w:ascii="Times New Roman" w:hAnsi="Times New Roman" w:eastAsia="Times New Roman" w:cs="Times New Roman"/>
           <w:color w:val="000000"/>
-          <w:sz w:val="20"/>
+          <w:sz w:val="21"/>
         </w:rPr>
-        <w:t>Tabla 2. Patrones esperados en trastornos simples. Las flechas indican tendencias respecto del valor basal. Basado en (5,6).</w:t>
-      </w:r>
-    </w:p>
-    <w:tbl>
-      <w:tblPr>
-        <w:tblW w:type="auto" w:w="0"/>
-        <w:jc w:val="center"/>
-        <w:tblLayout w:type="fixed"/>
-        <w:tblLook w:firstColumn="1" w:firstRow="1" w:lastColumn="0" w:lastRow="0" w:noHBand="0" w:noVBand="1" w:val="04A0"/>
-      </w:tblPr>
-      <w:tblGrid>
-        <w:gridCol w:w="2880"/>
-        <w:gridCol w:w="1728"/>
-        <w:gridCol w:w="2160"/>
-        <w:gridCol w:w="2592"/>
-      </w:tblGrid>
-      <w:tr>
-        <w:trPr>
-          <w:cantSplit/>
-          <w:tblHeader/>
-        </w:trPr>
-        <w:tc>
-          <w:tcPr>
-            <w:tcW w:type="dxa" w:w="2880"/>
-            <w:vAlign w:val="center"/>
-            <w:tcBorders>
-              <w:top w:val="single" w:sz="4" w:color="D9D9D9"/>
-              <w:left w:val="single" w:sz="4" w:color="D9D9D9"/>
-              <w:bottom w:val="single" w:sz="4" w:color="D9D9D9"/>
-              <w:right w:val="single" w:sz="4" w:color="D9D9D9"/>
-            </w:tcBorders>
-            <w:tcMar>
-              <w:top w:w="80" w:type="dxa"/>
-              <w:bottom w:w="80" w:type="dxa"/>
-              <w:left w:w="100" w:type="dxa"/>
-              <w:right w:w="100" w:type="dxa"/>
-            </w:tcMar>
-            <w:shd w:fill="E6E6E6"/>
-          </w:tcPr>
-          <w:p>
-            <w:pPr>
-              <w:keepNext/>
-              <w:spacing w:line="252" w:lineRule="auto" w:after="20"/>
-              <w:jc w:val="left"/>
-            </w:pPr>
-            <w:r>
-              <w:rPr>
-                <w:rFonts w:ascii="Times New Roman" w:hAnsi="Times New Roman" w:eastAsia="Times New Roman" w:cs="Times New Roman"/>
-                <w:b/>
-                <w:color w:val="000000"/>
-                <w:sz w:val="24"/>
-              </w:rPr>
-              <w:t>Trastorno</w:t>
-            </w:r>
-          </w:p>
-        </w:tc>
-        <w:tc>
-          <w:tcPr>
-            <w:tcW w:type="dxa" w:w="1728"/>
-            <w:vAlign w:val="center"/>
-            <w:tcBorders>
-              <w:top w:val="single" w:sz="4" w:color="D9D9D9"/>
-              <w:left w:val="single" w:sz="4" w:color="D9D9D9"/>
-              <w:bottom w:val="single" w:sz="4" w:color="D9D9D9"/>
-              <w:right w:val="single" w:sz="4" w:color="D9D9D9"/>
-            </w:tcBorders>
-            <w:tcMar>
-              <w:top w:w="80" w:type="dxa"/>
-              <w:bottom w:w="80" w:type="dxa"/>
-              <w:left w:w="100" w:type="dxa"/>
-              <w:right w:w="100" w:type="dxa"/>
-            </w:tcMar>
-            <w:shd w:fill="E6E6E6"/>
-          </w:tcPr>
-          <w:p>
-            <w:pPr>
-              <w:keepNext/>
-              <w:spacing w:line="252" w:lineRule="auto" w:after="20"/>
-              <w:jc w:val="left"/>
-            </w:pPr>
-            <w:r>
-              <w:rPr>
-                <w:rFonts w:ascii="Times New Roman" w:hAnsi="Times New Roman" w:eastAsia="Times New Roman" w:cs="Times New Roman"/>
-                <w:b/>
-                <w:color w:val="000000"/>
-                <w:sz w:val="24"/>
-              </w:rPr>
-              <w:t>Tendencia del pH</w:t>
-            </w:r>
-          </w:p>
-        </w:tc>
-        <w:tc>
-          <w:tcPr>
-            <w:tcW w:type="dxa" w:w="2160"/>
-            <w:vAlign w:val="center"/>
-            <w:tcBorders>
-              <w:top w:val="single" w:sz="4" w:color="D9D9D9"/>
-              <w:left w:val="single" w:sz="4" w:color="D9D9D9"/>
-              <w:bottom w:val="single" w:sz="4" w:color="D9D9D9"/>
-              <w:right w:val="single" w:sz="4" w:color="D9D9D9"/>
-            </w:tcBorders>
-            <w:tcMar>
-              <w:top w:w="80" w:type="dxa"/>
-              <w:bottom w:w="80" w:type="dxa"/>
-              <w:left w:w="100" w:type="dxa"/>
-              <w:right w:w="100" w:type="dxa"/>
-            </w:tcMar>
-            <w:shd w:fill="E6E6E6"/>
-          </w:tcPr>
-          <w:p>
-            <w:pPr>
-              <w:keepNext/>
-              <w:spacing w:line="252" w:lineRule="auto" w:after="20"/>
-              <w:jc w:val="left"/>
-            </w:pPr>
-            <w:r>
-              <w:rPr>
-                <w:rFonts w:ascii="Times New Roman" w:hAnsi="Times New Roman" w:eastAsia="Times New Roman" w:cs="Times New Roman"/>
-                <w:b/>
-                <w:color w:val="000000"/>
-                <w:sz w:val="24"/>
-              </w:rPr>
-              <w:t>Cambio primario</w:t>
-            </w:r>
-          </w:p>
-        </w:tc>
-        <w:tc>
-          <w:tcPr>
-            <w:tcW w:type="dxa" w:w="2592"/>
-            <w:vAlign w:val="center"/>
-            <w:tcBorders>
-              <w:top w:val="single" w:sz="4" w:color="D9D9D9"/>
-              <w:left w:val="single" w:sz="4" w:color="D9D9D9"/>
-              <w:bottom w:val="single" w:sz="4" w:color="D9D9D9"/>
-              <w:right w:val="single" w:sz="4" w:color="D9D9D9"/>
-            </w:tcBorders>
-            <w:tcMar>
-              <w:top w:w="80" w:type="dxa"/>
-              <w:bottom w:w="80" w:type="dxa"/>
-              <w:left w:w="100" w:type="dxa"/>
-              <w:right w:w="100" w:type="dxa"/>
-            </w:tcMar>
-            <w:shd w:fill="E6E6E6"/>
-          </w:tcPr>
-          <w:p>
-            <w:pPr>
-              <w:keepNext/>
-              <w:spacing w:line="252" w:lineRule="auto" w:after="20"/>
-              <w:jc w:val="left"/>
-            </w:pPr>
-            <w:r>
-              <w:rPr>
-                <w:rFonts w:ascii="Times New Roman" w:hAnsi="Times New Roman" w:eastAsia="Times New Roman" w:cs="Times New Roman"/>
-                <w:b/>
-                <w:color w:val="000000"/>
-                <w:sz w:val="24"/>
-              </w:rPr>
-              <w:t>Respuesta esperada</w:t>
-            </w:r>
-          </w:p>
-        </w:tc>
-      </w:tr>
-      <w:tr>
-        <w:trPr>
-          <w:cantSplit/>
-        </w:trPr>
-        <w:tc>
-          <w:tcPr>
-            <w:tcW w:type="dxa" w:w="2880"/>
-            <w:vAlign w:val="center"/>
-            <w:tcBorders>
-              <w:top w:val="single" w:sz="4" w:color="D9D9D9"/>
-              <w:left w:val="single" w:sz="4" w:color="D9D9D9"/>
-              <w:bottom w:val="single" w:sz="4" w:color="D9D9D9"/>
-              <w:right w:val="single" w:sz="4" w:color="D9D9D9"/>
-            </w:tcBorders>
-            <w:tcMar>
-              <w:top w:w="80" w:type="dxa"/>
-              <w:bottom w:w="80" w:type="dxa"/>
-              <w:left w:w="100" w:type="dxa"/>
-              <w:right w:w="100" w:type="dxa"/>
-            </w:tcMar>
-          </w:tcPr>
-          <w:p>
-            <w:pPr>
-              <w:keepNext/>
-              <w:spacing w:line="252" w:lineRule="auto" w:after="20"/>
-              <w:jc w:val="left"/>
-            </w:pPr>
-            <w:r>
-              <w:rPr>
-                <w:rFonts w:ascii="Times New Roman" w:hAnsi="Times New Roman" w:eastAsia="Times New Roman" w:cs="Times New Roman"/>
-                <w:b w:val="0"/>
-                <w:color w:val="000000"/>
-                <w:sz w:val="24"/>
-              </w:rPr>
-              <w:t>Acidosis metabólica</w:t>
-            </w:r>
-          </w:p>
-        </w:tc>
-        <w:tc>
-          <w:tcPr>
-            <w:tcW w:type="dxa" w:w="1728"/>
-            <w:vAlign w:val="center"/>
-            <w:tcBorders>
-              <w:top w:val="single" w:sz="4" w:color="D9D9D9"/>
-              <w:left w:val="single" w:sz="4" w:color="D9D9D9"/>
-              <w:bottom w:val="single" w:sz="4" w:color="D9D9D9"/>
-              <w:right w:val="single" w:sz="4" w:color="D9D9D9"/>
-            </w:tcBorders>
-            <w:tcMar>
-              <w:top w:w="80" w:type="dxa"/>
-              <w:bottom w:w="80" w:type="dxa"/>
-              <w:left w:w="100" w:type="dxa"/>
-              <w:right w:w="100" w:type="dxa"/>
-            </w:tcMar>
-          </w:tcPr>
-          <w:p>
-            <w:pPr>
-              <w:keepNext/>
-              <w:spacing w:line="252" w:lineRule="auto" w:after="20"/>
-              <w:jc w:val="left"/>
-            </w:pPr>
-            <w:r>
-              <w:rPr>
-                <w:rFonts w:ascii="Times New Roman" w:hAnsi="Times New Roman" w:eastAsia="Times New Roman" w:cs="Times New Roman"/>
-                <w:b w:val="0"/>
-                <w:color w:val="000000"/>
-                <w:sz w:val="24"/>
-              </w:rPr>
-              <w:t>↓</w:t>
-            </w:r>
-          </w:p>
-        </w:tc>
-        <w:tc>
-          <w:tcPr>
-            <w:tcW w:type="dxa" w:w="2160"/>
-            <w:vAlign w:val="center"/>
-            <w:tcBorders>
-              <w:top w:val="single" w:sz="4" w:color="D9D9D9"/>
-              <w:left w:val="single" w:sz="4" w:color="D9D9D9"/>
-              <w:bottom w:val="single" w:sz="4" w:color="D9D9D9"/>
-              <w:right w:val="single" w:sz="4" w:color="D9D9D9"/>
-            </w:tcBorders>
-            <w:tcMar>
-              <w:top w:w="80" w:type="dxa"/>
-              <w:bottom w:w="80" w:type="dxa"/>
-              <w:left w:w="100" w:type="dxa"/>
-              <w:right w:w="100" w:type="dxa"/>
-            </w:tcMar>
-          </w:tcPr>
-          <w:p>
-            <w:pPr>
-              <w:keepNext/>
-              <w:spacing w:line="252" w:lineRule="auto" w:after="20"/>
-              <w:jc w:val="left"/>
-            </w:pPr>
-            <w:r>
-              <w:rPr>
-                <w:rFonts w:ascii="Times New Roman" w:hAnsi="Times New Roman" w:eastAsia="Times New Roman" w:cs="Times New Roman"/>
-                <w:b w:val="0"/>
-                <w:color w:val="000000"/>
-                <w:sz w:val="24"/>
-              </w:rPr>
-              <w:t>HCO₃⁻ ↓</w:t>
-            </w:r>
-          </w:p>
-        </w:tc>
-        <w:tc>
-          <w:tcPr>
-            <w:tcW w:type="dxa" w:w="2592"/>
-            <w:vAlign w:val="center"/>
-            <w:tcBorders>
-              <w:top w:val="single" w:sz="4" w:color="D9D9D9"/>
-              <w:left w:val="single" w:sz="4" w:color="D9D9D9"/>
-              <w:bottom w:val="single" w:sz="4" w:color="D9D9D9"/>
-              <w:right w:val="single" w:sz="4" w:color="D9D9D9"/>
-            </w:tcBorders>
-            <w:tcMar>
-              <w:top w:w="80" w:type="dxa"/>
-              <w:bottom w:w="80" w:type="dxa"/>
-              <w:left w:w="100" w:type="dxa"/>
-              <w:right w:w="100" w:type="dxa"/>
-            </w:tcMar>
-          </w:tcPr>
-          <w:p>
-            <w:pPr>
-              <w:keepNext/>
-              <w:spacing w:line="252" w:lineRule="auto" w:after="20"/>
-              <w:jc w:val="left"/>
-            </w:pPr>
-            <w:r>
-              <w:rPr>
-                <w:rFonts w:ascii="Times New Roman" w:hAnsi="Times New Roman" w:eastAsia="Times New Roman" w:cs="Times New Roman"/>
-                <w:b w:val="0"/>
-                <w:color w:val="000000"/>
-                <w:sz w:val="24"/>
-              </w:rPr>
-              <w:t>PCO₂ ↓</w:t>
-            </w:r>
-          </w:p>
-        </w:tc>
-      </w:tr>
-      <w:tr>
-        <w:trPr>
-          <w:cantSplit/>
-        </w:trPr>
-        <w:tc>
-          <w:tcPr>
-            <w:tcW w:type="dxa" w:w="2880"/>
-            <w:vAlign w:val="center"/>
-            <w:tcBorders>
-              <w:top w:val="single" w:sz="4" w:color="D9D9D9"/>
-              <w:left w:val="single" w:sz="4" w:color="D9D9D9"/>
-              <w:bottom w:val="single" w:sz="4" w:color="D9D9D9"/>
-              <w:right w:val="single" w:sz="4" w:color="D9D9D9"/>
-            </w:tcBorders>
-            <w:tcMar>
-              <w:top w:w="80" w:type="dxa"/>
-              <w:bottom w:w="80" w:type="dxa"/>
-              <w:left w:w="100" w:type="dxa"/>
-              <w:right w:w="100" w:type="dxa"/>
-            </w:tcMar>
-          </w:tcPr>
-          <w:p>
-            <w:pPr>
-              <w:keepNext/>
-              <w:spacing w:line="252" w:lineRule="auto" w:after="20"/>
-              <w:jc w:val="left"/>
-            </w:pPr>
-            <w:r>
-              <w:rPr>
-                <w:rFonts w:ascii="Times New Roman" w:hAnsi="Times New Roman" w:eastAsia="Times New Roman" w:cs="Times New Roman"/>
-                <w:b w:val="0"/>
-                <w:color w:val="000000"/>
-                <w:sz w:val="24"/>
-              </w:rPr>
-              <w:t>Alcalosis metabólica</w:t>
-            </w:r>
-          </w:p>
-        </w:tc>
-        <w:tc>
-          <w:tcPr>
-            <w:tcW w:type="dxa" w:w="1728"/>
-            <w:vAlign w:val="center"/>
-            <w:tcBorders>
-              <w:top w:val="single" w:sz="4" w:color="D9D9D9"/>
-              <w:left w:val="single" w:sz="4" w:color="D9D9D9"/>
-              <w:bottom w:val="single" w:sz="4" w:color="D9D9D9"/>
-              <w:right w:val="single" w:sz="4" w:color="D9D9D9"/>
-            </w:tcBorders>
-            <w:tcMar>
-              <w:top w:w="80" w:type="dxa"/>
-              <w:bottom w:w="80" w:type="dxa"/>
-              <w:left w:w="100" w:type="dxa"/>
-              <w:right w:w="100" w:type="dxa"/>
-            </w:tcMar>
-          </w:tcPr>
-          <w:p>
-            <w:pPr>
-              <w:keepNext/>
-              <w:spacing w:line="252" w:lineRule="auto" w:after="20"/>
-              <w:jc w:val="left"/>
-            </w:pPr>
-            <w:r>
-              <w:rPr>
-                <w:rFonts w:ascii="Times New Roman" w:hAnsi="Times New Roman" w:eastAsia="Times New Roman" w:cs="Times New Roman"/>
-                <w:b w:val="0"/>
-                <w:color w:val="000000"/>
-                <w:sz w:val="24"/>
-              </w:rPr>
-              <w:t>↑</w:t>
-            </w:r>
-          </w:p>
-        </w:tc>
-        <w:tc>
-          <w:tcPr>
-            <w:tcW w:type="dxa" w:w="2160"/>
-            <w:vAlign w:val="center"/>
-            <w:tcBorders>
-              <w:top w:val="single" w:sz="4" w:color="D9D9D9"/>
-              <w:left w:val="single" w:sz="4" w:color="D9D9D9"/>
-              <w:bottom w:val="single" w:sz="4" w:color="D9D9D9"/>
-              <w:right w:val="single" w:sz="4" w:color="D9D9D9"/>
-            </w:tcBorders>
-            <w:tcMar>
-              <w:top w:w="80" w:type="dxa"/>
-              <w:bottom w:w="80" w:type="dxa"/>
-              <w:left w:w="100" w:type="dxa"/>
-              <w:right w:w="100" w:type="dxa"/>
-            </w:tcMar>
-          </w:tcPr>
-          <w:p>
-            <w:pPr>
-              <w:keepNext/>
-              <w:spacing w:line="252" w:lineRule="auto" w:after="20"/>
-              <w:jc w:val="left"/>
-            </w:pPr>
-            <w:r>
-              <w:rPr>
-                <w:rFonts w:ascii="Times New Roman" w:hAnsi="Times New Roman" w:eastAsia="Times New Roman" w:cs="Times New Roman"/>
-                <w:b w:val="0"/>
-                <w:color w:val="000000"/>
-                <w:sz w:val="24"/>
-              </w:rPr>
-              <w:t>HCO₃⁻ ↑</w:t>
-            </w:r>
-          </w:p>
-        </w:tc>
-        <w:tc>
-          <w:tcPr>
-            <w:tcW w:type="dxa" w:w="2592"/>
-            <w:vAlign w:val="center"/>
-            <w:tcBorders>
-              <w:top w:val="single" w:sz="4" w:color="D9D9D9"/>
-              <w:left w:val="single" w:sz="4" w:color="D9D9D9"/>
-              <w:bottom w:val="single" w:sz="4" w:color="D9D9D9"/>
-              <w:right w:val="single" w:sz="4" w:color="D9D9D9"/>
-            </w:tcBorders>
-            <w:tcMar>
-              <w:top w:w="80" w:type="dxa"/>
-              <w:bottom w:w="80" w:type="dxa"/>
-              <w:left w:w="100" w:type="dxa"/>
-              <w:right w:w="100" w:type="dxa"/>
-            </w:tcMar>
-          </w:tcPr>
-          <w:p>
-            <w:pPr>
-              <w:keepNext/>
-              <w:spacing w:line="252" w:lineRule="auto" w:after="20"/>
-              <w:jc w:val="left"/>
-            </w:pPr>
-            <w:r>
-              <w:rPr>
-                <w:rFonts w:ascii="Times New Roman" w:hAnsi="Times New Roman" w:eastAsia="Times New Roman" w:cs="Times New Roman"/>
-                <w:b w:val="0"/>
-                <w:color w:val="000000"/>
-                <w:sz w:val="24"/>
-              </w:rPr>
-              <w:t>PCO₂ ↑</w:t>
-            </w:r>
-          </w:p>
-        </w:tc>
-      </w:tr>
-      <w:tr>
-        <w:trPr>
-          <w:cantSplit/>
-        </w:trPr>
-        <w:tc>
-          <w:tcPr>
-            <w:tcW w:type="dxa" w:w="2880"/>
-            <w:vAlign w:val="center"/>
-            <w:tcBorders>
-              <w:top w:val="single" w:sz="4" w:color="D9D9D9"/>
-              <w:left w:val="single" w:sz="4" w:color="D9D9D9"/>
-              <w:bottom w:val="single" w:sz="4" w:color="D9D9D9"/>
-              <w:right w:val="single" w:sz="4" w:color="D9D9D9"/>
-            </w:tcBorders>
-            <w:tcMar>
-              <w:top w:w="80" w:type="dxa"/>
-              <w:bottom w:w="80" w:type="dxa"/>
-              <w:left w:w="100" w:type="dxa"/>
-              <w:right w:w="100" w:type="dxa"/>
-            </w:tcMar>
-          </w:tcPr>
-          <w:p>
-            <w:pPr>
-              <w:keepNext/>
-              <w:spacing w:line="252" w:lineRule="auto" w:after="20"/>
-              <w:jc w:val="left"/>
-            </w:pPr>
-            <w:r>
-              <w:rPr>
-                <w:rFonts w:ascii="Times New Roman" w:hAnsi="Times New Roman" w:eastAsia="Times New Roman" w:cs="Times New Roman"/>
-                <w:b w:val="0"/>
-                <w:color w:val="000000"/>
-                <w:sz w:val="24"/>
-              </w:rPr>
-              <w:t>Acidosis respiratoria</w:t>
-            </w:r>
-          </w:p>
-        </w:tc>
-        <w:tc>
-          <w:tcPr>
-            <w:tcW w:type="dxa" w:w="1728"/>
-            <w:vAlign w:val="center"/>
-            <w:tcBorders>
-              <w:top w:val="single" w:sz="4" w:color="D9D9D9"/>
-              <w:left w:val="single" w:sz="4" w:color="D9D9D9"/>
-              <w:bottom w:val="single" w:sz="4" w:color="D9D9D9"/>
-              <w:right w:val="single" w:sz="4" w:color="D9D9D9"/>
-            </w:tcBorders>
-            <w:tcMar>
-              <w:top w:w="80" w:type="dxa"/>
-              <w:bottom w:w="80" w:type="dxa"/>
-              <w:left w:w="100" w:type="dxa"/>
-              <w:right w:w="100" w:type="dxa"/>
-            </w:tcMar>
-          </w:tcPr>
-          <w:p>
-            <w:pPr>
-              <w:keepNext/>
-              <w:spacing w:line="252" w:lineRule="auto" w:after="20"/>
-              <w:jc w:val="left"/>
-            </w:pPr>
-            <w:r>
-              <w:rPr>
-                <w:rFonts w:ascii="Times New Roman" w:hAnsi="Times New Roman" w:eastAsia="Times New Roman" w:cs="Times New Roman"/>
-                <w:b w:val="0"/>
-                <w:color w:val="000000"/>
-                <w:sz w:val="24"/>
-              </w:rPr>
-              <w:t>↓</w:t>
-            </w:r>
-          </w:p>
-        </w:tc>
-        <w:tc>
-          <w:tcPr>
-            <w:tcW w:type="dxa" w:w="2160"/>
-            <w:vAlign w:val="center"/>
-            <w:tcBorders>
-              <w:top w:val="single" w:sz="4" w:color="D9D9D9"/>
-              <w:left w:val="single" w:sz="4" w:color="D9D9D9"/>
-              <w:bottom w:val="single" w:sz="4" w:color="D9D9D9"/>
-              <w:right w:val="single" w:sz="4" w:color="D9D9D9"/>
-            </w:tcBorders>
-            <w:tcMar>
-              <w:top w:w="80" w:type="dxa"/>
-              <w:bottom w:w="80" w:type="dxa"/>
-              <w:left w:w="100" w:type="dxa"/>
-              <w:right w:w="100" w:type="dxa"/>
-            </w:tcMar>
-          </w:tcPr>
-          <w:p>
-            <w:pPr>
-              <w:keepNext/>
-              <w:spacing w:line="252" w:lineRule="auto" w:after="20"/>
-              <w:jc w:val="left"/>
-            </w:pPr>
-            <w:r>
-              <w:rPr>
-                <w:rFonts w:ascii="Times New Roman" w:hAnsi="Times New Roman" w:eastAsia="Times New Roman" w:cs="Times New Roman"/>
-                <w:b w:val="0"/>
-                <w:color w:val="000000"/>
-                <w:sz w:val="24"/>
-              </w:rPr>
-              <w:t>PCO₂ ↑</w:t>
-            </w:r>
-          </w:p>
-        </w:tc>
-        <w:tc>
-          <w:tcPr>
-            <w:tcW w:type="dxa" w:w="2592"/>
-            <w:vAlign w:val="center"/>
-            <w:tcBorders>
-              <w:top w:val="single" w:sz="4" w:color="D9D9D9"/>
-              <w:left w:val="single" w:sz="4" w:color="D9D9D9"/>
-              <w:bottom w:val="single" w:sz="4" w:color="D9D9D9"/>
-              <w:right w:val="single" w:sz="4" w:color="D9D9D9"/>
-            </w:tcBorders>
-            <w:tcMar>
-              <w:top w:w="80" w:type="dxa"/>
-              <w:bottom w:w="80" w:type="dxa"/>
-              <w:left w:w="100" w:type="dxa"/>
-              <w:right w:w="100" w:type="dxa"/>
-            </w:tcMar>
-          </w:tcPr>
-          <w:p>
-            <w:pPr>
-              <w:keepNext/>
-              <w:spacing w:line="252" w:lineRule="auto" w:after="20"/>
-              <w:jc w:val="left"/>
-            </w:pPr>
-            <w:r>
-              <w:rPr>
-                <w:rFonts w:ascii="Times New Roman" w:hAnsi="Times New Roman" w:eastAsia="Times New Roman" w:cs="Times New Roman"/>
-                <w:b w:val="0"/>
-                <w:color w:val="000000"/>
-                <w:sz w:val="24"/>
-              </w:rPr>
-              <w:t>HCO₃⁻ ↑</w:t>
-            </w:r>
-          </w:p>
-        </w:tc>
-      </w:tr>
-      <w:tr>
-        <w:trPr>
-          <w:cantSplit/>
-        </w:trPr>
-        <w:tc>
-          <w:tcPr>
-            <w:tcW w:type="dxa" w:w="2880"/>
-            <w:vAlign w:val="center"/>
-            <w:tcBorders>
-              <w:top w:val="single" w:sz="4" w:color="D9D9D9"/>
-              <w:left w:val="single" w:sz="4" w:color="D9D9D9"/>
-              <w:bottom w:val="single" w:sz="4" w:color="D9D9D9"/>
-              <w:right w:val="single" w:sz="4" w:color="D9D9D9"/>
-            </w:tcBorders>
-            <w:tcMar>
-              <w:top w:w="80" w:type="dxa"/>
-              <w:bottom w:w="80" w:type="dxa"/>
-              <w:left w:w="100" w:type="dxa"/>
-              <w:right w:w="100" w:type="dxa"/>
-            </w:tcMar>
-          </w:tcPr>
-          <w:p>
-            <w:pPr>
-              <w:spacing w:line="252" w:lineRule="auto" w:after="20"/>
-              <w:jc w:val="left"/>
-            </w:pPr>
-            <w:r>
-              <w:rPr>
-                <w:rFonts w:ascii="Times New Roman" w:hAnsi="Times New Roman" w:eastAsia="Times New Roman" w:cs="Times New Roman"/>
-                <w:b w:val="0"/>
-                <w:color w:val="000000"/>
-                <w:sz w:val="24"/>
-              </w:rPr>
-              <w:t>Alcalosis respiratoria</w:t>
-            </w:r>
-          </w:p>
-        </w:tc>
-        <w:tc>
-          <w:tcPr>
-            <w:tcW w:type="dxa" w:w="1728"/>
-            <w:vAlign w:val="center"/>
-            <w:tcBorders>
-              <w:top w:val="single" w:sz="4" w:color="D9D9D9"/>
-              <w:left w:val="single" w:sz="4" w:color="D9D9D9"/>
-              <w:bottom w:val="single" w:sz="4" w:color="D9D9D9"/>
-              <w:right w:val="single" w:sz="4" w:color="D9D9D9"/>
-            </w:tcBorders>
-            <w:tcMar>
-              <w:top w:w="80" w:type="dxa"/>
-              <w:bottom w:w="80" w:type="dxa"/>
-              <w:left w:w="100" w:type="dxa"/>
-              <w:right w:w="100" w:type="dxa"/>
-            </w:tcMar>
-          </w:tcPr>
-          <w:p>
-            <w:pPr>
-              <w:spacing w:line="252" w:lineRule="auto" w:after="20"/>
-              <w:jc w:val="left"/>
-            </w:pPr>
-            <w:r>
-              <w:rPr>
-                <w:rFonts w:ascii="Times New Roman" w:hAnsi="Times New Roman" w:eastAsia="Times New Roman" w:cs="Times New Roman"/>
-                <w:b w:val="0"/>
-                <w:color w:val="000000"/>
-                <w:sz w:val="24"/>
-              </w:rPr>
-              <w:t>↑</w:t>
-            </w:r>
-          </w:p>
-        </w:tc>
-        <w:tc>
-          <w:tcPr>
-            <w:tcW w:type="dxa" w:w="2160"/>
-            <w:vAlign w:val="center"/>
-            <w:tcBorders>
-              <w:top w:val="single" w:sz="4" w:color="D9D9D9"/>
-              <w:left w:val="single" w:sz="4" w:color="D9D9D9"/>
-              <w:bottom w:val="single" w:sz="4" w:color="D9D9D9"/>
-              <w:right w:val="single" w:sz="4" w:color="D9D9D9"/>
-            </w:tcBorders>
-            <w:tcMar>
-              <w:top w:w="80" w:type="dxa"/>
-              <w:bottom w:w="80" w:type="dxa"/>
-              <w:left w:w="100" w:type="dxa"/>
-              <w:right w:w="100" w:type="dxa"/>
-            </w:tcMar>
-          </w:tcPr>
-          <w:p>
-            <w:pPr>
-              <w:spacing w:line="252" w:lineRule="auto" w:after="20"/>
-              <w:jc w:val="left"/>
-            </w:pPr>
-            <w:r>
-              <w:rPr>
-                <w:rFonts w:ascii="Times New Roman" w:hAnsi="Times New Roman" w:eastAsia="Times New Roman" w:cs="Times New Roman"/>
-                <w:b w:val="0"/>
-                <w:color w:val="000000"/>
-                <w:sz w:val="24"/>
-              </w:rPr>
-              <w:t>PCO₂ ↓</w:t>
-            </w:r>
-          </w:p>
-        </w:tc>
-        <w:tc>
-          <w:tcPr>
-            <w:tcW w:type="dxa" w:w="2592"/>
-            <w:vAlign w:val="center"/>
-            <w:tcBorders>
-              <w:top w:val="single" w:sz="4" w:color="D9D9D9"/>
-              <w:left w:val="single" w:sz="4" w:color="D9D9D9"/>
-              <w:bottom w:val="single" w:sz="4" w:color="D9D9D9"/>
-              <w:right w:val="single" w:sz="4" w:color="D9D9D9"/>
-            </w:tcBorders>
-            <w:tcMar>
-              <w:top w:w="80" w:type="dxa"/>
-              <w:bottom w:w="80" w:type="dxa"/>
-              <w:left w:w="100" w:type="dxa"/>
-              <w:right w:w="100" w:type="dxa"/>
-            </w:tcMar>
-          </w:tcPr>
-          <w:p>
-            <w:pPr>
-              <w:spacing w:line="252" w:lineRule="auto" w:after="20"/>
-              <w:jc w:val="left"/>
-            </w:pPr>
-            <w:r>
-              <w:rPr>
-                <w:rFonts w:ascii="Times New Roman" w:hAnsi="Times New Roman" w:eastAsia="Times New Roman" w:cs="Times New Roman"/>
-                <w:b w:val="0"/>
-                <w:color w:val="000000"/>
-                <w:sz w:val="24"/>
-              </w:rPr>
-              <w:t>HCO₃⁻ ↓</w:t>
-            </w:r>
-          </w:p>
-        </w:tc>
-      </w:tr>
-    </w:tbl>
-    <w:p>
-      <w:pPr>
-        <w:spacing w:after="20"/>
-      </w:pPr>
-    </w:p>
-    <w:p>
-      <w:pPr>
-        <w:pStyle w:val="Heading2"/>
-      </w:pPr>
-      <w:r>
-        <w:t>5.1 Acidosis metabólica</w:t>
-      </w:r>
-    </w:p>
-    <w:p>
-      <w:r>
-        <w:rPr>
-          <w:rFonts w:ascii="Times New Roman" w:hAnsi="Times New Roman" w:eastAsia="Times New Roman" w:cs="Times New Roman"/>
-          <w:color w:val="000000"/>
-          <w:sz w:val="24"/>
-        </w:rPr>
-        <w:t>Aparece por acumulación de ácidos, eliminación insuficiente de estos o pérdida de bicarbonato. La producción o retención de ácidos orgánicos consume bicarbonato durante la amortiguación. Entre los contextos relevantes están la hipoperfusión, la cetoacidosis y la enfermedad renal avanzada. La pérdida gastrointestinal o renal de bicarbonato puede acompañarse de aumento relativo de cloruro. Un HCO₃⁻ bajo también puede reflejar compensación de una alcalosis respiratoria, por lo que debe interpretarse junto con pH y PCO₂. (6,7)</w:t>
-      </w:r>
-    </w:p>
-    <w:p>
-      <w:pPr>
-        <w:pStyle w:val="Heading2"/>
-      </w:pPr>
-      <w:r>
-        <w:t>5.2 Alcalosis metabólica</w:t>
-      </w:r>
-    </w:p>
-    <w:p>
-      <w:r>
-        <w:rPr>
-          <w:rFonts w:ascii="Times New Roman" w:hAnsi="Times New Roman" w:eastAsia="Times New Roman" w:cs="Times New Roman"/>
-          <w:color w:val="000000"/>
-          <w:sz w:val="24"/>
-        </w:rPr>
-        <w:t>La pérdida de contenido gástrico rico en HCl o su secuestro digestivo favorecen el aumento de bicarbonato. La hipovolemia, la depleción de cloruro y de potasio pueden mantener el trastorno al limitar la excreción renal de bicarbonato. En este contexto puede aparecer aciduria paradójica: orina ácida pese a alcalosis sistémica, porque el riñón prioriza conservar sodio y volumen mientras continúa excretando H⁺. (4,7)</w:t>
-      </w:r>
-    </w:p>
-    <w:p>
-      <w:pPr>
-        <w:pStyle w:val="Heading2"/>
-      </w:pPr>
-      <w:r>
-        <w:t>5.3 Acidosis respiratoria</w:t>
-      </w:r>
-    </w:p>
-    <w:p>
-      <w:r>
-        <w:rPr>
-          <w:rFonts w:ascii="Times New Roman" w:hAnsi="Times New Roman" w:eastAsia="Times New Roman" w:cs="Times New Roman"/>
-          <w:color w:val="000000"/>
-          <w:sz w:val="24"/>
-        </w:rPr>
-        <w:t>La ventilación alveolar insuficiente retiene CO₂ y aumenta la PCO₂. Puede ocurrir durante anestesia con ventilación inadecuada, obstrucción de vías respiratorias o debilidad neuromuscular. La neumonía no implica automáticamente hipercapnia: esta suele requerir afectación grave o fatiga ventilatoria. Si el trastorno persiste, el riñón aumenta la retención y generación de bicarbonato. (5,6)</w:t>
-      </w:r>
-    </w:p>
-    <w:p>
-      <w:pPr>
-        <w:pStyle w:val="Heading2"/>
-      </w:pPr>
-      <w:r>
-        <w:t>5.4 Alcalosis respiratoria</w:t>
-      </w:r>
-    </w:p>
-    <w:p>
-      <w:r>
-        <w:rPr>
-          <w:rFonts w:ascii="Times New Roman" w:hAnsi="Times New Roman" w:eastAsia="Times New Roman" w:cs="Times New Roman"/>
-          <w:color w:val="000000"/>
-          <w:sz w:val="24"/>
-        </w:rPr>
-        <w:t>La ventilación alveolar excesiva respecto de la producción de CO₂ disminuye la PCO₂. Puede acompañar dolor, excitación, hipoxemia o estimulación respiratoria sistémica. La taquipnea aislada no demuestra hiperventilación efectiva; se necesita valorar la gasometría. Con el tiempo disminuye la conservación renal de bicarbonato. (6)</w:t>
-      </w:r>
-    </w:p>
-    <w:p>
-      <w:pPr>
-        <w:pStyle w:val="Heading2"/>
-      </w:pPr>
-      <w:r>
-        <w:t>5.5 Consecuencias funcionales</w:t>
-      </w:r>
-    </w:p>
-    <w:p>
-      <w:r>
-        <w:rPr>
-          <w:rFonts w:ascii="Times New Roman" w:hAnsi="Times New Roman" w:eastAsia="Times New Roman" w:cs="Times New Roman"/>
-          <w:color w:val="000000"/>
-          <w:sz w:val="24"/>
-        </w:rPr>
-        <w:t>La acidemia intensa puede reducir el rendimiento cardiovascular y alterar el estado mental. La alcalemia favorece cambios en la excitabilidad neuromuscular y puede disminuir el calcio ionizado por mayor unión a proteínas. Estas alteraciones son funcionales y sistémicas; no producen una lesión macroscópica única que identifique el trastorno. La lesión de base depende de la enfermedad causal. (6)</w:t>
-      </w:r>
-    </w:p>
-    <w:p>
-      <w:r>
-        <w:rPr>
-          <w:rFonts w:ascii="Times New Roman" w:hAnsi="Times New Roman" w:eastAsia="Times New Roman" w:cs="Times New Roman"/>
-          <w:color w:val="000000"/>
-          <w:sz w:val="24"/>
-        </w:rPr>
-        <w:t>El potasio exige evaluación independiente. La redistribución entre células y plasma puede modificar su concentración, pero las pérdidas digestivas, la función renal, la insulina y la composición del ácido también influyen. Por ello, una acidosis no garantiza hiperpotasemia ni un valor plasmático conservado excluye déficit corporal de potasio. (8)</w:t>
-      </w:r>
-    </w:p>
-    <w:p>
-      <w:pPr>
-        <w:pStyle w:val="Heading1"/>
-      </w:pPr>
-      <w:r>
-        <w:t>6 Compensación y trastornos mixtos</w:t>
-      </w:r>
-    </w:p>
-    <w:p>
-      <w:r>
-        <w:rPr>
-          <w:rFonts w:ascii="Times New Roman" w:hAnsi="Times New Roman" w:eastAsia="Times New Roman" w:cs="Times New Roman"/>
-          <w:color w:val="000000"/>
-          <w:sz w:val="24"/>
-        </w:rPr>
-        <w:t>La compensación atenúa el cambio de pH y requiere tiempo y órganos funcionales. En un trastorno metabólico actúa la ventilación; en uno respiratorio predomina la adaptación renal. Generalmente no normaliza por completo el pH ni lo sobrecorrige. Existen excepciones en procesos respiratorios crónicos caninos, por lo que un pH normal no basta para declarar recuperación. (1,5)</w:t>
-      </w:r>
-    </w:p>
-    <w:p>
-      <w:r>
-        <w:rPr>
-          <w:rFonts w:ascii="Times New Roman" w:hAnsi="Times New Roman" w:eastAsia="Times New Roman" w:cs="Times New Roman"/>
-          <w:color w:val="000000"/>
-          <w:sz w:val="24"/>
-        </w:rPr>
-        <w:t>Un trastorno mixto contiene más de un proceso primario. Por ejemplo, la combinación de bicarbonato bajo con PCO₂ alta indica que ambos componentes favorecen acidemia. En cambio, bicarbonato bajo y PCO₂ baja pueden corresponder a compensación apropiada o a una alcalosis respiratoria adicional. La magnitud del cambio, su evolución y la historia clínica permiten diferenciarlos. (2,6)</w:t>
-      </w:r>
-    </w:p>
-    <w:p>
-      <w:pPr>
-        <w:pStyle w:val="Heading1"/>
-      </w:pPr>
-      <w:r>
-        <w:t>7 Interpretación del equilibrio ácido base</w:t>
-      </w:r>
-    </w:p>
-    <w:p>
-      <w:pPr>
-        <w:pStyle w:val="Heading2"/>
-      </w:pPr>
-      <w:r>
-        <w:t>7.1 Evaluación ordenada</w:t>
-      </w:r>
-    </w:p>
-    <w:p>
-      <w:pPr>
-        <w:ind w:left="259" w:hanging="259"/>
-      </w:pPr>
-      <w:r>
-        <w:rPr>
-          <w:rFonts w:ascii="Times New Roman" w:hAnsi="Times New Roman" w:eastAsia="Times New Roman" w:cs="Times New Roman"/>
-          <w:color w:val="000000"/>
-          <w:sz w:val="24"/>
-        </w:rPr>
-        <w:t>1. Verificar la muestra y el contexto. Registrar especie, origen arterial o venoso, oxigenoterapia, ventilación y tratamiento previo. Evitar aire y demora en el análisis.</w:t>
-      </w:r>
-    </w:p>
-    <w:p>
-      <w:pPr>
-        <w:ind w:left="259" w:hanging="259"/>
-      </w:pPr>
-      <w:r>
-        <w:rPr>
-          <w:rFonts w:ascii="Times New Roman" w:hAnsi="Times New Roman" w:eastAsia="Times New Roman" w:cs="Times New Roman"/>
-          <w:color w:val="000000"/>
-          <w:sz w:val="24"/>
-        </w:rPr>
-        <w:t>2. Evaluar el pH con el intervalo del laboratorio. Reconocer acidemia, alcalemia o un resultado dentro del intervalo.</w:t>
-      </w:r>
-    </w:p>
-    <w:p>
-      <w:pPr>
-        <w:ind w:left="259" w:hanging="259"/>
-      </w:pPr>
-      <w:r>
-        <w:rPr>
-          <w:rFonts w:ascii="Times New Roman" w:hAnsi="Times New Roman" w:eastAsia="Times New Roman" w:cs="Times New Roman"/>
-          <w:color w:val="000000"/>
-          <w:sz w:val="24"/>
-        </w:rPr>
-        <w:t>3. Examinar PCO₂ y HCO₃⁻. Determinar qué cambio explica el sentido del pH y valorar exceso de base.</w:t>
-      </w:r>
-    </w:p>
-    <w:p>
-      <w:pPr>
-        <w:ind w:left="259" w:hanging="259"/>
-      </w:pPr>
-      <w:r>
-        <w:rPr>
-          <w:rFonts w:ascii="Times New Roman" w:hAnsi="Times New Roman" w:eastAsia="Times New Roman" w:cs="Times New Roman"/>
-          <w:color w:val="000000"/>
-          <w:sz w:val="24"/>
-        </w:rPr>
-        <w:t>4. Valorar la compensación con criterios apropiados para especie y duración del proceso. Buscar alteraciones primarias adicionales.</w:t>
-      </w:r>
-    </w:p>
-    <w:p>
-      <w:pPr>
-        <w:ind w:left="259" w:hanging="259"/>
-      </w:pPr>
-      <w:r>
-        <w:rPr>
-          <w:rFonts w:ascii="Times New Roman" w:hAnsi="Times New Roman" w:eastAsia="Times New Roman" w:cs="Times New Roman"/>
-          <w:color w:val="000000"/>
-          <w:sz w:val="24"/>
-        </w:rPr>
-        <w:t>5. Integrar Na⁺, K⁺, Cl⁻, albúmina, lactato, glucosa, cetonas y función renal según el caso. Comparar resultados seriados. (2)</w:t>
-      </w:r>
-    </w:p>
-    <w:p>
-      <w:r>
-        <w:rPr>
-          <w:rFonts w:ascii="Times New Roman" w:hAnsi="Times New Roman" w:eastAsia="Times New Roman" w:cs="Times New Roman"/>
-          <w:color w:val="000000"/>
-          <w:sz w:val="24"/>
-        </w:rPr>
-        <w:t>La gasometría mide pH y PCO₂; habitualmente calcula HCO₃⁻ y exceso de base. Este último resume el componente metabólico bajo condiciones estandarizadas. La muestra venosa puede servir para valorar tendencias metabólicas, pero sus valores no son intercambiables con los arteriales. La oxigenación pulmonar requiere evaluación arterial u otros métodos adecuados; una PO₂ venosa no sustituye a la PaO₂. (2)</w:t>
-      </w:r>
-    </w:p>
-    <w:p>
-      <w:pPr>
-        <w:pStyle w:val="Heading2"/>
-      </w:pPr>
-      <w:r>
-        <w:t>7.2 Brecha aniónica</w:t>
-      </w:r>
-    </w:p>
-    <w:p>
-      <w:pPr>
-        <w:spacing w:before="100" w:after="140"/>
-        <w:jc w:val="center"/>
-      </w:pPr>
-      <m:oMath>
-        <m:r>
-          <m:t>BA = ([</m:t>
-        </m:r>
-        <m:sSup>
-          <m:e>
-            <m:r>
-              <m:t>Na</m:t>
-            </m:r>
-          </m:e>
-          <m:sup>
-            <m:r>
-              <m:t>+</m:t>
-            </m:r>
-          </m:sup>
-        </m:sSup>
-        <m:r>
-          <m:t>] + [</m:t>
-        </m:r>
-        <m:sSup>
-          <m:e>
-            <m:r>
-              <m:t>K</m:t>
-            </m:r>
-          </m:e>
-          <m:sup>
-            <m:r>
-              <m:t>+</m:t>
-            </m:r>
-          </m:sup>
-        </m:sSup>
-        <m:r>
-          <m:t>]) − ([</m:t>
-        </m:r>
-        <m:sSup>
-          <m:e>
-            <m:r>
-              <m:t>Cl</m:t>
-            </m:r>
-          </m:e>
-          <m:sup>
-            <m:r>
-              <m:t>−</m:t>
-            </m:r>
-          </m:sup>
-        </m:sSup>
-        <m:r>
-          <m:t>] + [</m:t>
-        </m:r>
-        <m:sSubSup>
-          <m:e>
-            <m:r>
-              <m:t>HCO</m:t>
-            </m:r>
-          </m:e>
-          <m:sub>
-            <m:r>
-              <m:t>3</m:t>
-            </m:r>
-          </m:sub>
-          <m:sup>
-            <m:r>
-              <m:t>−</m:t>
-            </m:r>
-          </m:sup>
-        </m:sSubSup>
-        <m:r>
-          <m:t>])</m:t>
-        </m:r>
-      </m:oMath>
-    </w:p>
-    <w:p>
-      <w:r>
-        <w:rPr>
-          <w:rFonts w:ascii="Times New Roman" w:hAnsi="Times New Roman" w:eastAsia="Times New Roman" w:cs="Times New Roman"/>
-          <w:color w:val="000000"/>
-          <w:sz w:val="24"/>
-        </w:rPr>
-        <w:t>La brecha aniónica estima la diferencia entre los iones medidos y orienta sobre aniones no incluidos en el panel. Una elevación puede acompañar acumulación de lactato, cetoaniones, compuestos urémicos o metabolitos tóxicos. Una acidosis hiperclorémica puede conservar una brecha normal. Si el laboratorio omite K⁺, debe utilizarse el intervalo correspondiente a esa fórmula. La hipoalbuminemia puede enmascarar una elevación. La brecha no identifica el ácido ni sustituye la medición de lactato. (9)</w:t>
-      </w:r>
-    </w:p>
-    <w:p>
-      <w:pPr>
-        <w:pStyle w:val="Heading2"/>
-      </w:pPr>
-      <w:r>
-        <w:t>7.3 Aporte del modelo de iones fuertes</w:t>
-      </w:r>
-    </w:p>
-    <w:p>
-      <w:r>
-        <w:rPr>
-          <w:rFonts w:ascii="Times New Roman" w:hAnsi="Times New Roman" w:eastAsia="Times New Roman" w:cs="Times New Roman"/>
-          <w:color w:val="000000"/>
-          <w:sz w:val="24"/>
-        </w:rPr>
-        <w:t>El enfoque fisicoquímico considera PCO₂, diferencia de iones fuertes y concentración de ácidos débiles, especialmente proteínas y fosfatos. Permite entender por qué cambios relativos de cloruro o albúmina modifican el estado ácido base. Complementa la lectura tradicional cuando varios mecanismos actúan a la vez, sin reemplazar la evaluación clínica. (3)</w:t>
-      </w:r>
-    </w:p>
-    <w:p>
-      <w:pPr>
-        <w:pStyle w:val="Heading1"/>
-      </w:pPr>
-      <w:r>
-        <w:t>8 Aplicaciones veterinarias</w:t>
-      </w:r>
-    </w:p>
-    <w:p>
-      <w:pPr>
-        <w:pStyle w:val="Heading2"/>
-      </w:pPr>
-      <w:r>
-        <w:t>8.1 Caso canino simulado</w:t>
-      </w:r>
-    </w:p>
-    <w:p>
-      <w:r>
-        <w:rPr>
-          <w:rFonts w:ascii="Times New Roman" w:hAnsi="Times New Roman" w:eastAsia="Times New Roman" w:cs="Times New Roman"/>
-          <w:color w:val="000000"/>
-          <w:sz w:val="24"/>
-        </w:rPr>
-        <w:t>Se plantea un perro adulto con diarrea y signos de hipoperfusión. Para el ejercicio se adoptan valores basales de PCO₂ = 40 mmHg y HCO₃⁻ = 24 mmol/L. El laboratorio didáctico utiliza pH 7,35–7,45 y brecha aniónica con K⁺ de 12–24 mmol/L. Estos supuestos no constituyen intervalos universales.</w:t>
-      </w:r>
-    </w:p>
-    <w:p>
-      <w:pPr>
-        <w:keepNext/>
-        <w:spacing w:before="100" w:after="180"/>
-        <w:jc w:val="left"/>
-      </w:pPr>
-      <w:r>
-        <w:rPr>
-          <w:rFonts w:ascii="Times New Roman" w:hAnsi="Times New Roman" w:eastAsia="Times New Roman" w:cs="Times New Roman"/>
-          <w:color w:val="000000"/>
-          <w:sz w:val="20"/>
-        </w:rPr>
-        <w:t>Tabla 3. Gasometría arterial y electrolitos simulados.</w:t>
+        <w:t>Tabla 2. Datos del escenario bovino.</w:t>
       </w:r>
     </w:p>
     <w:tbl>
@@ -2297,17 +1834,17 @@
               <w:right w:val="single" w:sz="4" w:color="D9D9D9"/>
             </w:tcBorders>
             <w:tcMar>
-              <w:top w:w="80" w:type="dxa"/>
-              <w:bottom w:w="80" w:type="dxa"/>
+              <w:top w:w="75" w:type="dxa"/>
+              <w:bottom w:w="75" w:type="dxa"/>
               <w:left w:w="100" w:type="dxa"/>
               <w:right w:w="100" w:type="dxa"/>
             </w:tcMar>
-            <w:shd w:fill="E6E6E6"/>
+            <w:shd w:fill="E7ECF0"/>
           </w:tcPr>
           <w:p>
             <w:pPr>
               <w:keepNext/>
-              <w:spacing w:line="252" w:lineRule="auto" w:after="20"/>
+              <w:spacing w:line="252" w:lineRule="auto" w:after="0"/>
               <w:jc w:val="left"/>
             </w:pPr>
             <w:r>
@@ -2332,18 +1869,18 @@
               <w:right w:val="single" w:sz="4" w:color="D9D9D9"/>
             </w:tcBorders>
             <w:tcMar>
-              <w:top w:w="80" w:type="dxa"/>
-              <w:bottom w:w="80" w:type="dxa"/>
+              <w:top w:w="75" w:type="dxa"/>
+              <w:bottom w:w="75" w:type="dxa"/>
               <w:left w:w="100" w:type="dxa"/>
               <w:right w:w="100" w:type="dxa"/>
             </w:tcMar>
-            <w:shd w:fill="E6E6E6"/>
+            <w:shd w:fill="E7ECF0"/>
           </w:tcPr>
           <w:p>
             <w:pPr>
               <w:keepNext/>
-              <w:spacing w:line="252" w:lineRule="auto" w:after="20"/>
-              <w:jc w:val="left"/>
+              <w:spacing w:line="252" w:lineRule="auto" w:after="0"/>
+              <w:jc w:val="center"/>
             </w:pPr>
             <w:r>
               <w:rPr>
@@ -2372,8 +1909,8 @@
               <w:right w:val="single" w:sz="4" w:color="D9D9D9"/>
             </w:tcBorders>
             <w:tcMar>
-              <w:top w:w="80" w:type="dxa"/>
-              <w:bottom w:w="80" w:type="dxa"/>
+              <w:top w:w="75" w:type="dxa"/>
+              <w:bottom w:w="75" w:type="dxa"/>
               <w:left w:w="100" w:type="dxa"/>
               <w:right w:w="100" w:type="dxa"/>
             </w:tcMar>
@@ -2381,7 +1918,7 @@
           <w:p>
             <w:pPr>
               <w:keepNext/>
-              <w:spacing w:line="252" w:lineRule="auto" w:after="20"/>
+              <w:spacing w:line="252" w:lineRule="auto" w:after="0"/>
               <w:jc w:val="left"/>
             </w:pPr>
             <w:r>
@@ -2406,8 +1943,8 @@
               <w:right w:val="single" w:sz="4" w:color="D9D9D9"/>
             </w:tcBorders>
             <w:tcMar>
-              <w:top w:w="80" w:type="dxa"/>
-              <w:bottom w:w="80" w:type="dxa"/>
+              <w:top w:w="75" w:type="dxa"/>
+              <w:bottom w:w="75" w:type="dxa"/>
               <w:left w:w="100" w:type="dxa"/>
               <w:right w:w="100" w:type="dxa"/>
             </w:tcMar>
@@ -2415,8 +1952,8 @@
           <w:p>
             <w:pPr>
               <w:keepNext/>
-              <w:spacing w:line="252" w:lineRule="auto" w:after="20"/>
-              <w:jc w:val="left"/>
+              <w:spacing w:line="252" w:lineRule="auto" w:after="0"/>
+              <w:jc w:val="center"/>
             </w:pPr>
             <w:r>
               <w:rPr>
@@ -2425,7 +1962,7 @@
                 <w:color w:val="000000"/>
                 <w:sz w:val="24"/>
               </w:rPr>
-              <w:t>7,20</w:t>
+              <w:t>7,15</w:t>
             </w:r>
           </w:p>
         </w:tc>
@@ -2445,8 +1982,8 @@
               <w:right w:val="single" w:sz="4" w:color="D9D9D9"/>
             </w:tcBorders>
             <w:tcMar>
-              <w:top w:w="80" w:type="dxa"/>
-              <w:bottom w:w="80" w:type="dxa"/>
+              <w:top w:w="75" w:type="dxa"/>
+              <w:bottom w:w="75" w:type="dxa"/>
               <w:left w:w="100" w:type="dxa"/>
               <w:right w:w="100" w:type="dxa"/>
             </w:tcMar>
@@ -2454,7 +1991,7 @@
           <w:p>
             <w:pPr>
               <w:keepNext/>
-              <w:spacing w:line="252" w:lineRule="auto" w:after="20"/>
+              <w:spacing w:line="252" w:lineRule="auto" w:after="0"/>
               <w:jc w:val="left"/>
             </w:pPr>
             <w:r>
@@ -2479,8 +2016,8 @@
               <w:right w:val="single" w:sz="4" w:color="D9D9D9"/>
             </w:tcBorders>
             <w:tcMar>
-              <w:top w:w="80" w:type="dxa"/>
-              <w:bottom w:w="80" w:type="dxa"/>
+              <w:top w:w="75" w:type="dxa"/>
+              <w:bottom w:w="75" w:type="dxa"/>
               <w:left w:w="100" w:type="dxa"/>
               <w:right w:w="100" w:type="dxa"/>
             </w:tcMar>
@@ -2488,8 +2025,8 @@
           <w:p>
             <w:pPr>
               <w:keepNext/>
-              <w:spacing w:line="252" w:lineRule="auto" w:after="20"/>
-              <w:jc w:val="left"/>
+              <w:spacing w:line="252" w:lineRule="auto" w:after="0"/>
+              <w:jc w:val="center"/>
             </w:pPr>
             <w:r>
               <w:rPr>
@@ -2498,7 +2035,7 @@
                 <w:color w:val="000000"/>
                 <w:sz w:val="24"/>
               </w:rPr>
-              <w:t>32 mmHg</w:t>
+              <w:t>30 mmHg</w:t>
             </w:r>
           </w:p>
         </w:tc>
@@ -2518,8 +2055,8 @@
               <w:right w:val="single" w:sz="4" w:color="D9D9D9"/>
             </w:tcBorders>
             <w:tcMar>
-              <w:top w:w="80" w:type="dxa"/>
-              <w:bottom w:w="80" w:type="dxa"/>
+              <w:top w:w="75" w:type="dxa"/>
+              <w:bottom w:w="75" w:type="dxa"/>
               <w:left w:w="100" w:type="dxa"/>
               <w:right w:w="100" w:type="dxa"/>
             </w:tcMar>
@@ -2527,7 +2064,7 @@
           <w:p>
             <w:pPr>
               <w:keepNext/>
-              <w:spacing w:line="252" w:lineRule="auto" w:after="20"/>
+              <w:spacing w:line="252" w:lineRule="auto" w:after="0"/>
               <w:jc w:val="left"/>
             </w:pPr>
             <w:r>
@@ -2552,8 +2089,8 @@
               <w:right w:val="single" w:sz="4" w:color="D9D9D9"/>
             </w:tcBorders>
             <w:tcMar>
-              <w:top w:w="80" w:type="dxa"/>
-              <w:bottom w:w="80" w:type="dxa"/>
+              <w:top w:w="75" w:type="dxa"/>
+              <w:bottom w:w="75" w:type="dxa"/>
               <w:left w:w="100" w:type="dxa"/>
               <w:right w:w="100" w:type="dxa"/>
             </w:tcMar>
@@ -2561,8 +2098,8 @@
           <w:p>
             <w:pPr>
               <w:keepNext/>
-              <w:spacing w:line="252" w:lineRule="auto" w:after="20"/>
-              <w:jc w:val="left"/>
+              <w:spacing w:line="252" w:lineRule="auto" w:after="0"/>
+              <w:jc w:val="center"/>
             </w:pPr>
             <w:r>
               <w:rPr>
@@ -2571,7 +2108,7 @@
                 <w:color w:val="000000"/>
                 <w:sz w:val="24"/>
               </w:rPr>
-              <w:t>12 mmol/L</w:t>
+              <w:t>10 mmol/L</w:t>
             </w:r>
           </w:p>
         </w:tc>
@@ -2591,15 +2128,16 @@
               <w:right w:val="single" w:sz="4" w:color="D9D9D9"/>
             </w:tcBorders>
             <w:tcMar>
-              <w:top w:w="80" w:type="dxa"/>
-              <w:bottom w:w="80" w:type="dxa"/>
+              <w:top w:w="75" w:type="dxa"/>
+              <w:bottom w:w="75" w:type="dxa"/>
               <w:left w:w="100" w:type="dxa"/>
               <w:right w:w="100" w:type="dxa"/>
             </w:tcMar>
           </w:tcPr>
           <w:p>
             <w:pPr>
-              <w:spacing w:line="252" w:lineRule="auto" w:after="20"/>
+              <w:keepNext/>
+              <w:spacing w:line="252" w:lineRule="auto" w:after="0"/>
               <w:jc w:val="left"/>
             </w:pPr>
             <w:r>
@@ -2609,7 +2147,7 @@
                 <w:color w:val="000000"/>
                 <w:sz w:val="24"/>
               </w:rPr>
-              <w:t>Na⁺ / K⁺ / Cl⁻</w:t>
+              <w:t>Na⁺</w:t>
             </w:r>
           </w:p>
         </w:tc>
@@ -2624,15 +2162,55 @@
               <w:right w:val="single" w:sz="4" w:color="D9D9D9"/>
             </w:tcBorders>
             <w:tcMar>
-              <w:top w:w="80" w:type="dxa"/>
-              <w:bottom w:w="80" w:type="dxa"/>
+              <w:top w:w="75" w:type="dxa"/>
+              <w:bottom w:w="75" w:type="dxa"/>
               <w:left w:w="100" w:type="dxa"/>
               <w:right w:w="100" w:type="dxa"/>
             </w:tcMar>
           </w:tcPr>
           <w:p>
             <w:pPr>
-              <w:spacing w:line="252" w:lineRule="auto" w:after="20"/>
+              <w:keepNext/>
+              <w:spacing w:line="252" w:lineRule="auto" w:after="0"/>
+              <w:jc w:val="center"/>
+            </w:pPr>
+            <w:r>
+              <w:rPr>
+                <w:rFonts w:ascii="Times New Roman" w:hAnsi="Times New Roman" w:eastAsia="Times New Roman" w:cs="Times New Roman"/>
+                <w:b w:val="0"/>
+                <w:color w:val="000000"/>
+                <w:sz w:val="24"/>
+              </w:rPr>
+              <w:t>135 mmol/L</w:t>
+            </w:r>
+          </w:p>
+        </w:tc>
+      </w:tr>
+      <w:tr>
+        <w:trPr>
+          <w:cantSplit/>
+        </w:trPr>
+        <w:tc>
+          <w:tcPr>
+            <w:tcW w:type="dxa" w:w="4464"/>
+            <w:vAlign w:val="center"/>
+            <w:tcBorders>
+              <w:top w:val="single" w:sz="4" w:color="D9D9D9"/>
+              <w:left w:val="single" w:sz="4" w:color="D9D9D9"/>
+              <w:bottom w:val="single" w:sz="4" w:color="D9D9D9"/>
+              <w:right w:val="single" w:sz="4" w:color="D9D9D9"/>
+            </w:tcBorders>
+            <w:tcMar>
+              <w:top w:w="75" w:type="dxa"/>
+              <w:bottom w:w="75" w:type="dxa"/>
+              <w:left w:w="100" w:type="dxa"/>
+              <w:right w:w="100" w:type="dxa"/>
+            </w:tcMar>
+          </w:tcPr>
+          <w:p>
+            <w:pPr>
+              <w:keepNext/>
+              <w:spacing w:line="252" w:lineRule="auto" w:after="0"/>
               <w:jc w:val="left"/>
             </w:pPr>
             <w:r>
@@ -2642,7 +2220,114 @@
                 <w:color w:val="000000"/>
                 <w:sz w:val="24"/>
               </w:rPr>
-              <w:t>146 / 4 / 108 mmol/L</w:t>
+              <w:t>K⁺</w:t>
+            </w:r>
+          </w:p>
+        </w:tc>
+        <w:tc>
+          <w:tcPr>
+            <w:tcW w:type="dxa" w:w="4896"/>
+            <w:vAlign w:val="center"/>
+            <w:tcBorders>
+              <w:top w:val="single" w:sz="4" w:color="D9D9D9"/>
+              <w:left w:val="single" w:sz="4" w:color="D9D9D9"/>
+              <w:bottom w:val="single" w:sz="4" w:color="D9D9D9"/>
+              <w:right w:val="single" w:sz="4" w:color="D9D9D9"/>
+            </w:tcBorders>
+            <w:tcMar>
+              <w:top w:w="75" w:type="dxa"/>
+              <w:bottom w:w="75" w:type="dxa"/>
+              <w:left w:w="100" w:type="dxa"/>
+              <w:right w:w="100" w:type="dxa"/>
+            </w:tcMar>
+          </w:tcPr>
+          <w:p>
+            <w:pPr>
+              <w:keepNext/>
+              <w:spacing w:line="252" w:lineRule="auto" w:after="0"/>
+              <w:jc w:val="center"/>
+            </w:pPr>
+            <w:r>
+              <w:rPr>
+                <w:rFonts w:ascii="Times New Roman" w:hAnsi="Times New Roman" w:eastAsia="Times New Roman" w:cs="Times New Roman"/>
+                <w:b w:val="0"/>
+                <w:color w:val="000000"/>
+                <w:sz w:val="24"/>
+              </w:rPr>
+              <w:t>4,8 mmol/L</w:t>
+            </w:r>
+          </w:p>
+        </w:tc>
+      </w:tr>
+      <w:tr>
+        <w:trPr>
+          <w:cantSplit/>
+        </w:trPr>
+        <w:tc>
+          <w:tcPr>
+            <w:tcW w:type="dxa" w:w="4464"/>
+            <w:vAlign w:val="center"/>
+            <w:tcBorders>
+              <w:top w:val="single" w:sz="4" w:color="D9D9D9"/>
+              <w:left w:val="single" w:sz="4" w:color="D9D9D9"/>
+              <w:bottom w:val="single" w:sz="4" w:color="D9D9D9"/>
+              <w:right w:val="single" w:sz="4" w:color="D9D9D9"/>
+            </w:tcBorders>
+            <w:tcMar>
+              <w:top w:w="75" w:type="dxa"/>
+              <w:bottom w:w="75" w:type="dxa"/>
+              <w:left w:w="100" w:type="dxa"/>
+              <w:right w:w="100" w:type="dxa"/>
+            </w:tcMar>
+          </w:tcPr>
+          <w:p>
+            <w:pPr>
+              <w:keepNext w:val="0"/>
+              <w:spacing w:line="252" w:lineRule="auto" w:after="0"/>
+              <w:jc w:val="left"/>
+            </w:pPr>
+            <w:r>
+              <w:rPr>
+                <w:rFonts w:ascii="Times New Roman" w:hAnsi="Times New Roman" w:eastAsia="Times New Roman" w:cs="Times New Roman"/>
+                <w:b w:val="0"/>
+                <w:color w:val="000000"/>
+                <w:sz w:val="24"/>
+              </w:rPr>
+              <w:t>Cl⁻</w:t>
+            </w:r>
+          </w:p>
+        </w:tc>
+        <w:tc>
+          <w:tcPr>
+            <w:tcW w:type="dxa" w:w="4896"/>
+            <w:vAlign w:val="center"/>
+            <w:tcBorders>
+              <w:top w:val="single" w:sz="4" w:color="D9D9D9"/>
+              <w:left w:val="single" w:sz="4" w:color="D9D9D9"/>
+              <w:bottom w:val="single" w:sz="4" w:color="D9D9D9"/>
+              <w:right w:val="single" w:sz="4" w:color="D9D9D9"/>
+            </w:tcBorders>
+            <w:tcMar>
+              <w:top w:w="75" w:type="dxa"/>
+              <w:bottom w:w="75" w:type="dxa"/>
+              <w:left w:w="100" w:type="dxa"/>
+              <w:right w:w="100" w:type="dxa"/>
+            </w:tcMar>
+          </w:tcPr>
+          <w:p>
+            <w:pPr>
+              <w:keepNext w:val="0"/>
+              <w:spacing w:line="252" w:lineRule="auto" w:after="0"/>
+              <w:jc w:val="center"/>
+            </w:pPr>
+            <w:r>
+              <w:rPr>
+                <w:rFonts w:ascii="Times New Roman" w:hAnsi="Times New Roman" w:eastAsia="Times New Roman" w:cs="Times New Roman"/>
+                <w:b w:val="0"/>
+                <w:color w:val="000000"/>
+                <w:sz w:val="24"/>
+              </w:rPr>
+              <w:t>102 mmol/L</w:t>
             </w:r>
           </w:p>
         </w:tc>
@@ -2650,17 +2335,14 @@
     </w:tbl>
     <w:p>
       <w:pPr>
-        <w:spacing w:after="20"/>
+        <w:spacing w:after="0" w:line="72" w:lineRule="auto"/>
       </w:pPr>
-    </w:p>
-    <w:p>
       <w:r>
         <w:rPr>
           <w:rFonts w:ascii="Times New Roman" w:hAnsi="Times New Roman" w:eastAsia="Times New Roman" w:cs="Times New Roman"/>
           <w:color w:val="000000"/>
-          <w:sz w:val="24"/>
+          <w:sz w:val="4"/>
         </w:rPr>
-        <w:t>El pH indica acidemia y el bicarbonato disminuido identifica un componente metabólico acidificante. El cálculo de brecha aniónica es (146 + 4) − (108 + 12) = 30 mmol/L, por encima del intervalo elegido. La conclusión inicial es acidosis metabólica con aumento de aniones no medidos. La hipoperfusión sugiere investigar lactato, pero el cálculo por sí solo no demuestra su causa. (9)</w:t>
       </w:r>
     </w:p>
     <w:p>
@@ -2670,7 +2352,7 @@
           <w:color w:val="000000"/>
           <w:sz w:val="24"/>
         </w:rPr>
-        <w:t>Como orientación canina se aplica PCO₂ esperada = PCO₂ basal + 0,7 × (HCO₃⁻ medido − HCO₃⁻ basal), con margen de ±3 mmHg para acidosis metabólica. Resulta 31,6 ±3 mmHg, es decir, 28,6–34,6 mmHg. La PCO₂ medida de 32 mmHg es compatible con esa respuesta. Otras reglas pueden ofrecer estimaciones diferentes; esta ecuación no debe generalizarse a bovinos. (5)</w:t>
+        <w:t>Para este ejercicio se adopta el criterio de pH venoso &lt;7,35 aplicado por Jung et al. a terneros Hanwoo con diarrea. Se trata de una clasificación del estudio, no de un intervalo validado para todas las razas, edades o analizadores. El valor 7,15 cumple ese criterio de acidemia. El HCO₃⁻ reducido, la acidemia y el contexto sostienen un componente de acidosis metabólica. (7,11)</w:t>
       </w:r>
     </w:p>
     <w:p>
@@ -2680,15 +2362,7 @@
           <w:color w:val="000000"/>
           <w:sz w:val="24"/>
         </w:rPr>
-        <w:t>La comprobación matemática da pH = 6,1 + log₁₀[12/(0,03 × 32)] ≈ 7,20. Si con el mismo bicarbonato la PCO₂ fuera 50 mmHg, el pH calculado sería cercano a 7,00: la retención de CO₂ añadiría acidosis respiratoria. Este cambio muestra por qué evaluar únicamente bicarbonato sería insuficiente.</w:t>
-      </w:r>
-    </w:p>
-    <w:p>
-      <w:pPr>
-        <w:pStyle w:val="Heading2"/>
-      </w:pPr>
-      <w:r>
-        <w:t>8.2 Diarrea en el ternero</w:t>
+        <w:t>La PCO₂ menor atenúa el descenso del pH, pero estos datos no demuestran adecuación cuantitativa de la respuesta bovina. Una alcalosis respiratoria como única explicación no justifica la acidemia con bicarbonato marcadamente reducido. El cálculo de coherencia produce 6,1 + log₁₀[10/(0,03 × 30)] = 7,145757, que se muestra como 7,15. (2,3)</w:t>
       </w:r>
     </w:p>
     <w:p>
@@ -2698,7 +2372,16 @@
           <w:color w:val="000000"/>
           <w:sz w:val="24"/>
         </w:rPr>
-        <w:t>La diarrea puede combinar pérdida de bicarbonato, hipoperfusión, menor eliminación renal de ácido y absorción de productos de fermentación intestinal. El D-lactato tiene especial interés en terneros con alteraciones digestivas y neurológicas. Su contribución no se deduce de un medidor convencional de L-lactato. La revisión de Burgos y colaboradores también estudia efectos inflamatorios del D-lactato, cuya aplicación clínica continúa en investigación. (10)</w:t>
+        <w:t>La brecha calculada es (135 + 4,8) − (102 + 10) = 27,8 mmol/L. Sin el intervalo pertinente y el contexto proteico no se la clasifica como elevada o normal. Tampoco demuestra lactacidemia. Deben considerarse pérdidas digestivas, perfusión y fermentación; L-lactato y D-lactato tienen orígenes y vías diferentes y requieren interpretación específica. La revisión de Burgos et al. aporta mecanismos relacionados con D-lactato en bovinos, pero no demuestra su concentración ni su papel causal en este escenario. (10–12)</w:t>
+      </w:r>
+    </w:p>
+    <w:p>
+      <w:pPr>
+        <w:pStyle w:val="Heading2"/>
+        <w:pageBreakBefore/>
+      </w:pPr>
+      <w:r>
+        <w:t>8.2 Perro con hipoventilación aguda</w:t>
       </w:r>
     </w:p>
     <w:p>
@@ -2708,15 +2391,480 @@
           <w:color w:val="000000"/>
           <w:sz w:val="24"/>
         </w:rPr>
-        <w:t>Jung y colaboradores compararon 44 terneros Hanwoo sanos y 93 con diarrea. Ambos isómeros de lactato aumentaron en los animales enfermos, pero sus correlaciones individuales con pH fueron débiles. El hallazgo respalda integrar lactato, gasometría y examen clínico. Los intervalos obtenidos en esa población no deben trasladarse automáticamente a terneros de otras razas o sistemas productivos. (11)</w:t>
+        <w:t>En un canino adulto sometido a anestesia disminuye la ventilación alveolar. A los 20 minutos se obtiene una gasometría arterial y se compara con un panel previo del mismo escenario. Ambos conjuntos son sintéticos. El panel previo sirve como punto de comparación, no como intervalo poblacional canino.</w:t>
       </w:r>
     </w:p>
     <w:p>
       <w:pPr>
-        <w:pStyle w:val="Heading2"/>
+        <w:keepNext/>
+        <w:keepLines/>
+        <w:spacing w:before="100" w:after="140" w:line="264" w:lineRule="auto"/>
+        <w:jc w:val="left"/>
       </w:pPr>
       <w:r>
-        <w:t>8.3 Desplazamiento y vólvulo abomasal</w:t>
+        <w:rPr>
+          <w:rFonts w:ascii="Times New Roman" w:hAnsi="Times New Roman" w:eastAsia="Times New Roman" w:cs="Times New Roman"/>
+          <w:color w:val="000000"/>
+          <w:sz w:val="21"/>
+        </w:rPr>
+        <w:t>Tabla 3. Comparación del escenario canino a 37 °C.</w:t>
+      </w:r>
+    </w:p>
+    <w:tbl>
+      <w:tblPr>
+        <w:tblW w:type="auto" w:w="0"/>
+        <w:jc w:val="center"/>
+        <w:tblLayout w:type="fixed"/>
+        <w:tblLook w:firstColumn="1" w:firstRow="1" w:lastColumn="0" w:lastRow="0" w:noHBand="0" w:noVBand="1" w:val="04A0"/>
+      </w:tblPr>
+      <w:tblGrid>
+        <w:gridCol w:w="3024"/>
+        <w:gridCol w:w="3168"/>
+        <w:gridCol w:w="3168"/>
+      </w:tblGrid>
+      <w:tr>
+        <w:trPr>
+          <w:cantSplit/>
+          <w:tblHeader/>
+        </w:trPr>
+        <w:tc>
+          <w:tcPr>
+            <w:tcW w:type="dxa" w:w="3024"/>
+            <w:vAlign w:val="center"/>
+            <w:tcBorders>
+              <w:top w:val="single" w:sz="4" w:color="D9D9D9"/>
+              <w:left w:val="single" w:sz="4" w:color="D9D9D9"/>
+              <w:bottom w:val="single" w:sz="4" w:color="D9D9D9"/>
+              <w:right w:val="single" w:sz="4" w:color="D9D9D9"/>
+            </w:tcBorders>
+            <w:tcMar>
+              <w:top w:w="75" w:type="dxa"/>
+              <w:bottom w:w="75" w:type="dxa"/>
+              <w:left w:w="100" w:type="dxa"/>
+              <w:right w:w="100" w:type="dxa"/>
+            </w:tcMar>
+            <w:shd w:fill="E7ECF0"/>
+          </w:tcPr>
+          <w:p>
+            <w:pPr>
+              <w:keepNext/>
+              <w:spacing w:line="252" w:lineRule="auto" w:after="0"/>
+              <w:jc w:val="left"/>
+            </w:pPr>
+            <w:r>
+              <w:rPr>
+                <w:rFonts w:ascii="Times New Roman" w:hAnsi="Times New Roman" w:eastAsia="Times New Roman" w:cs="Times New Roman"/>
+                <w:b/>
+                <w:color w:val="000000"/>
+                <w:sz w:val="24"/>
+              </w:rPr>
+              <w:t>Variable</w:t>
+            </w:r>
+          </w:p>
+        </w:tc>
+        <w:tc>
+          <w:tcPr>
+            <w:tcW w:type="dxa" w:w="3168"/>
+            <w:vAlign w:val="center"/>
+            <w:tcBorders>
+              <w:top w:val="single" w:sz="4" w:color="D9D9D9"/>
+              <w:left w:val="single" w:sz="4" w:color="D9D9D9"/>
+              <w:bottom w:val="single" w:sz="4" w:color="D9D9D9"/>
+              <w:right w:val="single" w:sz="4" w:color="D9D9D9"/>
+            </w:tcBorders>
+            <w:tcMar>
+              <w:top w:w="75" w:type="dxa"/>
+              <w:bottom w:w="75" w:type="dxa"/>
+              <w:left w:w="100" w:type="dxa"/>
+              <w:right w:w="100" w:type="dxa"/>
+            </w:tcMar>
+            <w:shd w:fill="E7ECF0"/>
+          </w:tcPr>
+          <w:p>
+            <w:pPr>
+              <w:keepNext/>
+              <w:spacing w:line="252" w:lineRule="auto" w:after="0"/>
+              <w:jc w:val="center"/>
+            </w:pPr>
+            <w:r>
+              <w:rPr>
+                <w:rFonts w:ascii="Times New Roman" w:hAnsi="Times New Roman" w:eastAsia="Times New Roman" w:cs="Times New Roman"/>
+                <w:b/>
+                <w:color w:val="000000"/>
+                <w:sz w:val="24"/>
+              </w:rPr>
+              <w:t>Antes del episodio</w:t>
+            </w:r>
+          </w:p>
+        </w:tc>
+        <w:tc>
+          <w:tcPr>
+            <w:tcW w:type="dxa" w:w="3168"/>
+            <w:vAlign w:val="center"/>
+            <w:tcBorders>
+              <w:top w:val="single" w:sz="4" w:color="D9D9D9"/>
+              <w:left w:val="single" w:sz="4" w:color="D9D9D9"/>
+              <w:bottom w:val="single" w:sz="4" w:color="D9D9D9"/>
+              <w:right w:val="single" w:sz="4" w:color="D9D9D9"/>
+            </w:tcBorders>
+            <w:tcMar>
+              <w:top w:w="75" w:type="dxa"/>
+              <w:bottom w:w="75" w:type="dxa"/>
+              <w:left w:w="100" w:type="dxa"/>
+              <w:right w:w="100" w:type="dxa"/>
+            </w:tcMar>
+            <w:shd w:fill="E7ECF0"/>
+          </w:tcPr>
+          <w:p>
+            <w:pPr>
+              <w:keepNext/>
+              <w:spacing w:line="252" w:lineRule="auto" w:after="0"/>
+              <w:jc w:val="center"/>
+            </w:pPr>
+            <w:r>
+              <w:rPr>
+                <w:rFonts w:ascii="Times New Roman" w:hAnsi="Times New Roman" w:eastAsia="Times New Roman" w:cs="Times New Roman"/>
+                <w:b/>
+                <w:color w:val="000000"/>
+                <w:sz w:val="24"/>
+              </w:rPr>
+              <w:t>A los 20 minutos</w:t>
+            </w:r>
+          </w:p>
+        </w:tc>
+      </w:tr>
+      <w:tr>
+        <w:trPr>
+          <w:cantSplit/>
+        </w:trPr>
+        <w:tc>
+          <w:tcPr>
+            <w:tcW w:type="dxa" w:w="3024"/>
+            <w:vAlign w:val="center"/>
+            <w:tcBorders>
+              <w:top w:val="single" w:sz="4" w:color="D9D9D9"/>
+              <w:left w:val="single" w:sz="4" w:color="D9D9D9"/>
+              <w:bottom w:val="single" w:sz="4" w:color="D9D9D9"/>
+              <w:right w:val="single" w:sz="4" w:color="D9D9D9"/>
+            </w:tcBorders>
+            <w:tcMar>
+              <w:top w:w="75" w:type="dxa"/>
+              <w:bottom w:w="75" w:type="dxa"/>
+              <w:left w:w="100" w:type="dxa"/>
+              <w:right w:w="100" w:type="dxa"/>
+            </w:tcMar>
+          </w:tcPr>
+          <w:p>
+            <w:pPr>
+              <w:keepNext/>
+              <w:spacing w:line="252" w:lineRule="auto" w:after="0"/>
+              <w:jc w:val="left"/>
+            </w:pPr>
+            <w:r>
+              <w:rPr>
+                <w:rFonts w:ascii="Times New Roman" w:hAnsi="Times New Roman" w:eastAsia="Times New Roman" w:cs="Times New Roman"/>
+                <w:b w:val="0"/>
+                <w:color w:val="000000"/>
+                <w:sz w:val="24"/>
+              </w:rPr>
+              <w:t>pH</w:t>
+            </w:r>
+          </w:p>
+        </w:tc>
+        <w:tc>
+          <w:tcPr>
+            <w:tcW w:type="dxa" w:w="3168"/>
+            <w:vAlign w:val="center"/>
+            <w:tcBorders>
+              <w:top w:val="single" w:sz="4" w:color="D9D9D9"/>
+              <w:left w:val="single" w:sz="4" w:color="D9D9D9"/>
+              <w:bottom w:val="single" w:sz="4" w:color="D9D9D9"/>
+              <w:right w:val="single" w:sz="4" w:color="D9D9D9"/>
+            </w:tcBorders>
+            <w:tcMar>
+              <w:top w:w="75" w:type="dxa"/>
+              <w:bottom w:w="75" w:type="dxa"/>
+              <w:left w:w="100" w:type="dxa"/>
+              <w:right w:w="100" w:type="dxa"/>
+            </w:tcMar>
+          </w:tcPr>
+          <w:p>
+            <w:pPr>
+              <w:keepNext/>
+              <w:spacing w:line="252" w:lineRule="auto" w:after="0"/>
+              <w:jc w:val="center"/>
+            </w:pPr>
+            <w:r>
+              <w:rPr>
+                <w:rFonts w:ascii="Times New Roman" w:hAnsi="Times New Roman" w:eastAsia="Times New Roman" w:cs="Times New Roman"/>
+                <w:b w:val="0"/>
+                <w:color w:val="000000"/>
+                <w:sz w:val="24"/>
+              </w:rPr>
+              <w:t>7,40</w:t>
+            </w:r>
+          </w:p>
+        </w:tc>
+        <w:tc>
+          <w:tcPr>
+            <w:tcW w:type="dxa" w:w="3168"/>
+            <w:vAlign w:val="center"/>
+            <w:tcBorders>
+              <w:top w:val="single" w:sz="4" w:color="D9D9D9"/>
+              <w:left w:val="single" w:sz="4" w:color="D9D9D9"/>
+              <w:bottom w:val="single" w:sz="4" w:color="D9D9D9"/>
+              <w:right w:val="single" w:sz="4" w:color="D9D9D9"/>
+            </w:tcBorders>
+            <w:tcMar>
+              <w:top w:w="75" w:type="dxa"/>
+              <w:bottom w:w="75" w:type="dxa"/>
+              <w:left w:w="100" w:type="dxa"/>
+              <w:right w:w="100" w:type="dxa"/>
+            </w:tcMar>
+          </w:tcPr>
+          <w:p>
+            <w:pPr>
+              <w:keepNext/>
+              <w:spacing w:line="252" w:lineRule="auto" w:after="0"/>
+              <w:jc w:val="center"/>
+            </w:pPr>
+            <w:r>
+              <w:rPr>
+                <w:rFonts w:ascii="Times New Roman" w:hAnsi="Times New Roman" w:eastAsia="Times New Roman" w:cs="Times New Roman"/>
+                <w:b w:val="0"/>
+                <w:color w:val="000000"/>
+                <w:sz w:val="24"/>
+              </w:rPr>
+              <w:t>7,28</w:t>
+            </w:r>
+          </w:p>
+        </w:tc>
+      </w:tr>
+      <w:tr>
+        <w:trPr>
+          <w:cantSplit/>
+        </w:trPr>
+        <w:tc>
+          <w:tcPr>
+            <w:tcW w:type="dxa" w:w="3024"/>
+            <w:vAlign w:val="center"/>
+            <w:tcBorders>
+              <w:top w:val="single" w:sz="4" w:color="D9D9D9"/>
+              <w:left w:val="single" w:sz="4" w:color="D9D9D9"/>
+              <w:bottom w:val="single" w:sz="4" w:color="D9D9D9"/>
+              <w:right w:val="single" w:sz="4" w:color="D9D9D9"/>
+            </w:tcBorders>
+            <w:tcMar>
+              <w:top w:w="75" w:type="dxa"/>
+              <w:bottom w:w="75" w:type="dxa"/>
+              <w:left w:w="100" w:type="dxa"/>
+              <w:right w:w="100" w:type="dxa"/>
+            </w:tcMar>
+          </w:tcPr>
+          <w:p>
+            <w:pPr>
+              <w:keepNext/>
+              <w:spacing w:line="252" w:lineRule="auto" w:after="0"/>
+              <w:jc w:val="left"/>
+            </w:pPr>
+            <w:r>
+              <w:rPr>
+                <w:rFonts w:ascii="Times New Roman" w:hAnsi="Times New Roman" w:eastAsia="Times New Roman" w:cs="Times New Roman"/>
+                <w:b w:val="0"/>
+                <w:color w:val="000000"/>
+                <w:sz w:val="24"/>
+              </w:rPr>
+              <w:t>PCO₂</w:t>
+            </w:r>
+          </w:p>
+        </w:tc>
+        <w:tc>
+          <w:tcPr>
+            <w:tcW w:type="dxa" w:w="3168"/>
+            <w:vAlign w:val="center"/>
+            <w:tcBorders>
+              <w:top w:val="single" w:sz="4" w:color="D9D9D9"/>
+              <w:left w:val="single" w:sz="4" w:color="D9D9D9"/>
+              <w:bottom w:val="single" w:sz="4" w:color="D9D9D9"/>
+              <w:right w:val="single" w:sz="4" w:color="D9D9D9"/>
+            </w:tcBorders>
+            <w:tcMar>
+              <w:top w:w="75" w:type="dxa"/>
+              <w:bottom w:w="75" w:type="dxa"/>
+              <w:left w:w="100" w:type="dxa"/>
+              <w:right w:w="100" w:type="dxa"/>
+            </w:tcMar>
+          </w:tcPr>
+          <w:p>
+            <w:pPr>
+              <w:keepNext/>
+              <w:spacing w:line="252" w:lineRule="auto" w:after="0"/>
+              <w:jc w:val="center"/>
+            </w:pPr>
+            <w:r>
+              <w:rPr>
+                <w:rFonts w:ascii="Times New Roman" w:hAnsi="Times New Roman" w:eastAsia="Times New Roman" w:cs="Times New Roman"/>
+                <w:b w:val="0"/>
+                <w:color w:val="000000"/>
+                <w:sz w:val="24"/>
+              </w:rPr>
+              <w:t>40 mmHg</w:t>
+            </w:r>
+          </w:p>
+        </w:tc>
+        <w:tc>
+          <w:tcPr>
+            <w:tcW w:type="dxa" w:w="3168"/>
+            <w:vAlign w:val="center"/>
+            <w:tcBorders>
+              <w:top w:val="single" w:sz="4" w:color="D9D9D9"/>
+              <w:left w:val="single" w:sz="4" w:color="D9D9D9"/>
+              <w:bottom w:val="single" w:sz="4" w:color="D9D9D9"/>
+              <w:right w:val="single" w:sz="4" w:color="D9D9D9"/>
+            </w:tcBorders>
+            <w:tcMar>
+              <w:top w:w="75" w:type="dxa"/>
+              <w:bottom w:w="75" w:type="dxa"/>
+              <w:left w:w="100" w:type="dxa"/>
+              <w:right w:w="100" w:type="dxa"/>
+            </w:tcMar>
+          </w:tcPr>
+          <w:p>
+            <w:pPr>
+              <w:keepNext/>
+              <w:spacing w:line="252" w:lineRule="auto" w:after="0"/>
+              <w:jc w:val="center"/>
+            </w:pPr>
+            <w:r>
+              <w:rPr>
+                <w:rFonts w:ascii="Times New Roman" w:hAnsi="Times New Roman" w:eastAsia="Times New Roman" w:cs="Times New Roman"/>
+                <w:b w:val="0"/>
+                <w:color w:val="000000"/>
+                <w:sz w:val="24"/>
+              </w:rPr>
+              <w:t>60 mmHg</w:t>
+            </w:r>
+          </w:p>
+        </w:tc>
+      </w:tr>
+      <w:tr>
+        <w:trPr>
+          <w:cantSplit/>
+        </w:trPr>
+        <w:tc>
+          <w:tcPr>
+            <w:tcW w:type="dxa" w:w="3024"/>
+            <w:vAlign w:val="center"/>
+            <w:tcBorders>
+              <w:top w:val="single" w:sz="4" w:color="D9D9D9"/>
+              <w:left w:val="single" w:sz="4" w:color="D9D9D9"/>
+              <w:bottom w:val="single" w:sz="4" w:color="D9D9D9"/>
+              <w:right w:val="single" w:sz="4" w:color="D9D9D9"/>
+            </w:tcBorders>
+            <w:tcMar>
+              <w:top w:w="75" w:type="dxa"/>
+              <w:bottom w:w="75" w:type="dxa"/>
+              <w:left w:w="100" w:type="dxa"/>
+              <w:right w:w="100" w:type="dxa"/>
+            </w:tcMar>
+          </w:tcPr>
+          <w:p>
+            <w:pPr>
+              <w:keepNext w:val="0"/>
+              <w:spacing w:line="252" w:lineRule="auto" w:after="0"/>
+              <w:jc w:val="left"/>
+            </w:pPr>
+            <w:r>
+              <w:rPr>
+                <w:rFonts w:ascii="Times New Roman" w:hAnsi="Times New Roman" w:eastAsia="Times New Roman" w:cs="Times New Roman"/>
+                <w:b w:val="0"/>
+                <w:color w:val="000000"/>
+                <w:sz w:val="24"/>
+              </w:rPr>
+              <w:t>HCO₃⁻</w:t>
+            </w:r>
+          </w:p>
+        </w:tc>
+        <w:tc>
+          <w:tcPr>
+            <w:tcW w:type="dxa" w:w="3168"/>
+            <w:vAlign w:val="center"/>
+            <w:tcBorders>
+              <w:top w:val="single" w:sz="4" w:color="D9D9D9"/>
+              <w:left w:val="single" w:sz="4" w:color="D9D9D9"/>
+              <w:bottom w:val="single" w:sz="4" w:color="D9D9D9"/>
+              <w:right w:val="single" w:sz="4" w:color="D9D9D9"/>
+            </w:tcBorders>
+            <w:tcMar>
+              <w:top w:w="75" w:type="dxa"/>
+              <w:bottom w:w="75" w:type="dxa"/>
+              <w:left w:w="100" w:type="dxa"/>
+              <w:right w:w="100" w:type="dxa"/>
+            </w:tcMar>
+          </w:tcPr>
+          <w:p>
+            <w:pPr>
+              <w:keepNext w:val="0"/>
+              <w:spacing w:line="252" w:lineRule="auto" w:after="0"/>
+              <w:jc w:val="center"/>
+            </w:pPr>
+            <w:r>
+              <w:rPr>
+                <w:rFonts w:ascii="Times New Roman" w:hAnsi="Times New Roman" w:eastAsia="Times New Roman" w:cs="Times New Roman"/>
+                <w:b w:val="0"/>
+                <w:color w:val="000000"/>
+                <w:sz w:val="24"/>
+              </w:rPr>
+              <w:t>24 mmol/L</w:t>
+            </w:r>
+          </w:p>
+        </w:tc>
+        <w:tc>
+          <w:tcPr>
+            <w:tcW w:type="dxa" w:w="3168"/>
+            <w:vAlign w:val="center"/>
+            <w:tcBorders>
+              <w:top w:val="single" w:sz="4" w:color="D9D9D9"/>
+              <w:left w:val="single" w:sz="4" w:color="D9D9D9"/>
+              <w:bottom w:val="single" w:sz="4" w:color="D9D9D9"/>
+              <w:right w:val="single" w:sz="4" w:color="D9D9D9"/>
+            </w:tcBorders>
+            <w:tcMar>
+              <w:top w:w="75" w:type="dxa"/>
+              <w:bottom w:w="75" w:type="dxa"/>
+              <w:left w:w="100" w:type="dxa"/>
+              <w:right w:w="100" w:type="dxa"/>
+            </w:tcMar>
+          </w:tcPr>
+          <w:p>
+            <w:pPr>
+              <w:keepNext w:val="0"/>
+              <w:spacing w:line="252" w:lineRule="auto" w:after="0"/>
+              <w:jc w:val="center"/>
+            </w:pPr>
+            <w:r>
+              <w:rPr>
+                <w:rFonts w:ascii="Times New Roman" w:hAnsi="Times New Roman" w:eastAsia="Times New Roman" w:cs="Times New Roman"/>
+                <w:b w:val="0"/>
+                <w:color w:val="000000"/>
+                <w:sz w:val="24"/>
+              </w:rPr>
+              <w:t>27 mmol/L</w:t>
+            </w:r>
+          </w:p>
+        </w:tc>
+      </w:tr>
+    </w:tbl>
+    <w:p>
+      <w:pPr>
+        <w:spacing w:after="0" w:line="72" w:lineRule="auto"/>
+      </w:pPr>
+      <w:r>
+        <w:rPr>
+          <w:rFonts w:ascii="Times New Roman" w:hAnsi="Times New Roman" w:eastAsia="Times New Roman" w:cs="Times New Roman"/>
+          <w:color w:val="000000"/>
+          <w:sz w:val="4"/>
+        </w:rPr>
       </w:r>
     </w:p>
     <w:p>
@@ -2726,69 +2874,7 @@
           <w:color w:val="000000"/>
           <w:sz w:val="24"/>
         </w:rPr>
-        <w:t>El secuestro y reflujo de líquido rico en HCl favorecen alcalosis metabólica hipoclorémica, frecuentemente acompañada de hipopotasemia. Si el vólvulo compromete la perfusión, puede añadirse acidosis asociada a hipoperfusión y alterar el patrón esperado. Braun y colaboradores analizaron 1982 vacas lecheras y documentaron la complejidad de estos cambios. Aunque el artículo se publicó en 2022, los registros procedían de 1988–2016. (12)</w:t>
-      </w:r>
-    </w:p>
-    <w:p>
-      <w:pPr>
-        <w:keepNext/>
-        <w:jc w:val="center"/>
-      </w:pPr>
-      <w:r>
-        <w:drawing>
-          <wp:inline xmlns:a="http://schemas.openxmlformats.org/drawingml/2006/main" xmlns:pic="http://schemas.openxmlformats.org/drawingml/2006/picture">
-            <wp:extent cx="5806440" cy="2125486"/>
-            <wp:docPr id="2" name="Picture 2" descr="Figura 2. Comparación de mecanismos digestivos bovinos que orientan hacia trastornos diferentes. La combinación depende de la enfermedad y su evolución. Esquema propio basado en (10,11,12)."/>
-            <wp:cNvGraphicFramePr>
-              <a:graphicFrameLocks noChangeAspect="1"/>
-            </wp:cNvGraphicFramePr>
-            <a:graphic>
-              <a:graphicData uri="http://schemas.openxmlformats.org/drawingml/2006/picture">
-                <pic:pic>
-                  <pic:nvPicPr>
-                    <pic:cNvPr id="0" name="bovine.png"/>
-                    <pic:cNvPicPr/>
-                  </pic:nvPicPr>
-                  <pic:blipFill>
-                    <a:blip r:embed="rId14"/>
-                    <a:stretch>
-                      <a:fillRect/>
-                    </a:stretch>
-                  </pic:blipFill>
-                  <pic:spPr>
-                    <a:xfrm>
-                      <a:off x="0" y="0"/>
-                      <a:ext cx="5806440" cy="2125486"/>
-                    </a:xfrm>
-                    <a:prstGeom prst="rect"/>
-                  </pic:spPr>
-                </pic:pic>
-              </a:graphicData>
-            </a:graphic>
-          </wp:inline>
-        </w:drawing>
-      </w:r>
-    </w:p>
-    <w:p>
-      <w:pPr>
-        <w:spacing w:before="100" w:after="180"/>
-        <w:jc w:val="left"/>
-      </w:pPr>
-      <w:r>
-        <w:rPr>
-          <w:rFonts w:ascii="Times New Roman" w:hAnsi="Times New Roman" w:eastAsia="Times New Roman" w:cs="Times New Roman"/>
-          <w:color w:val="000000"/>
-          <w:sz w:val="20"/>
-        </w:rPr>
-        <w:t>Figura 2. Comparación de mecanismos digestivos bovinos que orientan hacia trastornos diferentes. La combinación depende de la enfermedad y su evolución. Esquema propio basado en (10,11,12).</w:t>
-      </w:r>
-    </w:p>
-    <w:p>
-      <w:pPr>
-        <w:pStyle w:val="Heading1"/>
-      </w:pPr>
-      <w:r>
-        <w:t>9 Discusión y principios de manejo</w:t>
+        <w:t>El primer hallazgo es la dirección acidificante: el pH desciende de 7,40 a 7,28. El aumento de PCO₂ de 40 a 60 mmHg, junto con la hipoventilación conocida, apoya retención de CO₂ y acidosis respiratoria reciente. La secuencia temporal da información que una cifra aislada no ofrece. (1,4)</w:t>
       </w:r>
     </w:p>
     <w:p>
@@ -2798,7 +2884,7 @@
           <w:color w:val="000000"/>
           <w:sz w:val="24"/>
         </w:rPr>
-        <w:t>Los ejemplos muestran que un mismo sistema orgánico puede originar alteraciones opuestas. La localización de la pérdida digestiva, la perfusión y la capacidad renal explican mejor el resultado que el nombre general de la enfermedad. También muestran que la compensación debe evaluarse como respuesta secundaria y que un valor aparentemente normal puede ocultar procesos simultáneos.</w:t>
+        <w:t>La ecuación proporciona 6,1 + log₁₀[27/(0,03 × 60)] = 7,276091, coherente con el pH mostrado. El punto previo 24/40 da 7,401030. El pequeño incremento de bicarbonato puede ser compatible con la amortiguación inicial de un cambio respiratorio; no demuestra compensación renal crónica completa. Veinte minutos y estos valores no permiten atribuir una adaptación renal persistente. (2,3)</w:t>
       </w:r>
     </w:p>
     <w:p>
@@ -2808,7 +2894,7 @@
           <w:color w:val="000000"/>
           <w:sz w:val="24"/>
         </w:rPr>
-        <w:t>El manejo debe resolver la enfermedad causal y recuperar perfusión, oxigenación o ventilación según el mecanismo. La selección de líquidos depende del estado circulatorio, electrolitos y capacidad de excreción. En pequeños animales, el bicarbonato no es una respuesta automática a la acidosis asociada a hipoperfusión: primero se corrige el problema causal y se reevalúa. Su uso requiere selección clínica y vigilancia por riesgo de hipernatremia, hipopotasemia, descenso del calcio ionizado y generación de CO₂. (13)</w:t>
+        <w:t>Una alcalosis metabólica primaria no explica adecuadamente el descenso de pH en esta secuencia. El análisis se fundamenta en la disminución de ventilación y la retención de CO₂, no solo en que HCO₃⁻ aumentó. La existencia de más bicarbonato que en el panel anterior no elimina el proceso acidificante. (3,4)</w:t>
       </w:r>
     </w:p>
     <w:p>
@@ -2818,7 +2904,17 @@
           <w:color w:val="000000"/>
           <w:sz w:val="24"/>
         </w:rPr>
-        <w:t>La necesidad de alcalinización puede ser distinta en un ternero con acidosis metabólica grave. Las diferencias de especie y mecanismo impiden aplicar una única pauta terapéutica a todos los pacientes. El seguimiento seriado permite valorar la respuesta y detectar cambios producidos por el tratamiento. (11,13)</w:t>
+        <w:t>Los datos no identifican la causa concreta de la hipoventilación. Tampoco cuantifican la oxigenación porque no se proporciona PaO₂. La gasometría y el contexto deben revisarse junto con el funcionamiento respiratorio y las condiciones de obtención de la muestra. El escenario permite explicar el mecanismo; no contiene información suficiente para decidir una intervención clínica. (9)</w:t>
+      </w:r>
+    </w:p>
+    <w:p>
+      <w:r>
+        <w:rPr>
+          <w:rFonts w:ascii="Times New Roman" w:hAnsi="Times New Roman" w:eastAsia="Times New Roman" w:cs="Times New Roman"/>
+          <w:color w:val="000000"/>
+          <w:sz w:val="24"/>
+        </w:rPr>
+        <w:t>La diferencia respecto del ternero ilustra el valor de identificar qué variable cambia de manera primaria. En el bovino predomina el componente metabólico sustentado por bicarbonato bajo y contexto digestivo. En el perro existe una secuencia documentada de retención de CO₂. Ambos requieren examinar el tiempo y evitar trasladar una misma regla de compensación de una especie a otra. (3)</w:t>
       </w:r>
     </w:p>
     <w:p>
@@ -2826,59 +2922,163 @@
         <w:pStyle w:val="Heading1"/>
       </w:pPr>
       <w:r>
-        <w:t>10 Conclusiones</w:t>
+        <w:t>9 Discusión</w:t>
       </w:r>
     </w:p>
     <w:p>
-      <w:pPr>
-        <w:ind w:left="259" w:hanging="259"/>
-      </w:pPr>
       <w:r>
         <w:rPr>
           <w:rFonts w:ascii="Times New Roman" w:hAnsi="Times New Roman" w:eastAsia="Times New Roman" w:cs="Times New Roman"/>
           <w:color w:val="000000"/>
           <w:sz w:val="24"/>
         </w:rPr>
-        <w:t>1. La amortiguación química, la ventilación alveolar y la excreción renal de ácido actúan coordinadamente para mantener el equilibrio ácido base.</w:t>
+        <w:t>La interpretación ácido base integra variables relacionadas, pero no equivalentes. El pH informa del resultado conjunto; HCO₃⁻ y PCO₂ ayudan a explicar sus componentes en el enfoque tradicional. Ninguna de estas cifras permite, por sí sola, identificar la enfermedad causal. Cuando dos procesos o respuestas modifican numerador y denominador de forma concordante, el pH puede acercarse al valor de comparación aunque persista una alteración fisiopatológica. (1–3)</w:t>
       </w:r>
     </w:p>
     <w:p>
-      <w:pPr>
-        <w:ind w:left="259" w:hanging="259"/>
-      </w:pPr>
       <w:r>
         <w:rPr>
           <w:rFonts w:ascii="Times New Roman" w:hAnsi="Times New Roman" w:eastAsia="Times New Roman" w:cs="Times New Roman"/>
           <w:color w:val="000000"/>
           <w:sz w:val="24"/>
         </w:rPr>
-        <w:t>2. Acidosis y alcalosis describen procesos; acidemia y alcalemia describen el pH resultante. Los trastornos combinados pueden conservar un pH aparentemente normal.</w:t>
+        <w:t>Los modelos hacen explícitas relaciones útiles y, al mismo tiempo, delimitan lo que puede concluirse. Henderson–Hasselbalch representa el equilibrio bicarbonato–CO₂ bajo constantes elegidas. La relación ventilatoria compara estados estacionarios con producción de CO₂ constante. Cambiar una entrada en una gráfica no reproduce la evolución de un animal: el tiempo, la perfusión, los amortiguadores no bicarbonato y la adaptación renal no están representados como procesos dinámicos independientes. Por eso, una curva matemática no debe interpretarse como trayectoria clínica de compensación. (2,3,5)</w:t>
       </w:r>
     </w:p>
     <w:p>
-      <w:pPr>
-        <w:ind w:left="259" w:hanging="259"/>
-      </w:pPr>
       <w:r>
         <w:rPr>
           <w:rFonts w:ascii="Times New Roman" w:hAnsi="Times New Roman" w:eastAsia="Times New Roman" w:cs="Times New Roman"/>
           <w:color w:val="000000"/>
           <w:sz w:val="24"/>
         </w:rPr>
-        <w:t>3. La gasometría debe interpretarse junto con compensación, electrolitos y brecha aniónica, utilizando criterios correspondientes a la especie y al laboratorio.</w:t>
+        <w:t>La diarrea del ternero exige evitar una explicación única basada en el nombre del síntoma. Pueden coexistir pérdidas de base, alteración de perfusión y productos de fermentación. El estudio de Jung et al. sobre terneros Hanwoo y la revisión de Burgos et al. ayudan a contextualizar lactato y D-lactato, pero no convierten una brecha aniónica calculada en una medición específica. La asociación observada en una población o un mecanismo descrito en una revisión no prueba la causa del trastorno en un individuo sin datos adicionales. (10–12)</w:t>
       </w:r>
     </w:p>
     <w:p>
-      <w:pPr>
-        <w:ind w:left="259" w:hanging="259"/>
-      </w:pPr>
       <w:r>
         <w:rPr>
           <w:rFonts w:ascii="Times New Roman" w:hAnsi="Times New Roman" w:eastAsia="Times New Roman" w:cs="Times New Roman"/>
           <w:color w:val="000000"/>
           <w:sz w:val="24"/>
         </w:rPr>
-        <w:t>4. La diarrea neonatal y las alteraciones abomasales ilustran mecanismos distintos. Su manejo exige corregir la causa y reevaluar la respuesta clínica.</w:t>
+        <w:t>La enfermedad abomasal ofrece el problema complementario: la pérdida o el secuestro de contenido rico en HCl puede favorecer alcalosis metabólica, mientras la alteración de perfusión añade un componente acidificante. En consecuencia, ni vómito ni diarrea ni una enfermedad respiratoria determinan siempre un patrón único. Los datos de contexto son necesarios para interpretar el mecanismo y para valorar si un resultado aparente oculta procesos simultáneos. (4,7,8)</w:t>
+      </w:r>
+    </w:p>
+    <w:p>
+      <w:r>
+        <w:rPr>
+          <w:rFonts w:ascii="Times New Roman" w:hAnsi="Times New Roman" w:eastAsia="Times New Roman" w:cs="Times New Roman"/>
+          <w:color w:val="000000"/>
+          <w:sz w:val="24"/>
+        </w:rPr>
+        <w:t>La distinción entre conservación y reposición renal de base evita otra confusión frecuente. Recuperar bicarbonato filtrado no añade necesariamente una cantidad neta nueva al organismo. La excreción neta de ácido participa en esa reposición; la función renal y la duración del trastorno condicionan su expresión. Esta secuencia conceptual impide atribuir automáticamente a adaptación renal cualquier aumento temprano de bicarbonato durante hipoventilación. (3,6)</w:t>
+      </w:r>
+    </w:p>
+    <w:p>
+      <w:r>
+        <w:rPr>
+          <w:rFonts w:ascii="Times New Roman" w:hAnsi="Times New Roman" w:eastAsia="Times New Roman" w:cs="Times New Roman"/>
+          <w:color w:val="000000"/>
+          <w:sz w:val="24"/>
+        </w:rPr>
+        <w:t>La utilidad clínica del razonamiento depende finalmente de la calidad de la muestra y de referencias apropiadas. Deben reconocerse las diferencias entre sangre arterial y venosa, entre variables medidas y calculadas, y entre límites de exploración matemática e intervalos de referencia. La conclusión sólida es la que identifica el proceso respaldado y mantiene abiertas las causas o respuestas que los datos no permiten resolver. (9,10)</w:t>
+      </w:r>
+    </w:p>
+    <w:p>
+      <w:pPr>
+        <w:pStyle w:val="Heading1"/>
+      </w:pPr>
+      <w:r>
+        <w:t>10 Autoevaluación del razonamiento</w:t>
+      </w:r>
+    </w:p>
+    <w:p>
+      <w:r>
+        <w:rPr>
+          <w:rFonts w:ascii="Times New Roman" w:hAnsi="Times New Roman" w:eastAsia="Times New Roman" w:cs="Times New Roman"/>
+          <w:color w:val="000000"/>
+          <w:sz w:val="24"/>
+        </w:rPr>
+        <w:t>1. ¿Un pH dentro del intervalo excluye un trastorno? No. Pueden coexistir procesos opuestos; deben revisarse PCO₂, HCO₃⁻ y contexto. Un resultado próximo al basal no demuestra recuperación. (1,3)</w:t>
+      </w:r>
+    </w:p>
+    <w:p>
+      <w:r>
+        <w:rPr>
+          <w:rFonts w:ascii="Times New Roman" w:hAnsi="Times New Roman" w:eastAsia="Times New Roman" w:cs="Times New Roman"/>
+          <w:color w:val="000000"/>
+          <w:sz w:val="24"/>
+        </w:rPr>
+        <w:t>2. ¿Qué ocurre al aumentar PCO₂ con HCO₃⁻ fijo? Disminuye el pH del modelo porque aumenta el denominador y se reduce la relación bicarbonato/CO₂ disuelto. Para mantener el pH calculado debe conservarse esa proporción. (2)</w:t>
+      </w:r>
+    </w:p>
+    <w:p>
+      <w:r>
+        <w:rPr>
+          <w:rFonts w:ascii="Times New Roman" w:hAnsi="Times New Roman" w:eastAsia="Times New Roman" w:cs="Times New Roman"/>
+          <w:color w:val="000000"/>
+          <w:sz w:val="24"/>
+        </w:rPr>
+        <w:t>3. ¿Qué diferencia existe entre recuperar y generar bicarbonato? Recuperar lo filtrado evita perder base existente. La excreción neta de ácido permite reponer bicarbonato. La ventilación regula CO₂, pero no sustituye esa función renal. (6)</w:t>
+      </w:r>
+    </w:p>
+    <w:p>
+      <w:r>
+        <w:rPr>
+          <w:rFonts w:ascii="Times New Roman" w:hAnsi="Times New Roman" w:eastAsia="Times New Roman" w:cs="Times New Roman"/>
+          <w:color w:val="000000"/>
+          <w:sz w:val="24"/>
+        </w:rPr>
+        <w:t>4. ¿Una brecha aniónica elevada identifica lactato? No. Orienta hacia un cambio relativo de aniones no medidos respecto de cationes no medidos. Se conserva la electroneutralidad; identificar un anión exige datos específicos, contexto proteico y método de laboratorio. (10)</w:t>
+      </w:r>
+    </w:p>
+    <w:p>
+      <w:r>
+        <w:rPr>
+          <w:rFonts w:ascii="Times New Roman" w:hAnsi="Times New Roman" w:eastAsia="Times New Roman" w:cs="Times New Roman"/>
+          <w:color w:val="000000"/>
+          <w:sz w:val="24"/>
+        </w:rPr>
+        <w:t>5. ¿Puede aplicarse directamente una regla canina de compensación a un ternero? No se asume su validez. Se reconoce la limitación y se buscan criterios bovinos y datos del caso. La dirección de la respuesta orienta, pero no acredita su adecuación cuantitativa. (3)</w:t>
+      </w:r>
+    </w:p>
+    <w:p>
+      <w:pPr>
+        <w:pStyle w:val="Heading1"/>
+      </w:pPr>
+      <w:r>
+        <w:t>11 Conclusiones</w:t>
+      </w:r>
+    </w:p>
+    <w:p>
+      <w:r>
+        <w:rPr>
+          <w:rFonts w:ascii="Times New Roman" w:hAnsi="Times New Roman" w:eastAsia="Times New Roman" w:cs="Times New Roman"/>
+          <w:color w:val="000000"/>
+          <w:sz w:val="24"/>
+        </w:rPr>
+        <w:t>El equilibrio ácido base depende de la interacción entre amortiguadores, ventilación y función renal. El pH es el resultado de esa interacción; los términos acidosis y alcalosis describen procesos que pueden coexistir aun cuando el pH se encuentre dentro del intervalo aplicable.</w:t>
+      </w:r>
+    </w:p>
+    <w:p>
+      <w:r>
+        <w:rPr>
+          <w:rFonts w:ascii="Times New Roman" w:hAnsi="Times New Roman" w:eastAsia="Times New Roman" w:cs="Times New Roman"/>
+          <w:color w:val="000000"/>
+          <w:sz w:val="24"/>
+        </w:rPr>
+        <w:t>La interpretación exige identificar especie y muestra, relacionar pH con PCO₂ y HCO₃⁻ e integrar electrolitos, tiempo e historia. La compensación atenúa una alteración, pero no equivale a curación. Su valoración cuantitativa debe utilizar criterios pertinentes para la especie y la duración del proceso.</w:t>
+      </w:r>
+    </w:p>
+    <w:p>
+      <w:r>
+        <w:rPr>
+          <w:rFonts w:ascii="Times New Roman" w:hAnsi="Times New Roman" w:eastAsia="Times New Roman" w:cs="Times New Roman"/>
+          <w:color w:val="000000"/>
+          <w:sz w:val="24"/>
+        </w:rPr>
+        <w:t>Los dos escenarios muestran alcances diferentes: en el ternero, acidosis metabólica con causa por caracterizar; en el perro, una secuencia compatible con acidosis respiratoria reciente por retención de CO₂. Los modelos ayudan a explicar esas relaciones siempre que sus supuestos y omisiones se mantengan explícitos. Ninguno reemplaza la evaluación clínica ni transforma un cálculo en una determinación causal.</w:t>
       </w:r>
     </w:p>
     <w:p>
@@ -2887,13 +3087,13 @@
         <w:pageBreakBefore/>
       </w:pPr>
       <w:r>
-        <w:t>11 Referencias bibliográficas</w:t>
+        <w:t>12 Referencias bibliográficas</w:t>
       </w:r>
     </w:p>
     <w:p>
       <w:pPr>
         <w:keepLines/>
-        <w:spacing w:line="240" w:lineRule="auto" w:after="100"/>
+        <w:spacing w:line="264" w:lineRule="auto" w:after="160"/>
         <w:ind w:left="360" w:hanging="360"/>
         <w:jc w:val="left"/>
       </w:pPr>
@@ -2909,7 +3109,7 @@
     <w:p>
       <w:pPr>
         <w:keepLines/>
-        <w:spacing w:line="240" w:lineRule="auto" w:after="100"/>
+        <w:spacing w:line="264" w:lineRule="auto" w:after="160"/>
         <w:ind w:left="360" w:hanging="360"/>
         <w:jc w:val="left"/>
       </w:pPr>
@@ -2919,13 +3119,13 @@
           <w:color w:val="000000"/>
           <w:sz w:val="24"/>
         </w:rPr>
-        <w:t>2. Cornell University. Laboratory detection [Internet]. eClinPath; [citado 17 oct 2026]. https://eclinpath.com/chemistry/acid-base/laboratory-detection/</w:t>
+        <w:t>2. Baquero-Parrado JR. Consideraciones clínicas y regulación del equilibrio ácido-base en ganado bovino. Rev UDCA Actual Divulg Cient. 2008;11(2):85-100. https://doi.org/10.31910/rudca.v11.n2.2008.626</w:t>
       </w:r>
     </w:p>
     <w:p>
       <w:pPr>
         <w:keepLines/>
-        <w:spacing w:line="240" w:lineRule="auto" w:after="100"/>
+        <w:spacing w:line="264" w:lineRule="auto" w:after="160"/>
         <w:ind w:left="360" w:hanging="360"/>
         <w:jc w:val="left"/>
       </w:pPr>
@@ -2935,13 +3135,13 @@
           <w:color w:val="000000"/>
           <w:sz w:val="24"/>
         </w:rPr>
-        <w:t>3. Baquero-Parrado JR. Consideraciones clínicas y regulación del equilibrio ácido-base en ganado bovino. Rev UDCA Actual Divulg Cient. 2008;11(2):85-100. https://doi.org/10.31910/rudca.v11.n2.2008.626</w:t>
+        <w:t>3. Cornell University. Response to disturbances [Internet]. eClinPath; [citado 17 oct 2026]. https://eclinpath.com/chemistry/acid-base/compensation/</w:t>
       </w:r>
     </w:p>
     <w:p>
       <w:pPr>
         <w:keepLines/>
-        <w:spacing w:line="240" w:lineRule="auto" w:after="100"/>
+        <w:spacing w:line="264" w:lineRule="auto" w:after="160"/>
         <w:ind w:left="360" w:hanging="360"/>
         <w:jc w:val="left"/>
       </w:pPr>
@@ -2951,13 +3151,13 @@
           <w:color w:val="000000"/>
           <w:sz w:val="24"/>
         </w:rPr>
-        <w:t>4. Cornell University. Physiology [Internet]. eClinPath; [citado 17 oct 2026]. https://eclinpath.com/chemistry/kidney/physiology/</w:t>
+        <w:t>4. Cornell University. Types of disturbances [Internet]. eClinPath; [citado 17 oct 2026]. https://eclinpath.com/chemistry/acid-base/types-of-disturbances/</w:t>
       </w:r>
     </w:p>
     <w:p>
       <w:pPr>
         <w:keepLines/>
-        <w:spacing w:line="240" w:lineRule="auto" w:after="100"/>
+        <w:spacing w:line="264" w:lineRule="auto" w:after="160"/>
         <w:ind w:left="360" w:hanging="360"/>
         <w:jc w:val="left"/>
       </w:pPr>
@@ -2967,13 +3167,13 @@
           <w:color w:val="000000"/>
           <w:sz w:val="24"/>
         </w:rPr>
-        <w:t>5. Cornell University. Response to disturbances [Internet]. eClinPath; [citado 17 oct 2026]. https://eclinpath.com/chemistry/acid-base/compensation/</w:t>
+        <w:t>5. Abnormal ventilation, abnormal gas exchange [material docente en Internet]. Columbia University; [sin fecha] [citado 18 oct 2026]. p. 6. https://www.columbia.edu/itc/hs/medical/pathophys/pulmonary/2008/abnormalColor.pdf</w:t>
       </w:r>
     </w:p>
     <w:p>
       <w:pPr>
         <w:keepLines/>
-        <w:spacing w:line="240" w:lineRule="auto" w:after="100"/>
+        <w:spacing w:line="264" w:lineRule="auto" w:after="160"/>
         <w:ind w:left="360" w:hanging="360"/>
         <w:jc w:val="left"/>
       </w:pPr>
@@ -2983,13 +3183,13 @@
           <w:color w:val="000000"/>
           <w:sz w:val="24"/>
         </w:rPr>
-        <w:t>6. Cornell University. Types of disturbances [Internet]. eClinPath; [citado 17 oct 2026]. https://eclinpath.com/chemistry/acid-base/types-of-disturbances/</w:t>
+        <w:t>6. Cornell University. Physiology [Internet]. eClinPath; [citado 17 oct 2026]. https://eclinpath.com/chemistry/kidney/physiology/</w:t>
       </w:r>
     </w:p>
     <w:p>
       <w:pPr>
         <w:keepLines/>
-        <w:spacing w:line="240" w:lineRule="auto" w:after="100"/>
+        <w:spacing w:line="264" w:lineRule="auto" w:after="160"/>
         <w:ind w:left="360" w:hanging="360"/>
         <w:jc w:val="left"/>
       </w:pPr>
@@ -3005,7 +3205,7 @@
     <w:p>
       <w:pPr>
         <w:keepLines/>
-        <w:spacing w:line="240" w:lineRule="auto" w:after="100"/>
+        <w:spacing w:line="264" w:lineRule="auto" w:after="160"/>
         <w:ind w:left="360" w:hanging="360"/>
         <w:jc w:val="left"/>
       </w:pPr>
@@ -3015,13 +3215,13 @@
           <w:color w:val="000000"/>
           <w:sz w:val="24"/>
         </w:rPr>
-        <w:t>8. Cornell University. Potassium [Internet]. eClinPath; [citado 17 oct 2026]. https://eclinpath.com/chemistry/electrolytes/potassium/</w:t>
+        <w:t>8. Braun U, Nuss K, Reif S, Hilbe M, Gerspach C. Left and right displaced abomasum and abomasal volvulus: comparison of clinical, laboratory and ultrasonographic findings in 1982 dairy cows. Acta Vet Scand. 2022;64:40. https://doi.org/10.1186/s13028-022-00656-9</w:t>
       </w:r>
     </w:p>
     <w:p>
       <w:pPr>
         <w:keepLines/>
-        <w:spacing w:line="240" w:lineRule="auto" w:after="100"/>
+        <w:spacing w:line="264" w:lineRule="auto" w:after="160"/>
         <w:ind w:left="360" w:hanging="360"/>
         <w:jc w:val="left"/>
       </w:pPr>
@@ -3031,13 +3231,13 @@
           <w:color w:val="000000"/>
           <w:sz w:val="24"/>
         </w:rPr>
-        <w:t>9. Cornell University. Anion gap [Internet]. eClinPath; [citado 17 oct 2026]. https://eclinpath.com/chemistry/acid-base/chemistry-tests/anion-gap/</w:t>
+        <w:t>9. Cornell University. Laboratory detection [Internet]. eClinPath; [citado 17 oct 2026]. https://eclinpath.com/chemistry/acid-base/laboratory-detection/</w:t>
       </w:r>
     </w:p>
     <w:p>
       <w:pPr>
         <w:keepLines/>
-        <w:spacing w:line="240" w:lineRule="auto" w:after="100"/>
+        <w:spacing w:line="264" w:lineRule="auto" w:after="160"/>
         <w:ind w:left="360" w:hanging="360"/>
         <w:jc w:val="left"/>
       </w:pPr>
@@ -3047,13 +3247,13 @@
           <w:color w:val="000000"/>
           <w:sz w:val="24"/>
         </w:rPr>
-        <w:t>10. Burgos RA, Manosalva C, Alarcón P, Navarro M, Quiroga J, Morán G, et al. The D-lactate enigma: exploring the inflammatory influence of D-lactate in cattle. Front Vet Sci. 2024;11:1509399. https://doi.org/10.3389/fvets.2024.1509399</w:t>
+        <w:t>10. Cornell University. Anion gap [Internet]. eClinPath; [citado 17 oct 2026]. https://eclinpath.com/chemistry/acid-base/chemistry-tests/anion-gap/</w:t>
       </w:r>
     </w:p>
     <w:p>
       <w:pPr>
         <w:keepLines/>
-        <w:spacing w:line="240" w:lineRule="auto" w:after="100"/>
+        <w:spacing w:line="264" w:lineRule="auto" w:after="160"/>
         <w:ind w:left="360" w:hanging="360"/>
         <w:jc w:val="left"/>
       </w:pPr>
@@ -3069,7 +3269,7 @@
     <w:p>
       <w:pPr>
         <w:keepLines/>
-        <w:spacing w:line="240" w:lineRule="auto" w:after="100"/>
+        <w:spacing w:line="264" w:lineRule="auto" w:after="160"/>
         <w:ind w:left="360" w:hanging="360"/>
         <w:jc w:val="left"/>
       </w:pPr>
@@ -3079,30 +3279,12 @@
           <w:color w:val="000000"/>
           <w:sz w:val="24"/>
         </w:rPr>
-        <w:t>12. Braun U, Nuss K, Reif S, Hilbe M, Gerspach C. Left and right displaced abomasum and abomasal volvulus: comparison of clinical, laboratory and ultrasonographic findings in 1982 dairy cows. Acta Vet Scand. 2022;64:40. https://doi.org/10.1186/s13028-022-00656-9</w:t>
-      </w:r>
-    </w:p>
-    <w:p>
-      <w:pPr>
-        <w:keepLines/>
-        <w:spacing w:line="240" w:lineRule="auto" w:after="100"/>
-        <w:ind w:left="360" w:hanging="360"/>
-        <w:jc w:val="left"/>
-      </w:pPr>
-      <w:r>
-        <w:rPr>
-          <w:rFonts w:ascii="Times New Roman" w:hAnsi="Times New Roman" w:eastAsia="Times New Roman" w:cs="Times New Roman"/>
-          <w:color w:val="000000"/>
-          <w:sz w:val="24"/>
-        </w:rPr>
-        <w:t>13. Linklater A. Monitorización de pequeños animales críticamente enfermos usando la regla de los 20 [Internet]. Manual de veterinaria de MSD; 2026 [actualizado feb 2026; citado 17 oct 2026]. https://www.msdvetmanual.com/es/medicina-de-urgencia-y-cuidados-intensivos/monitorización-de-pequeños-animales-críticamente-enfermos/monitorización-de-pequeños-animales-críticamente-enfermos-usando-la-regla-de-los-20</w:t>
+        <w:t>12. Burgos RA, Manosalva C, Alarcón P, Navarro M, Quiroga J, Morán G, et al. The D-lactate enigma: exploring the inflammatory influence of D-lactate in cattle. Front Vet Sci. 2024;11:1509399. https://doi.org/10.3389/fvets.2024.1509399</w:t>
       </w:r>
     </w:p>
     <w:sectPr>
-      <w:footerReference w:type="first" r:id="rId9"/>
-      <w:headerReference w:type="first" r:id="rId10"/>
-      <w:footerReference w:type="default" r:id="rId11"/>
-      <w:headerReference w:type="default" r:id="rId12"/>
+      <w:footerReference w:type="default" r:id="rId9"/>
+      <w:headerReference w:type="default" r:id="rId10"/>
       <w:pgSz w:w="12240" w:h="15840"/>
       <w:pgMar w:top="1224" w:right="1440" w:bottom="1224" w:left="1440" w:header="504" w:footer="576" w:gutter="0"/>
       <w:cols w:space="720"/>
@@ -3118,34 +3300,18 @@
   <w:p>
     <w:pPr>
       <w:pStyle w:val="Footer"/>
-    </w:pPr>
-  </w:p>
-</w:ftr>
-</file>
-
-<file path=word/footer2.xml><?xml version="1.0" encoding="utf-8"?>
-<w:ftr xmlns:m="http://schemas.openxmlformats.org/officeDocument/2006/math" xmlns:mc="http://schemas.openxmlformats.org/markup-compatibility/2006" xmlns:mo="http://schemas.microsoft.com/office/mac/office/2008/main" xmlns:mv="urn:schemas-microsoft-com:mac:vml" xmlns:o="urn:schemas-microsoft-com:office:office" xmlns:r="http://schemas.openxmlformats.org/officeDocument/2006/relationships" xmlns:v="urn:schemas-microsoft-com:vml" xmlns:w10="urn:schemas-microsoft-com:office:word" xmlns:w14="http://schemas.microsoft.com/office/word/2010/wordml" xmlns:w="http://schemas.openxmlformats.org/wordprocessingml/2006/main" xmlns:wne="http://schemas.microsoft.com/office/word/2006/wordml" xmlns:wp14="http://schemas.microsoft.com/office/word/2010/wordprocessingDrawing" xmlns:wp="http://schemas.openxmlformats.org/drawingml/2006/wordprocessingDrawing" xmlns:wpc="http://schemas.microsoft.com/office/word/2010/wordprocessingCanvas" xmlns:wpg="http://schemas.microsoft.com/office/word/2010/wordprocessingGroup" xmlns:wpi="http://schemas.microsoft.com/office/word/2010/wordprocessingInk" xmlns:wps="http://schemas.microsoft.com/office/word/2010/wordprocessingShape" mc:Ignorable="w14 wp14">
-  <w:p>
-    <w:pPr>
-      <w:pStyle w:val="Footer"/>
       <w:jc w:val="center"/>
     </w:pPr>
-    <w:fldSimple w:instr="PAGE"/>
+    <w:fldSimple w:instr="PAGE">
+      <w:r>
+        <w:t>1</w:t>
+      </w:r>
+    </w:fldSimple>
   </w:p>
 </w:ftr>
 </file>
 
 <file path=word/header1.xml><?xml version="1.0" encoding="utf-8"?>
-<w:hdr xmlns:m="http://schemas.openxmlformats.org/officeDocument/2006/math" xmlns:mc="http://schemas.openxmlformats.org/markup-compatibility/2006" xmlns:mo="http://schemas.microsoft.com/office/mac/office/2008/main" xmlns:mv="urn:schemas-microsoft-com:mac:vml" xmlns:o="urn:schemas-microsoft-com:office:office" xmlns:r="http://schemas.openxmlformats.org/officeDocument/2006/relationships" xmlns:v="urn:schemas-microsoft-com:vml" xmlns:w10="urn:schemas-microsoft-com:office:word" xmlns:w14="http://schemas.microsoft.com/office/word/2010/wordml" xmlns:w="http://schemas.openxmlformats.org/wordprocessingml/2006/main" xmlns:wne="http://schemas.microsoft.com/office/word/2006/wordml" xmlns:wp14="http://schemas.microsoft.com/office/word/2010/wordprocessingDrawing" xmlns:wp="http://schemas.openxmlformats.org/drawingml/2006/wordprocessingDrawing" xmlns:wpc="http://schemas.microsoft.com/office/word/2010/wordprocessingCanvas" xmlns:wpg="http://schemas.microsoft.com/office/word/2010/wordprocessingGroup" xmlns:wpi="http://schemas.microsoft.com/office/word/2010/wordprocessingInk" xmlns:wps="http://schemas.microsoft.com/office/word/2010/wordprocessingShape" mc:Ignorable="w14 wp14">
-  <w:p>
-    <w:pPr>
-      <w:pStyle w:val="Header"/>
-    </w:pPr>
-  </w:p>
-</w:hdr>
-</file>
-
-<file path=word/header2.xml><?xml version="1.0" encoding="utf-8"?>
 <w:hdr xmlns:m="http://schemas.openxmlformats.org/officeDocument/2006/math" xmlns:mc="http://schemas.openxmlformats.org/markup-compatibility/2006" xmlns:mo="http://schemas.microsoft.com/office/mac/office/2008/main" xmlns:mv="urn:schemas-microsoft-com:mac:vml" xmlns:o="urn:schemas-microsoft-com:office:office" xmlns:r="http://schemas.openxmlformats.org/officeDocument/2006/relationships" xmlns:v="urn:schemas-microsoft-com:vml" xmlns:w10="urn:schemas-microsoft-com:office:word" xmlns:w14="http://schemas.microsoft.com/office/word/2010/wordml" xmlns:w="http://schemas.openxmlformats.org/wordprocessingml/2006/main" xmlns:wne="http://schemas.microsoft.com/office/word/2006/wordml" xmlns:wp14="http://schemas.microsoft.com/office/word/2010/wordprocessingDrawing" xmlns:wp="http://schemas.openxmlformats.org/drawingml/2006/wordprocessingDrawing" xmlns:wpc="http://schemas.microsoft.com/office/word/2010/wordprocessingCanvas" xmlns:wpg="http://schemas.microsoft.com/office/word/2010/wordprocessingGroup" xmlns:wpi="http://schemas.microsoft.com/office/word/2010/wordprocessingInk" xmlns:wps="http://schemas.microsoft.com/office/word/2010/wordprocessingShape" mc:Ignorable="w14 wp14">
   <w:p>
     <w:pPr>
@@ -3528,7 +3694,7 @@
     <w:qFormat/>
     <w:rsid w:val="00FC693F"/>
     <w:pPr>
-      <w:spacing w:line="276" w:lineRule="auto" w:after="100"/>
+      <w:spacing w:line="300" w:lineRule="auto" w:after="120"/>
       <w:jc w:val="both"/>
     </w:pPr>
     <w:rPr>
@@ -3592,7 +3758,7 @@
     <w:pPr>
       <w:keepNext/>
       <w:keepLines/>
-      <w:spacing w:before="200" w:after="80"/>
+      <w:spacing w:before="240" w:after="100"/>
       <w:jc w:val="left"/>
       <w:outlineLvl w:val="0"/>
     </w:pPr>
@@ -3617,7 +3783,7 @@
     <w:pPr>
       <w:keepNext/>
       <w:keepLines/>
-      <w:spacing w:before="200" w:after="80"/>
+      <w:spacing w:before="240" w:after="100"/>
       <w:jc w:val="left"/>
       <w:outlineLvl w:val="1"/>
     </w:pPr>

</xml_diff>